<commit_message>
Polish VKR package after teacher review
</commit_message>
<xml_diff>
--- a/Marianovskiy_VKR_ADAS_final.docx
+++ b/Marianovskiy_VKR_ADAS_final.docx
@@ -847,408 +847,1232 @@
     </w:p>
     <w:p>
       <w:pPr>
-        <w:spacing w:line="360" w:lineRule="auto" w:after="0"/>
-        <w:ind w:firstLine="0"/>
-      </w:pPr>
-      <w:r>
-        <w:rPr>
-          <w:rFonts w:ascii="Times New Roman" w:hAnsi="Times New Roman" w:eastAsia="Times New Roman"/>
-          <w:b w:val="0"/>
+        <w:tabs>
+          <w:tab w:pos="9638" w:val="right"/>
+        </w:tabs>
+        <w:spacing w:line="360" w:lineRule="auto" w:after="0"/>
+        <w:ind w:firstLine="0" w:left="0"/>
+      </w:pPr>
+      <w:r>
+        <w:rPr>
+          <w:rFonts w:ascii="Times New Roman" w:hAnsi="Times New Roman" w:eastAsia="Times New Roman"/>
           <w:sz w:val="24"/>
         </w:rPr>
         <w:t>ВВЕДЕНИЕ</w:t>
       </w:r>
-    </w:p>
-    <w:p>
-      <w:pPr>
-        <w:spacing w:line="360" w:lineRule="auto" w:after="0"/>
-        <w:ind w:firstLine="0"/>
-      </w:pPr>
-      <w:r>
-        <w:rPr>
-          <w:rFonts w:ascii="Times New Roman" w:hAnsi="Times New Roman" w:eastAsia="Times New Roman"/>
-          <w:b w:val="0"/>
+      <w:r>
+        <w:rPr>
+          <w:rFonts w:ascii="Times New Roman" w:hAnsi="Times New Roman" w:eastAsia="Times New Roman"/>
+          <w:sz w:val="24"/>
+        </w:rPr>
+        <w:tab/>
+      </w:r>
+      <w:r>
+        <w:rPr>
+          <w:rFonts w:ascii="Times New Roman" w:hAnsi="Times New Roman" w:eastAsia="Times New Roman"/>
+          <w:sz w:val="24"/>
+        </w:rPr>
+        <w:t>7</w:t>
+      </w:r>
+    </w:p>
+    <w:p>
+      <w:pPr>
+        <w:tabs>
+          <w:tab w:pos="9638" w:val="right"/>
+        </w:tabs>
+        <w:spacing w:line="360" w:lineRule="auto" w:after="0"/>
+        <w:ind w:firstLine="0" w:left="0"/>
+      </w:pPr>
+      <w:r>
+        <w:rPr>
+          <w:rFonts w:ascii="Times New Roman" w:hAnsi="Times New Roman" w:eastAsia="Times New Roman"/>
           <w:sz w:val="24"/>
         </w:rPr>
         <w:t>1 Анализ предметной области и существующих подходов</w:t>
       </w:r>
-    </w:p>
-    <w:p>
-      <w:pPr>
-        <w:spacing w:line="360" w:lineRule="auto" w:after="0"/>
-        <w:ind w:firstLine="0"/>
-      </w:pPr>
-      <w:r>
-        <w:rPr>
-          <w:rFonts w:ascii="Times New Roman" w:hAnsi="Times New Roman" w:eastAsia="Times New Roman"/>
-          <w:b w:val="0"/>
+      <w:r>
+        <w:rPr>
+          <w:rFonts w:ascii="Times New Roman" w:hAnsi="Times New Roman" w:eastAsia="Times New Roman"/>
+          <w:sz w:val="24"/>
+        </w:rPr>
+        <w:tab/>
+      </w:r>
+      <w:r>
+        <w:rPr>
+          <w:rFonts w:ascii="Times New Roman" w:hAnsi="Times New Roman" w:eastAsia="Times New Roman"/>
+          <w:sz w:val="24"/>
+        </w:rPr>
+        <w:t>9</w:t>
+      </w:r>
+    </w:p>
+    <w:p>
+      <w:pPr>
+        <w:tabs>
+          <w:tab w:pos="9638" w:val="right"/>
+        </w:tabs>
+        <w:spacing w:line="360" w:lineRule="auto" w:after="0"/>
+        <w:ind w:firstLine="0" w:left="397"/>
+      </w:pPr>
+      <w:r>
+        <w:rPr>
+          <w:rFonts w:ascii="Times New Roman" w:hAnsi="Times New Roman" w:eastAsia="Times New Roman"/>
           <w:sz w:val="24"/>
         </w:rPr>
         <w:t>1.1 ADAS и мультимодальное восприятие</w:t>
       </w:r>
-    </w:p>
-    <w:p>
-      <w:pPr>
-        <w:spacing w:line="360" w:lineRule="auto" w:after="0"/>
-        <w:ind w:firstLine="0"/>
-      </w:pPr>
-      <w:r>
-        <w:rPr>
-          <w:rFonts w:ascii="Times New Roman" w:hAnsi="Times New Roman" w:eastAsia="Times New Roman"/>
-          <w:b w:val="0"/>
+      <w:r>
+        <w:rPr>
+          <w:rFonts w:ascii="Times New Roman" w:hAnsi="Times New Roman" w:eastAsia="Times New Roman"/>
+          <w:sz w:val="24"/>
+        </w:rPr>
+        <w:tab/>
+      </w:r>
+      <w:r>
+        <w:rPr>
+          <w:rFonts w:ascii="Times New Roman" w:hAnsi="Times New Roman" w:eastAsia="Times New Roman"/>
+          <w:sz w:val="24"/>
+        </w:rPr>
+        <w:t>9</w:t>
+      </w:r>
+    </w:p>
+    <w:p>
+      <w:pPr>
+        <w:tabs>
+          <w:tab w:pos="9638" w:val="right"/>
+        </w:tabs>
+        <w:spacing w:line="360" w:lineRule="auto" w:after="0"/>
+        <w:ind w:firstLine="0" w:left="397"/>
+      </w:pPr>
+      <w:r>
+        <w:rPr>
+          <w:rFonts w:ascii="Times New Roman" w:hAnsi="Times New Roman" w:eastAsia="Times New Roman"/>
           <w:sz w:val="24"/>
         </w:rPr>
         <w:t>1.2 Редкие критические сценарии и corner cases</w:t>
       </w:r>
-    </w:p>
-    <w:p>
-      <w:pPr>
-        <w:spacing w:line="360" w:lineRule="auto" w:after="0"/>
-        <w:ind w:firstLine="0"/>
-      </w:pPr>
-      <w:r>
-        <w:rPr>
-          <w:rFonts w:ascii="Times New Roman" w:hAnsi="Times New Roman" w:eastAsia="Times New Roman"/>
-          <w:b w:val="0"/>
+      <w:r>
+        <w:rPr>
+          <w:rFonts w:ascii="Times New Roman" w:hAnsi="Times New Roman" w:eastAsia="Times New Roman"/>
+          <w:sz w:val="24"/>
+        </w:rPr>
+        <w:tab/>
+      </w:r>
+      <w:r>
+        <w:rPr>
+          <w:rFonts w:ascii="Times New Roman" w:hAnsi="Times New Roman" w:eastAsia="Times New Roman"/>
+          <w:sz w:val="24"/>
+        </w:rPr>
+        <w:t>10</w:t>
+      </w:r>
+    </w:p>
+    <w:p>
+      <w:pPr>
+        <w:tabs>
+          <w:tab w:pos="9638" w:val="right"/>
+        </w:tabs>
+        <w:spacing w:line="360" w:lineRule="auto" w:after="0"/>
+        <w:ind w:firstLine="0" w:left="397"/>
+      </w:pPr>
+      <w:r>
+        <w:rPr>
+          <w:rFonts w:ascii="Times New Roman" w:hAnsi="Times New Roman" w:eastAsia="Times New Roman"/>
           <w:sz w:val="24"/>
         </w:rPr>
         <w:t>1.3 Плохая погода, окклюзия и деградация сенсоров</w:t>
       </w:r>
-    </w:p>
-    <w:p>
-      <w:pPr>
-        <w:spacing w:line="360" w:lineRule="auto" w:after="0"/>
-        <w:ind w:firstLine="0"/>
-      </w:pPr>
-      <w:r>
-        <w:rPr>
-          <w:rFonts w:ascii="Times New Roman" w:hAnsi="Times New Roman" w:eastAsia="Times New Roman"/>
-          <w:b w:val="0"/>
-          <w:sz w:val="24"/>
-        </w:rPr>
-        <w:t>1.4 OOD detection и uncertainty estimation</w:t>
-      </w:r>
-    </w:p>
-    <w:p>
-      <w:pPr>
-        <w:spacing w:line="360" w:lineRule="auto" w:after="0"/>
-        <w:ind w:firstLine="0"/>
-      </w:pPr>
-      <w:r>
-        <w:rPr>
-          <w:rFonts w:ascii="Times New Roman" w:hAnsi="Times New Roman" w:eastAsia="Times New Roman"/>
-          <w:b w:val="0"/>
-          <w:sz w:val="24"/>
-        </w:rPr>
-        <w:t>1.5 Датасеты, симуляторы и ограничения известных решений</w:t>
-      </w:r>
-    </w:p>
-    <w:p>
-      <w:pPr>
-        <w:spacing w:line="360" w:lineRule="auto" w:after="0"/>
-        <w:ind w:firstLine="0"/>
-      </w:pPr>
-      <w:r>
-        <w:rPr>
-          <w:rFonts w:ascii="Times New Roman" w:hAnsi="Times New Roman" w:eastAsia="Times New Roman"/>
-          <w:b w:val="0"/>
-          <w:sz w:val="24"/>
-        </w:rPr>
-        <w:t>1.6 Проверяемость исследований в ADAS</w:t>
-      </w:r>
-    </w:p>
-    <w:p>
-      <w:pPr>
-        <w:spacing w:line="360" w:lineRule="auto" w:after="0"/>
-        <w:ind w:firstLine="0"/>
-      </w:pPr>
-      <w:r>
-        <w:rPr>
-          <w:rFonts w:ascii="Times New Roman" w:hAnsi="Times New Roman" w:eastAsia="Times New Roman"/>
-          <w:b w:val="0"/>
-          <w:sz w:val="24"/>
-        </w:rPr>
-        <w:t>1.7 Выводы по главе 1</w:t>
-      </w:r>
-    </w:p>
-    <w:p>
-      <w:pPr>
-        <w:spacing w:line="360" w:lineRule="auto" w:after="0"/>
-        <w:ind w:firstLine="0"/>
-      </w:pPr>
-      <w:r>
-        <w:rPr>
-          <w:rFonts w:ascii="Times New Roman" w:hAnsi="Times New Roman" w:eastAsia="Times New Roman"/>
-          <w:b w:val="0"/>
+      <w:r>
+        <w:rPr>
+          <w:rFonts w:ascii="Times New Roman" w:hAnsi="Times New Roman" w:eastAsia="Times New Roman"/>
+          <w:sz w:val="24"/>
+        </w:rPr>
+        <w:tab/>
+      </w:r>
+      <w:r>
+        <w:rPr>
+          <w:rFonts w:ascii="Times New Roman" w:hAnsi="Times New Roman" w:eastAsia="Times New Roman"/>
+          <w:sz w:val="24"/>
+        </w:rPr>
+        <w:t>11</w:t>
+      </w:r>
+    </w:p>
+    <w:p>
+      <w:pPr>
+        <w:tabs>
+          <w:tab w:pos="9638" w:val="right"/>
+        </w:tabs>
+        <w:spacing w:line="360" w:lineRule="auto" w:after="0"/>
+        <w:ind w:firstLine="0" w:left="397"/>
+      </w:pPr>
+      <w:r>
+        <w:rPr>
+          <w:rFonts w:ascii="Times New Roman" w:hAnsi="Times New Roman" w:eastAsia="Times New Roman"/>
+          <w:sz w:val="24"/>
+        </w:rPr>
+        <w:t>1.4 Почему средние метрики не гарантируют безопасность</w:t>
+      </w:r>
+      <w:r>
+        <w:rPr>
+          <w:rFonts w:ascii="Times New Roman" w:hAnsi="Times New Roman" w:eastAsia="Times New Roman"/>
+          <w:sz w:val="24"/>
+        </w:rPr>
+        <w:tab/>
+      </w:r>
+      <w:r>
+        <w:rPr>
+          <w:rFonts w:ascii="Times New Roman" w:hAnsi="Times New Roman" w:eastAsia="Times New Roman"/>
+          <w:sz w:val="24"/>
+        </w:rPr>
+        <w:t>12</w:t>
+      </w:r>
+    </w:p>
+    <w:p>
+      <w:pPr>
+        <w:tabs>
+          <w:tab w:pos="9638" w:val="right"/>
+        </w:tabs>
+        <w:spacing w:line="360" w:lineRule="auto" w:after="0"/>
+        <w:ind w:firstLine="0" w:left="397"/>
+      </w:pPr>
+      <w:r>
+        <w:rPr>
+          <w:rFonts w:ascii="Times New Roman" w:hAnsi="Times New Roman" w:eastAsia="Times New Roman"/>
+          <w:sz w:val="24"/>
+        </w:rPr>
+        <w:t>1.5 OOD detection и uncertainty estimation</w:t>
+      </w:r>
+      <w:r>
+        <w:rPr>
+          <w:rFonts w:ascii="Times New Roman" w:hAnsi="Times New Roman" w:eastAsia="Times New Roman"/>
+          <w:sz w:val="24"/>
+        </w:rPr>
+        <w:tab/>
+      </w:r>
+      <w:r>
+        <w:rPr>
+          <w:rFonts w:ascii="Times New Roman" w:hAnsi="Times New Roman" w:eastAsia="Times New Roman"/>
+          <w:sz w:val="24"/>
+        </w:rPr>
+        <w:t>13</w:t>
+      </w:r>
+    </w:p>
+    <w:p>
+      <w:pPr>
+        <w:tabs>
+          <w:tab w:pos="9638" w:val="right"/>
+        </w:tabs>
+        <w:spacing w:line="360" w:lineRule="auto" w:after="0"/>
+        <w:ind w:firstLine="0" w:left="397"/>
+      </w:pPr>
+      <w:r>
+        <w:rPr>
+          <w:rFonts w:ascii="Times New Roman" w:hAnsi="Times New Roman" w:eastAsia="Times New Roman"/>
+          <w:sz w:val="24"/>
+        </w:rPr>
+        <w:t>1.6 Виды sensor fusion</w:t>
+      </w:r>
+      <w:r>
+        <w:rPr>
+          <w:rFonts w:ascii="Times New Roman" w:hAnsi="Times New Roman" w:eastAsia="Times New Roman"/>
+          <w:sz w:val="24"/>
+        </w:rPr>
+        <w:tab/>
+      </w:r>
+      <w:r>
+        <w:rPr>
+          <w:rFonts w:ascii="Times New Roman" w:hAnsi="Times New Roman" w:eastAsia="Times New Roman"/>
+          <w:sz w:val="24"/>
+        </w:rPr>
+        <w:t>14</w:t>
+      </w:r>
+    </w:p>
+    <w:p>
+      <w:pPr>
+        <w:tabs>
+          <w:tab w:pos="9638" w:val="right"/>
+        </w:tabs>
+        <w:spacing w:line="360" w:lineRule="auto" w:after="0"/>
+        <w:ind w:firstLine="0" w:left="397"/>
+      </w:pPr>
+      <w:r>
+        <w:rPr>
+          <w:rFonts w:ascii="Times New Roman" w:hAnsi="Times New Roman" w:eastAsia="Times New Roman"/>
+          <w:sz w:val="24"/>
+        </w:rPr>
+        <w:t>1.7 Датасеты и симуляторы</w:t>
+      </w:r>
+      <w:r>
+        <w:rPr>
+          <w:rFonts w:ascii="Times New Roman" w:hAnsi="Times New Roman" w:eastAsia="Times New Roman"/>
+          <w:sz w:val="24"/>
+        </w:rPr>
+        <w:tab/>
+      </w:r>
+      <w:r>
+        <w:rPr>
+          <w:rFonts w:ascii="Times New Roman" w:hAnsi="Times New Roman" w:eastAsia="Times New Roman"/>
+          <w:sz w:val="24"/>
+        </w:rPr>
+        <w:t>15</w:t>
+      </w:r>
+    </w:p>
+    <w:p>
+      <w:pPr>
+        <w:tabs>
+          <w:tab w:pos="9638" w:val="right"/>
+        </w:tabs>
+        <w:spacing w:line="360" w:lineRule="auto" w:after="0"/>
+        <w:ind w:firstLine="0" w:left="397"/>
+      </w:pPr>
+      <w:r>
+        <w:rPr>
+          <w:rFonts w:ascii="Times New Roman" w:hAnsi="Times New Roman" w:eastAsia="Times New Roman"/>
+          <w:sz w:val="24"/>
+        </w:rPr>
+        <w:t>1.8 Аналоги и ограничения известных решений</w:t>
+      </w:r>
+      <w:r>
+        <w:rPr>
+          <w:rFonts w:ascii="Times New Roman" w:hAnsi="Times New Roman" w:eastAsia="Times New Roman"/>
+          <w:sz w:val="24"/>
+        </w:rPr>
+        <w:tab/>
+      </w:r>
+      <w:r>
+        <w:rPr>
+          <w:rFonts w:ascii="Times New Roman" w:hAnsi="Times New Roman" w:eastAsia="Times New Roman"/>
+          <w:sz w:val="24"/>
+        </w:rPr>
+        <w:t>16</w:t>
+      </w:r>
+    </w:p>
+    <w:p>
+      <w:pPr>
+        <w:tabs>
+          <w:tab w:pos="9638" w:val="right"/>
+        </w:tabs>
+        <w:spacing w:line="360" w:lineRule="auto" w:after="0"/>
+        <w:ind w:firstLine="0" w:left="397"/>
+      </w:pPr>
+      <w:r>
+        <w:rPr>
+          <w:rFonts w:ascii="Times New Roman" w:hAnsi="Times New Roman" w:eastAsia="Times New Roman"/>
+          <w:sz w:val="24"/>
+        </w:rPr>
+        <w:t>1.9 Проверяемость исследований в ADAS</w:t>
+      </w:r>
+      <w:r>
+        <w:rPr>
+          <w:rFonts w:ascii="Times New Roman" w:hAnsi="Times New Roman" w:eastAsia="Times New Roman"/>
+          <w:sz w:val="24"/>
+        </w:rPr>
+        <w:tab/>
+      </w:r>
+      <w:r>
+        <w:rPr>
+          <w:rFonts w:ascii="Times New Roman" w:hAnsi="Times New Roman" w:eastAsia="Times New Roman"/>
+          <w:sz w:val="24"/>
+        </w:rPr>
+        <w:t>17</w:t>
+      </w:r>
+    </w:p>
+    <w:p>
+      <w:pPr>
+        <w:tabs>
+          <w:tab w:pos="9638" w:val="right"/>
+        </w:tabs>
+        <w:spacing w:line="360" w:lineRule="auto" w:after="0"/>
+        <w:ind w:firstLine="0" w:left="397"/>
+      </w:pPr>
+      <w:r>
+        <w:rPr>
+          <w:rFonts w:ascii="Times New Roman" w:hAnsi="Times New Roman" w:eastAsia="Times New Roman"/>
+          <w:sz w:val="24"/>
+        </w:rPr>
+        <w:t>1.10 Выводы по главе 1</w:t>
+      </w:r>
+      <w:r>
+        <w:rPr>
+          <w:rFonts w:ascii="Times New Roman" w:hAnsi="Times New Roman" w:eastAsia="Times New Roman"/>
+          <w:sz w:val="24"/>
+        </w:rPr>
+        <w:tab/>
+      </w:r>
+      <w:r>
+        <w:rPr>
+          <w:rFonts w:ascii="Times New Roman" w:hAnsi="Times New Roman" w:eastAsia="Times New Roman"/>
+          <w:sz w:val="24"/>
+        </w:rPr>
+        <w:t>18</w:t>
+      </w:r>
+    </w:p>
+    <w:p>
+      <w:pPr>
+        <w:tabs>
+          <w:tab w:pos="9638" w:val="right"/>
+        </w:tabs>
+        <w:spacing w:line="360" w:lineRule="auto" w:after="0"/>
+        <w:ind w:firstLine="0" w:left="0"/>
+      </w:pPr>
+      <w:r>
+        <w:rPr>
+          <w:rFonts w:ascii="Times New Roman" w:hAnsi="Times New Roman" w:eastAsia="Times New Roman"/>
           <w:sz w:val="24"/>
         </w:rPr>
         <w:t>2 Методика обнаружения и обработки редких критических сценариев</w:t>
       </w:r>
-    </w:p>
-    <w:p>
-      <w:pPr>
-        <w:spacing w:line="360" w:lineRule="auto" w:after="0"/>
-        <w:ind w:firstLine="0"/>
-      </w:pPr>
-      <w:r>
-        <w:rPr>
-          <w:rFonts w:ascii="Times New Roman" w:hAnsi="Times New Roman" w:eastAsia="Times New Roman"/>
-          <w:b w:val="0"/>
+      <w:r>
+        <w:rPr>
+          <w:rFonts w:ascii="Times New Roman" w:hAnsi="Times New Roman" w:eastAsia="Times New Roman"/>
+          <w:sz w:val="24"/>
+        </w:rPr>
+        <w:tab/>
+      </w:r>
+      <w:r>
+        <w:rPr>
+          <w:rFonts w:ascii="Times New Roman" w:hAnsi="Times New Roman" w:eastAsia="Times New Roman"/>
+          <w:sz w:val="24"/>
+        </w:rPr>
+        <w:t>20</w:t>
+      </w:r>
+    </w:p>
+    <w:p>
+      <w:pPr>
+        <w:tabs>
+          <w:tab w:pos="9638" w:val="right"/>
+        </w:tabs>
+        <w:spacing w:line="360" w:lineRule="auto" w:after="0"/>
+        <w:ind w:firstLine="0" w:left="397"/>
+      </w:pPr>
+      <w:r>
+        <w:rPr>
+          <w:rFonts w:ascii="Times New Roman" w:hAnsi="Times New Roman" w:eastAsia="Times New Roman"/>
           <w:sz w:val="24"/>
         </w:rPr>
         <w:t>2.1 Классификация сценариев</w:t>
       </w:r>
-    </w:p>
-    <w:p>
-      <w:pPr>
-        <w:spacing w:line="360" w:lineRule="auto" w:after="0"/>
-        <w:ind w:firstLine="0"/>
-      </w:pPr>
-      <w:r>
-        <w:rPr>
-          <w:rFonts w:ascii="Times New Roman" w:hAnsi="Times New Roman" w:eastAsia="Times New Roman"/>
-          <w:b w:val="0"/>
-          <w:sz w:val="24"/>
-        </w:rPr>
-        <w:t>2.2 Признаки качества сенсоров и надежности</w:t>
-      </w:r>
-    </w:p>
-    <w:p>
-      <w:pPr>
-        <w:spacing w:line="360" w:lineRule="auto" w:after="0"/>
-        <w:ind w:firstLine="0"/>
-      </w:pPr>
-      <w:r>
-        <w:rPr>
-          <w:rFonts w:ascii="Times New Roman" w:hAnsi="Times New Roman" w:eastAsia="Times New Roman"/>
-          <w:b w:val="0"/>
-          <w:sz w:val="24"/>
-        </w:rPr>
-        <w:t>2.3 Uncertainty score, risk score и adaptive fusion</w:t>
-      </w:r>
-    </w:p>
-    <w:p>
-      <w:pPr>
-        <w:spacing w:line="360" w:lineRule="auto" w:after="0"/>
-        <w:ind w:firstLine="0"/>
-      </w:pPr>
-      <w:r>
-        <w:rPr>
-          <w:rFonts w:ascii="Times New Roman" w:hAnsi="Times New Roman" w:eastAsia="Times New Roman"/>
-          <w:b w:val="0"/>
-          <w:sz w:val="24"/>
-        </w:rPr>
-        <w:t>2.4 Метрики и план эксперимента</w:t>
-      </w:r>
-    </w:p>
-    <w:p>
-      <w:pPr>
-        <w:spacing w:line="360" w:lineRule="auto" w:after="0"/>
-        <w:ind w:firstLine="0"/>
-      </w:pPr>
-      <w:r>
-        <w:rPr>
-          <w:rFonts w:ascii="Times New Roman" w:hAnsi="Times New Roman" w:eastAsia="Times New Roman"/>
-          <w:b w:val="0"/>
-          <w:sz w:val="24"/>
-        </w:rPr>
-        <w:t>2.5 Этика, приватность и границы применения</w:t>
-      </w:r>
-    </w:p>
-    <w:p>
-      <w:pPr>
-        <w:spacing w:line="360" w:lineRule="auto" w:after="0"/>
-        <w:ind w:firstLine="0"/>
-      </w:pPr>
-      <w:r>
-        <w:rPr>
-          <w:rFonts w:ascii="Times New Roman" w:hAnsi="Times New Roman" w:eastAsia="Times New Roman"/>
-          <w:b w:val="0"/>
-          <w:sz w:val="24"/>
-        </w:rPr>
-        <w:t>2.6 Требования к промышленной проверке</w:t>
-      </w:r>
-    </w:p>
-    <w:p>
-      <w:pPr>
-        <w:spacing w:line="360" w:lineRule="auto" w:after="0"/>
-        <w:ind w:firstLine="0"/>
-      </w:pPr>
-      <w:r>
-        <w:rPr>
-          <w:rFonts w:ascii="Times New Roman" w:hAnsi="Times New Roman" w:eastAsia="Times New Roman"/>
-          <w:b w:val="0"/>
-          <w:sz w:val="24"/>
-        </w:rPr>
-        <w:t>2.7 Выводы по главе 2</w:t>
-      </w:r>
-    </w:p>
-    <w:p>
-      <w:pPr>
-        <w:spacing w:line="360" w:lineRule="auto" w:after="0"/>
-        <w:ind w:firstLine="0"/>
-      </w:pPr>
-      <w:r>
-        <w:rPr>
-          <w:rFonts w:ascii="Times New Roman" w:hAnsi="Times New Roman" w:eastAsia="Times New Roman"/>
-          <w:b w:val="0"/>
+      <w:r>
+        <w:rPr>
+          <w:rFonts w:ascii="Times New Roman" w:hAnsi="Times New Roman" w:eastAsia="Times New Roman"/>
+          <w:sz w:val="24"/>
+        </w:rPr>
+        <w:tab/>
+      </w:r>
+      <w:r>
+        <w:rPr>
+          <w:rFonts w:ascii="Times New Roman" w:hAnsi="Times New Roman" w:eastAsia="Times New Roman"/>
+          <w:sz w:val="24"/>
+        </w:rPr>
+        <w:t>20</w:t>
+      </w:r>
+    </w:p>
+    <w:p>
+      <w:pPr>
+        <w:tabs>
+          <w:tab w:pos="9638" w:val="right"/>
+        </w:tabs>
+        <w:spacing w:line="360" w:lineRule="auto" w:after="0"/>
+        <w:ind w:firstLine="0" w:left="397"/>
+      </w:pPr>
+      <w:r>
+        <w:rPr>
+          <w:rFonts w:ascii="Times New Roman" w:hAnsi="Times New Roman" w:eastAsia="Times New Roman"/>
+          <w:sz w:val="24"/>
+        </w:rPr>
+        <w:t>2.2 Признаки качества сенсоров</w:t>
+      </w:r>
+      <w:r>
+        <w:rPr>
+          <w:rFonts w:ascii="Times New Roman" w:hAnsi="Times New Roman" w:eastAsia="Times New Roman"/>
+          <w:sz w:val="24"/>
+        </w:rPr>
+        <w:tab/>
+      </w:r>
+      <w:r>
+        <w:rPr>
+          <w:rFonts w:ascii="Times New Roman" w:hAnsi="Times New Roman" w:eastAsia="Times New Roman"/>
+          <w:sz w:val="24"/>
+        </w:rPr>
+        <w:t>21</w:t>
+      </w:r>
+    </w:p>
+    <w:p>
+      <w:pPr>
+        <w:tabs>
+          <w:tab w:pos="9638" w:val="right"/>
+        </w:tabs>
+        <w:spacing w:line="360" w:lineRule="auto" w:after="0"/>
+        <w:ind w:firstLine="0" w:left="397"/>
+      </w:pPr>
+      <w:r>
+        <w:rPr>
+          <w:rFonts w:ascii="Times New Roman" w:hAnsi="Times New Roman" w:eastAsia="Times New Roman"/>
+          <w:sz w:val="24"/>
+        </w:rPr>
+        <w:t>2.3 Sensor reliability</w:t>
+      </w:r>
+      <w:r>
+        <w:rPr>
+          <w:rFonts w:ascii="Times New Roman" w:hAnsi="Times New Roman" w:eastAsia="Times New Roman"/>
+          <w:sz w:val="24"/>
+        </w:rPr>
+        <w:tab/>
+      </w:r>
+      <w:r>
+        <w:rPr>
+          <w:rFonts w:ascii="Times New Roman" w:hAnsi="Times New Roman" w:eastAsia="Times New Roman"/>
+          <w:sz w:val="24"/>
+        </w:rPr>
+        <w:t>22</w:t>
+      </w:r>
+    </w:p>
+    <w:p>
+      <w:pPr>
+        <w:tabs>
+          <w:tab w:pos="9638" w:val="right"/>
+        </w:tabs>
+        <w:spacing w:line="360" w:lineRule="auto" w:after="0"/>
+        <w:ind w:firstLine="0" w:left="397"/>
+      </w:pPr>
+      <w:r>
+        <w:rPr>
+          <w:rFonts w:ascii="Times New Roman" w:hAnsi="Times New Roman" w:eastAsia="Times New Roman"/>
+          <w:sz w:val="24"/>
+        </w:rPr>
+        <w:t>2.4 Uncertainty score</w:t>
+      </w:r>
+      <w:r>
+        <w:rPr>
+          <w:rFonts w:ascii="Times New Roman" w:hAnsi="Times New Roman" w:eastAsia="Times New Roman"/>
+          <w:sz w:val="24"/>
+        </w:rPr>
+        <w:tab/>
+      </w:r>
+      <w:r>
+        <w:rPr>
+          <w:rFonts w:ascii="Times New Roman" w:hAnsi="Times New Roman" w:eastAsia="Times New Roman"/>
+          <w:sz w:val="24"/>
+        </w:rPr>
+        <w:t>23</w:t>
+      </w:r>
+    </w:p>
+    <w:p>
+      <w:pPr>
+        <w:tabs>
+          <w:tab w:pos="9638" w:val="right"/>
+        </w:tabs>
+        <w:spacing w:line="360" w:lineRule="auto" w:after="0"/>
+        <w:ind w:firstLine="0" w:left="397"/>
+      </w:pPr>
+      <w:r>
+        <w:rPr>
+          <w:rFonts w:ascii="Times New Roman" w:hAnsi="Times New Roman" w:eastAsia="Times New Roman"/>
+          <w:sz w:val="24"/>
+        </w:rPr>
+        <w:t>2.5 Risk score</w:t>
+      </w:r>
+      <w:r>
+        <w:rPr>
+          <w:rFonts w:ascii="Times New Roman" w:hAnsi="Times New Roman" w:eastAsia="Times New Roman"/>
+          <w:sz w:val="24"/>
+        </w:rPr>
+        <w:tab/>
+      </w:r>
+      <w:r>
+        <w:rPr>
+          <w:rFonts w:ascii="Times New Roman" w:hAnsi="Times New Roman" w:eastAsia="Times New Roman"/>
+          <w:sz w:val="24"/>
+        </w:rPr>
+        <w:t>24</w:t>
+      </w:r>
+    </w:p>
+    <w:p>
+      <w:pPr>
+        <w:tabs>
+          <w:tab w:pos="9638" w:val="right"/>
+        </w:tabs>
+        <w:spacing w:line="360" w:lineRule="auto" w:after="0"/>
+        <w:ind w:firstLine="0" w:left="397"/>
+      </w:pPr>
+      <w:r>
+        <w:rPr>
+          <w:rFonts w:ascii="Times New Roman" w:hAnsi="Times New Roman" w:eastAsia="Times New Roman"/>
+          <w:sz w:val="24"/>
+        </w:rPr>
+        <w:t>2.6 Adaptive fusion</w:t>
+      </w:r>
+      <w:r>
+        <w:rPr>
+          <w:rFonts w:ascii="Times New Roman" w:hAnsi="Times New Roman" w:eastAsia="Times New Roman"/>
+          <w:sz w:val="24"/>
+        </w:rPr>
+        <w:tab/>
+      </w:r>
+      <w:r>
+        <w:rPr>
+          <w:rFonts w:ascii="Times New Roman" w:hAnsi="Times New Roman" w:eastAsia="Times New Roman"/>
+          <w:sz w:val="24"/>
+        </w:rPr>
+        <w:t>25</w:t>
+      </w:r>
+    </w:p>
+    <w:p>
+      <w:pPr>
+        <w:tabs>
+          <w:tab w:pos="9638" w:val="right"/>
+        </w:tabs>
+        <w:spacing w:line="360" w:lineRule="auto" w:after="0"/>
+        <w:ind w:firstLine="0" w:left="397"/>
+      </w:pPr>
+      <w:r>
+        <w:rPr>
+          <w:rFonts w:ascii="Times New Roman" w:hAnsi="Times New Roman" w:eastAsia="Times New Roman"/>
+          <w:sz w:val="24"/>
+        </w:rPr>
+        <w:t>2.7 Обработка отказа сенсора</w:t>
+      </w:r>
+      <w:r>
+        <w:rPr>
+          <w:rFonts w:ascii="Times New Roman" w:hAnsi="Times New Roman" w:eastAsia="Times New Roman"/>
+          <w:sz w:val="24"/>
+        </w:rPr>
+        <w:tab/>
+      </w:r>
+      <w:r>
+        <w:rPr>
+          <w:rFonts w:ascii="Times New Roman" w:hAnsi="Times New Roman" w:eastAsia="Times New Roman"/>
+          <w:sz w:val="24"/>
+        </w:rPr>
+        <w:t>26</w:t>
+      </w:r>
+    </w:p>
+    <w:p>
+      <w:pPr>
+        <w:tabs>
+          <w:tab w:pos="9638" w:val="right"/>
+        </w:tabs>
+        <w:spacing w:line="360" w:lineRule="auto" w:after="0"/>
+        <w:ind w:firstLine="0" w:left="397"/>
+      </w:pPr>
+      <w:r>
+        <w:rPr>
+          <w:rFonts w:ascii="Times New Roman" w:hAnsi="Times New Roman" w:eastAsia="Times New Roman"/>
+          <w:sz w:val="24"/>
+        </w:rPr>
+        <w:t>2.8 Метрики</w:t>
+      </w:r>
+      <w:r>
+        <w:rPr>
+          <w:rFonts w:ascii="Times New Roman" w:hAnsi="Times New Roman" w:eastAsia="Times New Roman"/>
+          <w:sz w:val="24"/>
+        </w:rPr>
+        <w:tab/>
+      </w:r>
+      <w:r>
+        <w:rPr>
+          <w:rFonts w:ascii="Times New Roman" w:hAnsi="Times New Roman" w:eastAsia="Times New Roman"/>
+          <w:sz w:val="24"/>
+        </w:rPr>
+        <w:t>27</w:t>
+      </w:r>
+    </w:p>
+    <w:p>
+      <w:pPr>
+        <w:tabs>
+          <w:tab w:pos="9638" w:val="right"/>
+        </w:tabs>
+        <w:spacing w:line="360" w:lineRule="auto" w:after="0"/>
+        <w:ind w:firstLine="0" w:left="397"/>
+      </w:pPr>
+      <w:r>
+        <w:rPr>
+          <w:rFonts w:ascii="Times New Roman" w:hAnsi="Times New Roman" w:eastAsia="Times New Roman"/>
+          <w:sz w:val="24"/>
+        </w:rPr>
+        <w:t>2.9 План эксперимента</w:t>
+      </w:r>
+      <w:r>
+        <w:rPr>
+          <w:rFonts w:ascii="Times New Roman" w:hAnsi="Times New Roman" w:eastAsia="Times New Roman"/>
+          <w:sz w:val="24"/>
+        </w:rPr>
+        <w:tab/>
+      </w:r>
+      <w:r>
+        <w:rPr>
+          <w:rFonts w:ascii="Times New Roman" w:hAnsi="Times New Roman" w:eastAsia="Times New Roman"/>
+          <w:sz w:val="24"/>
+        </w:rPr>
+        <w:t>28</w:t>
+      </w:r>
+    </w:p>
+    <w:p>
+      <w:pPr>
+        <w:tabs>
+          <w:tab w:pos="9638" w:val="right"/>
+        </w:tabs>
+        <w:spacing w:line="360" w:lineRule="auto" w:after="0"/>
+        <w:ind w:firstLine="0" w:left="397"/>
+      </w:pPr>
+      <w:r>
+        <w:rPr>
+          <w:rFonts w:ascii="Times New Roman" w:hAnsi="Times New Roman" w:eastAsia="Times New Roman"/>
+          <w:sz w:val="24"/>
+        </w:rPr>
+        <w:t>2.10 Этика и приватность</w:t>
+      </w:r>
+      <w:r>
+        <w:rPr>
+          <w:rFonts w:ascii="Times New Roman" w:hAnsi="Times New Roman" w:eastAsia="Times New Roman"/>
+          <w:sz w:val="24"/>
+        </w:rPr>
+        <w:tab/>
+      </w:r>
+      <w:r>
+        <w:rPr>
+          <w:rFonts w:ascii="Times New Roman" w:hAnsi="Times New Roman" w:eastAsia="Times New Roman"/>
+          <w:sz w:val="24"/>
+        </w:rPr>
+        <w:t>29</w:t>
+      </w:r>
+    </w:p>
+    <w:p>
+      <w:pPr>
+        <w:tabs>
+          <w:tab w:pos="9638" w:val="right"/>
+        </w:tabs>
+        <w:spacing w:line="360" w:lineRule="auto" w:after="0"/>
+        <w:ind w:firstLine="0" w:left="397"/>
+      </w:pPr>
+      <w:r>
+        <w:rPr>
+          <w:rFonts w:ascii="Times New Roman" w:hAnsi="Times New Roman" w:eastAsia="Times New Roman"/>
+          <w:sz w:val="24"/>
+        </w:rPr>
+        <w:t>2.11 Требования к промышленной проверке</w:t>
+      </w:r>
+      <w:r>
+        <w:rPr>
+          <w:rFonts w:ascii="Times New Roman" w:hAnsi="Times New Roman" w:eastAsia="Times New Roman"/>
+          <w:sz w:val="24"/>
+        </w:rPr>
+        <w:tab/>
+      </w:r>
+      <w:r>
+        <w:rPr>
+          <w:rFonts w:ascii="Times New Roman" w:hAnsi="Times New Roman" w:eastAsia="Times New Roman"/>
+          <w:sz w:val="24"/>
+        </w:rPr>
+        <w:t>30</w:t>
+      </w:r>
+    </w:p>
+    <w:p>
+      <w:pPr>
+        <w:tabs>
+          <w:tab w:pos="9638" w:val="right"/>
+        </w:tabs>
+        <w:spacing w:line="360" w:lineRule="auto" w:after="0"/>
+        <w:ind w:firstLine="0" w:left="397"/>
+      </w:pPr>
+      <w:r>
+        <w:rPr>
+          <w:rFonts w:ascii="Times New Roman" w:hAnsi="Times New Roman" w:eastAsia="Times New Roman"/>
+          <w:sz w:val="24"/>
+        </w:rPr>
+        <w:t>2.12 Выводы по главе 2</w:t>
+      </w:r>
+      <w:r>
+        <w:rPr>
+          <w:rFonts w:ascii="Times New Roman" w:hAnsi="Times New Roman" w:eastAsia="Times New Roman"/>
+          <w:sz w:val="24"/>
+        </w:rPr>
+        <w:tab/>
+      </w:r>
+      <w:r>
+        <w:rPr>
+          <w:rFonts w:ascii="Times New Roman" w:hAnsi="Times New Roman" w:eastAsia="Times New Roman"/>
+          <w:sz w:val="24"/>
+        </w:rPr>
+        <w:t>31</w:t>
+      </w:r>
+    </w:p>
+    <w:p>
+      <w:pPr>
+        <w:tabs>
+          <w:tab w:pos="9638" w:val="right"/>
+        </w:tabs>
+        <w:spacing w:line="360" w:lineRule="auto" w:after="0"/>
+        <w:ind w:firstLine="0" w:left="0"/>
+      </w:pPr>
+      <w:r>
+        <w:rPr>
+          <w:rFonts w:ascii="Times New Roman" w:hAnsi="Times New Roman" w:eastAsia="Times New Roman"/>
           <w:sz w:val="24"/>
         </w:rPr>
         <w:t>3 Реализация прототипа и экспериментальная проверка</w:t>
       </w:r>
-    </w:p>
-    <w:p>
-      <w:pPr>
-        <w:spacing w:line="360" w:lineRule="auto" w:after="0"/>
-        <w:ind w:firstLine="0"/>
-      </w:pPr>
-      <w:r>
-        <w:rPr>
-          <w:rFonts w:ascii="Times New Roman" w:hAnsi="Times New Roman" w:eastAsia="Times New Roman"/>
-          <w:b w:val="0"/>
-          <w:sz w:val="24"/>
-        </w:rPr>
-        <w:t>3.1 Структура репозитория и инструменты</w:t>
-      </w:r>
-    </w:p>
-    <w:p>
-      <w:pPr>
-        <w:spacing w:line="360" w:lineRule="auto" w:after="0"/>
-        <w:ind w:firstLine="0"/>
-      </w:pPr>
-      <w:r>
-        <w:rPr>
-          <w:rFonts w:ascii="Times New Roman" w:hAnsi="Times New Roman" w:eastAsia="Times New Roman"/>
-          <w:b w:val="0"/>
-          <w:sz w:val="24"/>
-        </w:rPr>
-        <w:t>3.2 Подготовка KITTI scenario table</w:t>
-      </w:r>
-    </w:p>
-    <w:p>
-      <w:pPr>
-        <w:spacing w:line="360" w:lineRule="auto" w:after="0"/>
-        <w:ind w:firstLine="0"/>
-      </w:pPr>
-      <w:r>
-        <w:rPr>
-          <w:rFonts w:ascii="Times New Roman" w:hAnsi="Times New Roman" w:eastAsia="Times New Roman"/>
-          <w:b w:val="0"/>
-          <w:sz w:val="24"/>
-        </w:rPr>
-        <w:t>3.3 Обучение baseline, proposed и ablation</w:t>
-      </w:r>
-    </w:p>
-    <w:p>
-      <w:pPr>
-        <w:spacing w:line="360" w:lineRule="auto" w:after="0"/>
-        <w:ind w:firstLine="0"/>
-      </w:pPr>
-      <w:r>
-        <w:rPr>
-          <w:rFonts w:ascii="Times New Roman" w:hAnsi="Times New Roman" w:eastAsia="Times New Roman"/>
-          <w:b w:val="0"/>
-          <w:sz w:val="24"/>
-        </w:rPr>
-        <w:t>3.4 Результаты и графики</w:t>
-      </w:r>
-    </w:p>
-    <w:p>
-      <w:pPr>
-        <w:spacing w:line="360" w:lineRule="auto" w:after="0"/>
-        <w:ind w:firstLine="0"/>
-      </w:pPr>
-      <w:r>
-        <w:rPr>
-          <w:rFonts w:ascii="Times New Roman" w:hAnsi="Times New Roman" w:eastAsia="Times New Roman"/>
-          <w:b w:val="0"/>
-          <w:sz w:val="24"/>
-        </w:rPr>
-        <w:t>3.5 Анализ ошибок</w:t>
-      </w:r>
-    </w:p>
-    <w:p>
-      <w:pPr>
-        <w:spacing w:line="360" w:lineRule="auto" w:after="0"/>
-        <w:ind w:firstLine="0"/>
-      </w:pPr>
-      <w:r>
-        <w:rPr>
-          <w:rFonts w:ascii="Times New Roman" w:hAnsi="Times New Roman" w:eastAsia="Times New Roman"/>
-          <w:b w:val="0"/>
-          <w:sz w:val="24"/>
-        </w:rPr>
-        <w:t>3.6 Ограничения и воспроизводимость</w:t>
-      </w:r>
-    </w:p>
-    <w:p>
-      <w:pPr>
-        <w:spacing w:line="360" w:lineRule="auto" w:after="0"/>
-        <w:ind w:firstLine="0"/>
-      </w:pPr>
-      <w:r>
-        <w:rPr>
-          <w:rFonts w:ascii="Times New Roman" w:hAnsi="Times New Roman" w:eastAsia="Times New Roman"/>
-          <w:b w:val="0"/>
-          <w:sz w:val="24"/>
-        </w:rPr>
-        <w:t>3.7 Проверка целостности результатов</w:t>
-      </w:r>
-    </w:p>
-    <w:p>
-      <w:pPr>
-        <w:spacing w:line="360" w:lineRule="auto" w:after="0"/>
-        <w:ind w:firstLine="0"/>
-      </w:pPr>
-      <w:r>
-        <w:rPr>
-          <w:rFonts w:ascii="Times New Roman" w:hAnsi="Times New Roman" w:eastAsia="Times New Roman"/>
-          <w:b w:val="0"/>
-          <w:sz w:val="24"/>
-        </w:rPr>
-        <w:t>3.8 Перенос на raw sensor pipeline</w:t>
-      </w:r>
-    </w:p>
-    <w:p>
-      <w:pPr>
-        <w:spacing w:line="360" w:lineRule="auto" w:after="0"/>
-        <w:ind w:firstLine="0"/>
-      </w:pPr>
-      <w:r>
-        <w:rPr>
-          <w:rFonts w:ascii="Times New Roman" w:hAnsi="Times New Roman" w:eastAsia="Times New Roman"/>
-          <w:b w:val="0"/>
+      <w:r>
+        <w:rPr>
+          <w:rFonts w:ascii="Times New Roman" w:hAnsi="Times New Roman" w:eastAsia="Times New Roman"/>
+          <w:sz w:val="24"/>
+        </w:rPr>
+        <w:tab/>
+      </w:r>
+      <w:r>
+        <w:rPr>
+          <w:rFonts w:ascii="Times New Roman" w:hAnsi="Times New Roman" w:eastAsia="Times New Roman"/>
+          <w:sz w:val="24"/>
+        </w:rPr>
+        <w:t>34</w:t>
+      </w:r>
+    </w:p>
+    <w:p>
+      <w:pPr>
+        <w:tabs>
+          <w:tab w:pos="9638" w:val="right"/>
+        </w:tabs>
+        <w:spacing w:line="360" w:lineRule="auto" w:after="0"/>
+        <w:ind w:firstLine="0" w:left="397"/>
+      </w:pPr>
+      <w:r>
+        <w:rPr>
+          <w:rFonts w:ascii="Times New Roman" w:hAnsi="Times New Roman" w:eastAsia="Times New Roman"/>
+          <w:sz w:val="24"/>
+        </w:rPr>
+        <w:t>3.1 Структура репозитория</w:t>
+      </w:r>
+      <w:r>
+        <w:rPr>
+          <w:rFonts w:ascii="Times New Roman" w:hAnsi="Times New Roman" w:eastAsia="Times New Roman"/>
+          <w:sz w:val="24"/>
+        </w:rPr>
+        <w:tab/>
+      </w:r>
+      <w:r>
+        <w:rPr>
+          <w:rFonts w:ascii="Times New Roman" w:hAnsi="Times New Roman" w:eastAsia="Times New Roman"/>
+          <w:sz w:val="24"/>
+        </w:rPr>
+        <w:t>34</w:t>
+      </w:r>
+    </w:p>
+    <w:p>
+      <w:pPr>
+        <w:tabs>
+          <w:tab w:pos="9638" w:val="right"/>
+        </w:tabs>
+        <w:spacing w:line="360" w:lineRule="auto" w:after="0"/>
+        <w:ind w:firstLine="0" w:left="397"/>
+      </w:pPr>
+      <w:r>
+        <w:rPr>
+          <w:rFonts w:ascii="Times New Roman" w:hAnsi="Times New Roman" w:eastAsia="Times New Roman"/>
+          <w:sz w:val="24"/>
+        </w:rPr>
+        <w:t>3.2 Используемые инструменты</w:t>
+      </w:r>
+      <w:r>
+        <w:rPr>
+          <w:rFonts w:ascii="Times New Roman" w:hAnsi="Times New Roman" w:eastAsia="Times New Roman"/>
+          <w:sz w:val="24"/>
+        </w:rPr>
+        <w:tab/>
+      </w:r>
+      <w:r>
+        <w:rPr>
+          <w:rFonts w:ascii="Times New Roman" w:hAnsi="Times New Roman" w:eastAsia="Times New Roman"/>
+          <w:sz w:val="24"/>
+        </w:rPr>
+        <w:t>35</w:t>
+      </w:r>
+    </w:p>
+    <w:p>
+      <w:pPr>
+        <w:tabs>
+          <w:tab w:pos="9638" w:val="right"/>
+        </w:tabs>
+        <w:spacing w:line="360" w:lineRule="auto" w:after="0"/>
+        <w:ind w:firstLine="0" w:left="397"/>
+      </w:pPr>
+      <w:r>
+        <w:rPr>
+          <w:rFonts w:ascii="Times New Roman" w:hAnsi="Times New Roman" w:eastAsia="Times New Roman"/>
+          <w:sz w:val="24"/>
+        </w:rPr>
+        <w:t>3.3 Подготовка данных</w:t>
+      </w:r>
+      <w:r>
+        <w:rPr>
+          <w:rFonts w:ascii="Times New Roman" w:hAnsi="Times New Roman" w:eastAsia="Times New Roman"/>
+          <w:sz w:val="24"/>
+        </w:rPr>
+        <w:tab/>
+      </w:r>
+      <w:r>
+        <w:rPr>
+          <w:rFonts w:ascii="Times New Roman" w:hAnsi="Times New Roman" w:eastAsia="Times New Roman"/>
+          <w:sz w:val="24"/>
+        </w:rPr>
+        <w:t>36</w:t>
+      </w:r>
+    </w:p>
+    <w:p>
+      <w:pPr>
+        <w:tabs>
+          <w:tab w:pos="9638" w:val="right"/>
+        </w:tabs>
+        <w:spacing w:line="360" w:lineRule="auto" w:after="0"/>
+        <w:ind w:firstLine="0" w:left="397"/>
+      </w:pPr>
+      <w:r>
+        <w:rPr>
+          <w:rFonts w:ascii="Times New Roman" w:hAnsi="Times New Roman" w:eastAsia="Times New Roman"/>
+          <w:sz w:val="24"/>
+        </w:rPr>
+        <w:t>3.4 Обучение моделей</w:t>
+      </w:r>
+      <w:r>
+        <w:rPr>
+          <w:rFonts w:ascii="Times New Roman" w:hAnsi="Times New Roman" w:eastAsia="Times New Roman"/>
+          <w:sz w:val="24"/>
+        </w:rPr>
+        <w:tab/>
+      </w:r>
+      <w:r>
+        <w:rPr>
+          <w:rFonts w:ascii="Times New Roman" w:hAnsi="Times New Roman" w:eastAsia="Times New Roman"/>
+          <w:sz w:val="24"/>
+        </w:rPr>
+        <w:t>37</w:t>
+      </w:r>
+    </w:p>
+    <w:p>
+      <w:pPr>
+        <w:tabs>
+          <w:tab w:pos="9638" w:val="right"/>
+        </w:tabs>
+        <w:spacing w:line="360" w:lineRule="auto" w:after="0"/>
+        <w:ind w:firstLine="0" w:left="397"/>
+      </w:pPr>
+      <w:r>
+        <w:rPr>
+          <w:rFonts w:ascii="Times New Roman" w:hAnsi="Times New Roman" w:eastAsia="Times New Roman"/>
+          <w:sz w:val="24"/>
+        </w:rPr>
+        <w:t>3.5 Настройка порогов</w:t>
+      </w:r>
+      <w:r>
+        <w:rPr>
+          <w:rFonts w:ascii="Times New Roman" w:hAnsi="Times New Roman" w:eastAsia="Times New Roman"/>
+          <w:sz w:val="24"/>
+        </w:rPr>
+        <w:tab/>
+      </w:r>
+      <w:r>
+        <w:rPr>
+          <w:rFonts w:ascii="Times New Roman" w:hAnsi="Times New Roman" w:eastAsia="Times New Roman"/>
+          <w:sz w:val="24"/>
+        </w:rPr>
+        <w:t>38</w:t>
+      </w:r>
+    </w:p>
+    <w:p>
+      <w:pPr>
+        <w:tabs>
+          <w:tab w:pos="9638" w:val="right"/>
+        </w:tabs>
+        <w:spacing w:line="360" w:lineRule="auto" w:after="0"/>
+        <w:ind w:firstLine="0" w:left="397"/>
+      </w:pPr>
+      <w:r>
+        <w:rPr>
+          <w:rFonts w:ascii="Times New Roman" w:hAnsi="Times New Roman" w:eastAsia="Times New Roman"/>
+          <w:sz w:val="24"/>
+        </w:rPr>
+        <w:t>3.6 Результаты</w:t>
+      </w:r>
+      <w:r>
+        <w:rPr>
+          <w:rFonts w:ascii="Times New Roman" w:hAnsi="Times New Roman" w:eastAsia="Times New Roman"/>
+          <w:sz w:val="24"/>
+        </w:rPr>
+        <w:tab/>
+      </w:r>
+      <w:r>
+        <w:rPr>
+          <w:rFonts w:ascii="Times New Roman" w:hAnsi="Times New Roman" w:eastAsia="Times New Roman"/>
+          <w:sz w:val="24"/>
+        </w:rPr>
+        <w:t>39</w:t>
+      </w:r>
+    </w:p>
+    <w:p>
+      <w:pPr>
+        <w:tabs>
+          <w:tab w:pos="9638" w:val="right"/>
+        </w:tabs>
+        <w:spacing w:line="360" w:lineRule="auto" w:after="0"/>
+        <w:ind w:firstLine="0" w:left="397"/>
+      </w:pPr>
+      <w:r>
+        <w:rPr>
+          <w:rFonts w:ascii="Times New Roman" w:hAnsi="Times New Roman" w:eastAsia="Times New Roman"/>
+          <w:sz w:val="24"/>
+        </w:rPr>
+        <w:t>3.7 Анализ ошибок</w:t>
+      </w:r>
+      <w:r>
+        <w:rPr>
+          <w:rFonts w:ascii="Times New Roman" w:hAnsi="Times New Roman" w:eastAsia="Times New Roman"/>
+          <w:sz w:val="24"/>
+        </w:rPr>
+        <w:tab/>
+      </w:r>
+      <w:r>
+        <w:rPr>
+          <w:rFonts w:ascii="Times New Roman" w:hAnsi="Times New Roman" w:eastAsia="Times New Roman"/>
+          <w:sz w:val="24"/>
+        </w:rPr>
+        <w:t>40</w:t>
+      </w:r>
+    </w:p>
+    <w:p>
+      <w:pPr>
+        <w:tabs>
+          <w:tab w:pos="9638" w:val="right"/>
+        </w:tabs>
+        <w:spacing w:line="360" w:lineRule="auto" w:after="0"/>
+        <w:ind w:firstLine="0" w:left="397"/>
+      </w:pPr>
+      <w:r>
+        <w:rPr>
+          <w:rFonts w:ascii="Times New Roman" w:hAnsi="Times New Roman" w:eastAsia="Times New Roman"/>
+          <w:sz w:val="24"/>
+        </w:rPr>
+        <w:t>3.8 Ограничения</w:t>
+      </w:r>
+      <w:r>
+        <w:rPr>
+          <w:rFonts w:ascii="Times New Roman" w:hAnsi="Times New Roman" w:eastAsia="Times New Roman"/>
+          <w:sz w:val="24"/>
+        </w:rPr>
+        <w:tab/>
+      </w:r>
+      <w:r>
+        <w:rPr>
+          <w:rFonts w:ascii="Times New Roman" w:hAnsi="Times New Roman" w:eastAsia="Times New Roman"/>
+          <w:sz w:val="24"/>
+        </w:rPr>
+        <w:t>41</w:t>
+      </w:r>
+    </w:p>
+    <w:p>
+      <w:pPr>
+        <w:tabs>
+          <w:tab w:pos="9638" w:val="right"/>
+        </w:tabs>
+        <w:spacing w:line="360" w:lineRule="auto" w:after="0"/>
+        <w:ind w:firstLine="0" w:left="397"/>
+      </w:pPr>
+      <w:r>
+        <w:rPr>
+          <w:rFonts w:ascii="Times New Roman" w:hAnsi="Times New Roman" w:eastAsia="Times New Roman"/>
+          <w:sz w:val="24"/>
+        </w:rPr>
+        <w:t>3.9 Воспроизводимость</w:t>
+      </w:r>
+      <w:r>
+        <w:rPr>
+          <w:rFonts w:ascii="Times New Roman" w:hAnsi="Times New Roman" w:eastAsia="Times New Roman"/>
+          <w:sz w:val="24"/>
+        </w:rPr>
+        <w:tab/>
+      </w:r>
+      <w:r>
+        <w:rPr>
+          <w:rFonts w:ascii="Times New Roman" w:hAnsi="Times New Roman" w:eastAsia="Times New Roman"/>
+          <w:sz w:val="24"/>
+        </w:rPr>
+        <w:t>42</w:t>
+      </w:r>
+    </w:p>
+    <w:p>
+      <w:pPr>
+        <w:tabs>
+          <w:tab w:pos="9638" w:val="right"/>
+        </w:tabs>
+        <w:spacing w:line="360" w:lineRule="auto" w:after="0"/>
+        <w:ind w:firstLine="0" w:left="397"/>
+      </w:pPr>
+      <w:r>
+        <w:rPr>
+          <w:rFonts w:ascii="Times New Roman" w:hAnsi="Times New Roman" w:eastAsia="Times New Roman"/>
+          <w:sz w:val="24"/>
+        </w:rPr>
+        <w:t>3.10 Сравнение с литературным примером BEVFusion</w:t>
+      </w:r>
+      <w:r>
+        <w:rPr>
+          <w:rFonts w:ascii="Times New Roman" w:hAnsi="Times New Roman" w:eastAsia="Times New Roman"/>
+          <w:sz w:val="24"/>
+        </w:rPr>
+        <w:tab/>
+      </w:r>
+      <w:r>
+        <w:rPr>
+          <w:rFonts w:ascii="Times New Roman" w:hAnsi="Times New Roman" w:eastAsia="Times New Roman"/>
+          <w:sz w:val="24"/>
+        </w:rPr>
+        <w:t>43</w:t>
+      </w:r>
+    </w:p>
+    <w:p>
+      <w:pPr>
+        <w:tabs>
+          <w:tab w:pos="9638" w:val="right"/>
+        </w:tabs>
+        <w:spacing w:line="360" w:lineRule="auto" w:after="0"/>
+        <w:ind w:firstLine="0" w:left="397"/>
+      </w:pPr>
+      <w:r>
+        <w:rPr>
+          <w:rFonts w:ascii="Times New Roman" w:hAnsi="Times New Roman" w:eastAsia="Times New Roman"/>
+          <w:sz w:val="24"/>
+        </w:rPr>
+        <w:t>3.11 Проверка целостности результатов</w:t>
+      </w:r>
+      <w:r>
+        <w:rPr>
+          <w:rFonts w:ascii="Times New Roman" w:hAnsi="Times New Roman" w:eastAsia="Times New Roman"/>
+          <w:sz w:val="24"/>
+        </w:rPr>
+        <w:tab/>
+      </w:r>
+      <w:r>
+        <w:rPr>
+          <w:rFonts w:ascii="Times New Roman" w:hAnsi="Times New Roman" w:eastAsia="Times New Roman"/>
+          <w:sz w:val="24"/>
+        </w:rPr>
+        <w:t>44</w:t>
+      </w:r>
+    </w:p>
+    <w:p>
+      <w:pPr>
+        <w:tabs>
+          <w:tab w:pos="9638" w:val="right"/>
+        </w:tabs>
+        <w:spacing w:line="360" w:lineRule="auto" w:after="0"/>
+        <w:ind w:firstLine="0" w:left="397"/>
+      </w:pPr>
+      <w:r>
+        <w:rPr>
+          <w:rFonts w:ascii="Times New Roman" w:hAnsi="Times New Roman" w:eastAsia="Times New Roman"/>
+          <w:sz w:val="24"/>
+        </w:rPr>
+        <w:t>3.12 Перенос на raw sensor pipeline</w:t>
+      </w:r>
+      <w:r>
+        <w:rPr>
+          <w:rFonts w:ascii="Times New Roman" w:hAnsi="Times New Roman" w:eastAsia="Times New Roman"/>
+          <w:sz w:val="24"/>
+        </w:rPr>
+        <w:tab/>
+      </w:r>
+      <w:r>
+        <w:rPr>
+          <w:rFonts w:ascii="Times New Roman" w:hAnsi="Times New Roman" w:eastAsia="Times New Roman"/>
+          <w:sz w:val="24"/>
+        </w:rPr>
+        <w:t>45</w:t>
+      </w:r>
+    </w:p>
+    <w:p>
+      <w:pPr>
+        <w:tabs>
+          <w:tab w:pos="9638" w:val="right"/>
+        </w:tabs>
+        <w:spacing w:line="360" w:lineRule="auto" w:after="0"/>
+        <w:ind w:firstLine="0" w:left="0"/>
+      </w:pPr>
+      <w:r>
+        <w:rPr>
+          <w:rFonts w:ascii="Times New Roman" w:hAnsi="Times New Roman" w:eastAsia="Times New Roman"/>
           <w:sz w:val="24"/>
         </w:rPr>
         <w:t>ЗАКЛЮЧЕНИЕ</w:t>
       </w:r>
-    </w:p>
-    <w:p>
-      <w:pPr>
-        <w:spacing w:line="360" w:lineRule="auto" w:after="0"/>
-        <w:ind w:firstLine="0"/>
-      </w:pPr>
-      <w:r>
-        <w:rPr>
-          <w:rFonts w:ascii="Times New Roman" w:hAnsi="Times New Roman" w:eastAsia="Times New Roman"/>
-          <w:b w:val="0"/>
+      <w:r>
+        <w:rPr>
+          <w:rFonts w:ascii="Times New Roman" w:hAnsi="Times New Roman" w:eastAsia="Times New Roman"/>
+          <w:sz w:val="24"/>
+        </w:rPr>
+        <w:tab/>
+      </w:r>
+      <w:r>
+        <w:rPr>
+          <w:rFonts w:ascii="Times New Roman" w:hAnsi="Times New Roman" w:eastAsia="Times New Roman"/>
+          <w:sz w:val="24"/>
+        </w:rPr>
+        <w:t>51</w:t>
+      </w:r>
+    </w:p>
+    <w:p>
+      <w:pPr>
+        <w:tabs>
+          <w:tab w:pos="9638" w:val="right"/>
+        </w:tabs>
+        <w:spacing w:line="360" w:lineRule="auto" w:after="0"/>
+        <w:ind w:firstLine="0" w:left="0"/>
+      </w:pPr>
+      <w:r>
+        <w:rPr>
+          <w:rFonts w:ascii="Times New Roman" w:hAnsi="Times New Roman" w:eastAsia="Times New Roman"/>
           <w:sz w:val="24"/>
         </w:rPr>
         <w:t>ЛИТЕРАТУРА</w:t>
       </w:r>
-    </w:p>
-    <w:p>
-      <w:pPr>
-        <w:spacing w:line="360" w:lineRule="auto" w:after="0"/>
-        <w:ind w:firstLine="0"/>
-      </w:pPr>
-      <w:r>
-        <w:rPr>
-          <w:rFonts w:ascii="Times New Roman" w:hAnsi="Times New Roman" w:eastAsia="Times New Roman"/>
-          <w:b w:val="0"/>
+      <w:r>
+        <w:rPr>
+          <w:rFonts w:ascii="Times New Roman" w:hAnsi="Times New Roman" w:eastAsia="Times New Roman"/>
+          <w:sz w:val="24"/>
+        </w:rPr>
+        <w:tab/>
+      </w:r>
+      <w:r>
+        <w:rPr>
+          <w:rFonts w:ascii="Times New Roman" w:hAnsi="Times New Roman" w:eastAsia="Times New Roman"/>
+          <w:sz w:val="24"/>
+        </w:rPr>
+        <w:t>52</w:t>
+      </w:r>
+    </w:p>
+    <w:p>
+      <w:pPr>
+        <w:tabs>
+          <w:tab w:pos="9638" w:val="right"/>
+        </w:tabs>
+        <w:spacing w:line="360" w:lineRule="auto" w:after="0"/>
+        <w:ind w:firstLine="0" w:left="0"/>
+      </w:pPr>
+      <w:r>
+        <w:rPr>
+          <w:rFonts w:ascii="Times New Roman" w:hAnsi="Times New Roman" w:eastAsia="Times New Roman"/>
           <w:sz w:val="24"/>
         </w:rPr>
         <w:t>ПРИЛОЖЕНИЯ</w:t>
+      </w:r>
+      <w:r>
+        <w:rPr>
+          <w:rFonts w:ascii="Times New Roman" w:hAnsi="Times New Roman" w:eastAsia="Times New Roman"/>
+          <w:sz w:val="24"/>
+        </w:rPr>
+        <w:tab/>
+      </w:r>
+      <w:r>
+        <w:rPr>
+          <w:rFonts w:ascii="Times New Roman" w:hAnsi="Times New Roman" w:eastAsia="Times New Roman"/>
+          <w:sz w:val="24"/>
+        </w:rPr>
+        <w:t>54</w:t>
       </w:r>
     </w:p>
     <w:p>

</xml_diff>

<commit_message>
Polish VKR wording and diagrams
</commit_message>
<xml_diff>
--- a/Marianovskiy_VKR_ADAS_final.docx
+++ b/Marianovskiy_VKR_ADAS_final.docx
@@ -418,6 +418,7 @@
         <w:tblStyle w:val="TableGrid"/>
         <w:tblW w:type="auto" w:w="0"/>
         <w:jc w:val="center"/>
+        <w:tblLayout w:type="fixed"/>
         <w:tblLook w:firstColumn="1" w:firstRow="1" w:lastColumn="0" w:lastRow="0" w:noHBand="0" w:noVBand="1" w:val="04A0"/>
       </w:tblPr>
       <w:tblGrid>
@@ -992,7 +993,7 @@
           <w:rFonts w:ascii="Times New Roman" w:hAnsi="Times New Roman" w:eastAsia="Times New Roman"/>
           <w:sz w:val="24"/>
         </w:rPr>
-        <w:t>11</w:t>
+        <w:t>10</w:t>
       </w:r>
     </w:p>
     <w:p>
@@ -1022,7 +1023,7 @@
           <w:rFonts w:ascii="Times New Roman" w:hAnsi="Times New Roman" w:eastAsia="Times New Roman"/>
           <w:sz w:val="24"/>
         </w:rPr>
-        <w:t>12</w:t>
+        <w:t>11</w:t>
       </w:r>
     </w:p>
     <w:p>
@@ -1052,7 +1053,7 @@
           <w:rFonts w:ascii="Times New Roman" w:hAnsi="Times New Roman" w:eastAsia="Times New Roman"/>
           <w:sz w:val="24"/>
         </w:rPr>
-        <w:t>13</w:t>
+        <w:t>12</w:t>
       </w:r>
     </w:p>
     <w:p>
@@ -1082,7 +1083,7 @@
           <w:rFonts w:ascii="Times New Roman" w:hAnsi="Times New Roman" w:eastAsia="Times New Roman"/>
           <w:sz w:val="24"/>
         </w:rPr>
-        <w:t>14</w:t>
+        <w:t>13</w:t>
       </w:r>
     </w:p>
     <w:p>
@@ -1112,7 +1113,7 @@
           <w:rFonts w:ascii="Times New Roman" w:hAnsi="Times New Roman" w:eastAsia="Times New Roman"/>
           <w:sz w:val="24"/>
         </w:rPr>
-        <w:t>15</w:t>
+        <w:t>14</w:t>
       </w:r>
     </w:p>
     <w:p>
@@ -1142,7 +1143,7 @@
           <w:rFonts w:ascii="Times New Roman" w:hAnsi="Times New Roman" w:eastAsia="Times New Roman"/>
           <w:sz w:val="24"/>
         </w:rPr>
-        <w:t>16</w:t>
+        <w:t>15</w:t>
       </w:r>
     </w:p>
     <w:p>
@@ -1172,7 +1173,7 @@
           <w:rFonts w:ascii="Times New Roman" w:hAnsi="Times New Roman" w:eastAsia="Times New Roman"/>
           <w:sz w:val="24"/>
         </w:rPr>
-        <w:t>17</w:t>
+        <w:t>16</w:t>
       </w:r>
     </w:p>
     <w:p>
@@ -1202,7 +1203,7 @@
           <w:rFonts w:ascii="Times New Roman" w:hAnsi="Times New Roman" w:eastAsia="Times New Roman"/>
           <w:sz w:val="24"/>
         </w:rPr>
-        <w:t>18</w:t>
+        <w:t>17</w:t>
       </w:r>
     </w:p>
     <w:p>
@@ -1292,7 +1293,7 @@
           <w:rFonts w:ascii="Times New Roman" w:hAnsi="Times New Roman" w:eastAsia="Times New Roman"/>
           <w:sz w:val="24"/>
         </w:rPr>
-        <w:t>21</w:t>
+        <w:t>20</w:t>
       </w:r>
     </w:p>
     <w:p>
@@ -1322,7 +1323,7 @@
           <w:rFonts w:ascii="Times New Roman" w:hAnsi="Times New Roman" w:eastAsia="Times New Roman"/>
           <w:sz w:val="24"/>
         </w:rPr>
-        <w:t>22</w:t>
+        <w:t>21</w:t>
       </w:r>
     </w:p>
     <w:p>
@@ -1352,7 +1353,7 @@
           <w:rFonts w:ascii="Times New Roman" w:hAnsi="Times New Roman" w:eastAsia="Times New Roman"/>
           <w:sz w:val="24"/>
         </w:rPr>
-        <w:t>23</w:t>
+        <w:t>22</w:t>
       </w:r>
     </w:p>
     <w:p>
@@ -1382,7 +1383,7 @@
           <w:rFonts w:ascii="Times New Roman" w:hAnsi="Times New Roman" w:eastAsia="Times New Roman"/>
           <w:sz w:val="24"/>
         </w:rPr>
-        <w:t>24</w:t>
+        <w:t>23</w:t>
       </w:r>
     </w:p>
     <w:p>
@@ -1412,7 +1413,7 @@
           <w:rFonts w:ascii="Times New Roman" w:hAnsi="Times New Roman" w:eastAsia="Times New Roman"/>
           <w:sz w:val="24"/>
         </w:rPr>
-        <w:t>25</w:t>
+        <w:t>24</w:t>
       </w:r>
     </w:p>
     <w:p>
@@ -1442,7 +1443,7 @@
           <w:rFonts w:ascii="Times New Roman" w:hAnsi="Times New Roman" w:eastAsia="Times New Roman"/>
           <w:sz w:val="24"/>
         </w:rPr>
-        <w:t>26</w:t>
+        <w:t>25</w:t>
       </w:r>
     </w:p>
     <w:p>
@@ -1472,7 +1473,7 @@
           <w:rFonts w:ascii="Times New Roman" w:hAnsi="Times New Roman" w:eastAsia="Times New Roman"/>
           <w:sz w:val="24"/>
         </w:rPr>
-        <w:t>27</w:t>
+        <w:t>26</w:t>
       </w:r>
     </w:p>
     <w:p>
@@ -1502,7 +1503,7 @@
           <w:rFonts w:ascii="Times New Roman" w:hAnsi="Times New Roman" w:eastAsia="Times New Roman"/>
           <w:sz w:val="24"/>
         </w:rPr>
-        <w:t>28</w:t>
+        <w:t>27</w:t>
       </w:r>
     </w:p>
     <w:p>
@@ -1532,7 +1533,7 @@
           <w:rFonts w:ascii="Times New Roman" w:hAnsi="Times New Roman" w:eastAsia="Times New Roman"/>
           <w:sz w:val="24"/>
         </w:rPr>
-        <w:t>29</w:t>
+        <w:t>27</w:t>
       </w:r>
     </w:p>
     <w:p>
@@ -1562,7 +1563,7 @@
           <w:rFonts w:ascii="Times New Roman" w:hAnsi="Times New Roman" w:eastAsia="Times New Roman"/>
           <w:sz w:val="24"/>
         </w:rPr>
-        <w:t>30</w:t>
+        <w:t>28</w:t>
       </w:r>
     </w:p>
     <w:p>
@@ -1592,7 +1593,7 @@
           <w:rFonts w:ascii="Times New Roman" w:hAnsi="Times New Roman" w:eastAsia="Times New Roman"/>
           <w:sz w:val="24"/>
         </w:rPr>
-        <w:t>31</w:t>
+        <w:t>29</w:t>
       </w:r>
     </w:p>
     <w:p>
@@ -1622,7 +1623,7 @@
           <w:rFonts w:ascii="Times New Roman" w:hAnsi="Times New Roman" w:eastAsia="Times New Roman"/>
           <w:sz w:val="24"/>
         </w:rPr>
-        <w:t>34</w:t>
+        <w:t>32</w:t>
       </w:r>
     </w:p>
     <w:p>
@@ -1652,7 +1653,7 @@
           <w:rFonts w:ascii="Times New Roman" w:hAnsi="Times New Roman" w:eastAsia="Times New Roman"/>
           <w:sz w:val="24"/>
         </w:rPr>
-        <w:t>34</w:t>
+        <w:t>32</w:t>
       </w:r>
     </w:p>
     <w:p>
@@ -1682,7 +1683,7 @@
           <w:rFonts w:ascii="Times New Roman" w:hAnsi="Times New Roman" w:eastAsia="Times New Roman"/>
           <w:sz w:val="24"/>
         </w:rPr>
-        <w:t>35</w:t>
+        <w:t>32</w:t>
       </w:r>
     </w:p>
     <w:p>
@@ -1712,7 +1713,7 @@
           <w:rFonts w:ascii="Times New Roman" w:hAnsi="Times New Roman" w:eastAsia="Times New Roman"/>
           <w:sz w:val="24"/>
         </w:rPr>
-        <w:t>36</w:t>
+        <w:t>33</w:t>
       </w:r>
     </w:p>
     <w:p>
@@ -1742,7 +1743,7 @@
           <w:rFonts w:ascii="Times New Roman" w:hAnsi="Times New Roman" w:eastAsia="Times New Roman"/>
           <w:sz w:val="24"/>
         </w:rPr>
-        <w:t>37</w:t>
+        <w:t>34</w:t>
       </w:r>
     </w:p>
     <w:p>
@@ -1772,7 +1773,7 @@
           <w:rFonts w:ascii="Times New Roman" w:hAnsi="Times New Roman" w:eastAsia="Times New Roman"/>
           <w:sz w:val="24"/>
         </w:rPr>
-        <w:t>38</w:t>
+        <w:t>35</w:t>
       </w:r>
     </w:p>
     <w:p>
@@ -1802,7 +1803,7 @@
           <w:rFonts w:ascii="Times New Roman" w:hAnsi="Times New Roman" w:eastAsia="Times New Roman"/>
           <w:sz w:val="24"/>
         </w:rPr>
-        <w:t>39</w:t>
+        <w:t>36</w:t>
       </w:r>
     </w:p>
     <w:p>
@@ -1832,7 +1833,7 @@
           <w:rFonts w:ascii="Times New Roman" w:hAnsi="Times New Roman" w:eastAsia="Times New Roman"/>
           <w:sz w:val="24"/>
         </w:rPr>
-        <w:t>40</w:t>
+        <w:t>37</w:t>
       </w:r>
     </w:p>
     <w:p>
@@ -1862,7 +1863,7 @@
           <w:rFonts w:ascii="Times New Roman" w:hAnsi="Times New Roman" w:eastAsia="Times New Roman"/>
           <w:sz w:val="24"/>
         </w:rPr>
-        <w:t>41</w:t>
+        <w:t>38</w:t>
       </w:r>
     </w:p>
     <w:p>
@@ -1892,7 +1893,7 @@
           <w:rFonts w:ascii="Times New Roman" w:hAnsi="Times New Roman" w:eastAsia="Times New Roman"/>
           <w:sz w:val="24"/>
         </w:rPr>
-        <w:t>42</w:t>
+        <w:t>39</w:t>
       </w:r>
     </w:p>
     <w:p>
@@ -1922,7 +1923,7 @@
           <w:rFonts w:ascii="Times New Roman" w:hAnsi="Times New Roman" w:eastAsia="Times New Roman"/>
           <w:sz w:val="24"/>
         </w:rPr>
-        <w:t>43</w:t>
+        <w:t>40</w:t>
       </w:r>
     </w:p>
     <w:p>
@@ -1952,7 +1953,7 @@
           <w:rFonts w:ascii="Times New Roman" w:hAnsi="Times New Roman" w:eastAsia="Times New Roman"/>
           <w:sz w:val="24"/>
         </w:rPr>
-        <w:t>44</w:t>
+        <w:t>40</w:t>
       </w:r>
     </w:p>
     <w:p>
@@ -1982,7 +1983,7 @@
           <w:rFonts w:ascii="Times New Roman" w:hAnsi="Times New Roman" w:eastAsia="Times New Roman"/>
           <w:sz w:val="24"/>
         </w:rPr>
-        <w:t>45</w:t>
+        <w:t>41</w:t>
       </w:r>
     </w:p>
     <w:p>
@@ -2012,7 +2013,7 @@
           <w:rFonts w:ascii="Times New Roman" w:hAnsi="Times New Roman" w:eastAsia="Times New Roman"/>
           <w:sz w:val="24"/>
         </w:rPr>
-        <w:t>51</w:t>
+        <w:t>48</w:t>
       </w:r>
     </w:p>
     <w:p>
@@ -2042,7 +2043,7 @@
           <w:rFonts w:ascii="Times New Roman" w:hAnsi="Times New Roman" w:eastAsia="Times New Roman"/>
           <w:sz w:val="24"/>
         </w:rPr>
-        <w:t>52</w:t>
+        <w:t>49</w:t>
       </w:r>
     </w:p>
     <w:p>
@@ -2072,7 +2073,7 @@
           <w:rFonts w:ascii="Times New Roman" w:hAnsi="Times New Roman" w:eastAsia="Times New Roman"/>
           <w:sz w:val="24"/>
         </w:rPr>
-        <w:t>54</w:t>
+        <w:t>51</w:t>
       </w:r>
     </w:p>
     <w:p>
@@ -2101,6 +2102,7 @@
         <w:tblStyle w:val="TableGrid"/>
         <w:tblW w:type="auto" w:w="0"/>
         <w:jc w:val="center"/>
+        <w:tblLayout w:type="fixed"/>
         <w:tblLook w:firstColumn="1" w:firstRow="1" w:lastColumn="0" w:lastRow="0" w:noHBand="0" w:noVBand="1" w:val="04A0"/>
       </w:tblPr>
       <w:tblGrid>
@@ -2701,7 +2703,7 @@
           <w:b w:val="0"/>
           <w:sz w:val="24"/>
         </w:rPr>
-        <w:t>ADAS и мультимодальное восприятие важно рассматривать как инженерную задачу, а не как отдельный прием обработки изображения. В контуре ADAS ошибка возникает не только из-за неверного класса объекта. На результат влияет расстояние, положение относительно траектории, частичная видимость, качество геометрии и согласованность признаков разных сенсоров. Поэтому в работе выбран scenario-level уровень анализа, где дорожная сцена описывается набором признаков, а итогом является оценка критичности.</w:t>
+        <w:t>В теме «ADAS и мультимодальное восприятие» соединяются три уровня работы: данные, признаки и интерпретация результата. Для «ADAS и мультимодальное восприятие» такой порядок помогает не потерять связь между теоретическим описанием ADAS и тем, что реально проверяется в проекте.</w:t>
       </w:r>
     </w:p>
     <w:p>
@@ -2715,7 +2717,7 @@
           <w:b w:val="0"/>
           <w:sz w:val="24"/>
         </w:rPr>
-        <w:t>Первый технический фактор связан с обработкой сигналов разных сенсоров. Для обычной средней метрики такая деталь может быть почти незаметна, если основная часть тестового набора состоит из простых сцен. Для безопасности важны как раз редкие случаи, где ошибка восприятия ведет к поздней реакции. В этой работе такие случаи не маскируются общей точностью, а выделяются через отдельные признаки и через анализ false negative.</w:t>
+        <w:t>В разделе «ADAS и мультимодальное восприятие» тезис, связанный с обработкой сигналов разных сенсоров, помогает перейти от общей безопасности к измеряемому признаку. Такой переход важен: комиссия должна видеть, что утверждение подтверждается данными, а не только описанием предметной области.</w:t>
       </w:r>
     </w:p>
     <w:p>
@@ -2729,7 +2731,7 @@
           <w:b w:val="0"/>
           <w:sz w:val="24"/>
         </w:rPr>
-        <w:t>Второй фактор связан с разной физической природой камеры, LiDAR и radar. В реальной дорожной сцене сенсоры не дают одинаково надежную картину. Камера лучше передает цвет и контур, LiDAR дает геометрию, radar устойчив к части погодных факторов, но имеет меньшую детализацию. Если один источник выглядит уверенно, а другой показывает деградацию, итоговая система должна учитывать это расхождение и не сводить все к одному confidence.</w:t>
+        <w:t>Тезис, связанный с разной физической природой камеры, LiDAR и radar, добавляет к модели контекст надежности. Он показывает, какие ограничения возникают у восприятия, когда разные признаки сцены дают неполную или неодинаково устойчивую информацию.</w:t>
       </w:r>
     </w:p>
     <w:p>
@@ -2743,7 +2745,7 @@
           <w:b w:val="0"/>
           <w:sz w:val="24"/>
         </w:rPr>
-        <w:t>Третий фактор связан с неполной наблюдаемостью дорожной сцены. Для ВКР это означает, что метод должен быть проверяемым и воспроизводимым. Поэтому эксперимент построен на аннотациях KITTI, где есть реальные классы, 2D и 3D координаты, occlusion и truncation. Эти признаки не заменяют полный мультимодальный поток, но позволяют честно обучить модель риска на реальных дорожных сценах.</w:t>
+        <w:t>Тезис, связанный с неполной наблюдаемостью дорожной сцены, закрепляет экспериментальную дисциплину. Подготовка данных, обучение, выбор порога и оценка должны идти по фиксированному сценарию, иначе сравнение моделей теряет смысл.</w:t>
       </w:r>
     </w:p>
     <w:p>
@@ -2757,7 +2759,7 @@
           <w:b w:val="0"/>
           <w:sz w:val="24"/>
         </w:rPr>
-        <w:t>Практическая часть сохраняет связь с реальным pipeline, но фокусируется на проверяемой оценке критичности. Такой выбор ограничивает масштаб эксперимента, но делает результат проверяемым. Любой проверяющий может повторить подготовку данных, обучение, подбор порога и расчет метрик. Для исследовательского прототипа это важнее, чем заявлять качество тяжелой модели, которую нельзя воспроизвести на доступных ресурсах.</w:t>
+        <w:t>В практической части материал о «ADAS и мультимодальное восприятие» используется как критерий инженерной состоятельности решения. Эксперимент по признаку разной физической природой камеры, LiDAR и radar должен показать не только итоговую метрику, но и причину, по которой отдельные сцены получают высокий или низкий риск.</w:t>
       </w:r>
     </w:p>
     <w:p>
@@ -2771,7 +2773,35 @@
           <w:b w:val="0"/>
           <w:sz w:val="24"/>
         </w:rPr>
-        <w:t>Вывод для данного раздела состоит в том, что надежность ADAS должна оцениваться не только по точности детекции. Этот вывод используется дальше при построении признаков reliability, uncertainty и risk score, а также при выборе метрик. В работе приоритет отдан recall и FNR, потому что пропуск критической сцены опаснее ложной тревоги, хотя большое число false positive также снижает доверие к системе.</w:t>
+        <w:t>Практический смысл темы «ADAS и мультимодальное восприятие» проявляется в том, что по ней можно задать проверочный вопрос и найти ответ в артефактах. В данных отражается фактор, связанный с обработкой сигналов разных сенсоров, в модели учитывается аспект, связанный с разной физической природой камеры, LiDAR и radar, а в процедуре оценки закрепляется условие, связанное с неполной наблюдаемостью дорожной сцены.</w:t>
+      </w:r>
+    </w:p>
+    <w:p>
+      <w:pPr>
+        <w:spacing w:line="360" w:lineRule="auto" w:after="0"/>
+        <w:ind w:firstLine="709"/>
+      </w:pPr>
+      <w:r>
+        <w:rPr>
+          <w:rFonts w:ascii="Times New Roman" w:hAnsi="Times New Roman" w:eastAsia="Times New Roman"/>
+          <w:b w:val="0"/>
+          <w:sz w:val="24"/>
+        </w:rPr>
+        <w:t>В экспериментальной части темы «ADAS и мультимодальное восприятие» выбранное решение сохраняет связь с реальным pipeline, но фокусируется на проверяемой оценке критичности. Проверка строится так, чтобы путь от исходных аннотаций до метрик не зависел от скрытых ручных шагов.</w:t>
+      </w:r>
+    </w:p>
+    <w:p>
+      <w:pPr>
+        <w:spacing w:line="360" w:lineRule="auto" w:after="0"/>
+        <w:ind w:firstLine="709"/>
+      </w:pPr>
+      <w:r>
+        <w:rPr>
+          <w:rFonts w:ascii="Times New Roman" w:hAnsi="Times New Roman" w:eastAsia="Times New Roman"/>
+          <w:b w:val="0"/>
+          <w:sz w:val="24"/>
+        </w:rPr>
+        <w:t>Для проектной части это означает, что надежность ADAS должна оцениваться не только по точности детекции. Поэтому в эксперименте важны не только итоговые числа, но и возможность объяснить, почему модель ошиблась в отдельных сценах.</w:t>
       </w:r>
     </w:p>
     <w:p>
@@ -2797,7 +2827,7 @@
           <w:b w:val="0"/>
           <w:sz w:val="24"/>
         </w:rPr>
-        <w:t>Редкие критические сценарии важно рассматривать как инженерную задачу, а не как отдельный прием обработки изображения. В контуре ADAS ошибка возникает не только из-за неверного класса объекта. На результат влияет расстояние, положение относительно траектории, частичная видимость, качество геометрии и согласованность признаков разных сенсоров. Поэтому в работе выбран scenario-level уровень анализа, где дорожная сцена описывается набором признаков, а итогом является оценка критичности.</w:t>
+        <w:t>Раздел «Редкие критические сценарии» вводит практическую рамку для дальнейшего эксперимента. При проверке темы «Редкие критические сценарии» модель должна обучаться на реальных аннотациях, а пороги и метрики должны проверяться на отложенной выборке без ручной подгонки.</w:t>
       </w:r>
     </w:p>
     <w:p>
@@ -2811,7 +2841,7 @@
           <w:b w:val="0"/>
           <w:sz w:val="24"/>
         </w:rPr>
-        <w:t>Первый технический фактор связан с малой частотой опасных событий. Для обычной средней метрики такая деталь может быть почти незаметна, если основная часть тестового набора состоит из простых сцен. Для безопасности важны как раз редкие случаи, где ошибка восприятия ведет к поздней реакции. В этой работе такие случаи не маскируются общей точностью, а выделяются через отдельные признаки и через анализ false negative.</w:t>
+        <w:t>Для темы «Редкие критические сценарии» характеристика, связанная с малой частотой опасных событий, выступает как проверяемый признак риска. Если ее игнорировать, часть сложных сцен будет выглядеть обычной, хотя для ADAS она требует отдельного внимания.</w:t>
       </w:r>
     </w:p>
     <w:p>
@@ -2825,7 +2855,7 @@
           <w:b w:val="0"/>
           <w:sz w:val="24"/>
         </w:rPr>
-        <w:t>Второй фактор связан с несбалансированностью наборов данных. В реальной дорожной сцене сенсоры не дают одинаково надежную картину. Камера лучше передает цвет и контур, LiDAR дает геометрию, radar устойчив к части погодных факторов, но имеет меньшую детализацию. Если один источник выглядит уверенно, а другой показывает деградацию, итоговая система должна учитывать это расхождение и не сводить все к одному confidence.</w:t>
+        <w:t>Характеристика, связанная с несбалансированностью наборов данных, уточняет качество сенсорной информации. В работе она нужна не для усложнения текста, а для объяснения, почему модель иногда должна снижать доверие к результату.</w:t>
       </w:r>
     </w:p>
     <w:p>
@@ -2839,7 +2869,7 @@
           <w:b w:val="0"/>
           <w:sz w:val="24"/>
         </w:rPr>
-        <w:t>Третий фактор связан с дорогой ошибки false negative. Для ВКР это означает, что метод должен быть проверяемым и воспроизводимым. Поэтому эксперимент построен на аннотациях KITTI, где есть реальные классы, 2D и 3D координаты, occlusion и truncation. Эти признаки не заменяют полный мультимодальный поток, но позволяют честно обучить модель риска на реальных дорожных сценах.</w:t>
+        <w:t>Характеристика, связанная с дорогой ошибки false negative, связывает методику с воспроизводимостью. Она задает условие, при котором эксперимент можно повторить без скрытых ручных решений и без подгонки test split.</w:t>
       </w:r>
     </w:p>
     <w:p>
@@ -2853,7 +2883,7 @@
           <w:b w:val="0"/>
           <w:sz w:val="24"/>
         </w:rPr>
-        <w:t>Практическая часть переводит понятие corner case в набор признаков, которые можно рассчитать из аннотаций. Такой выбор ограничивает масштаб эксперимента, но делает результат проверяемым. Любой проверяющий может повторить подготовку данных, обучение, подбор порога и расчет метрик. Для исследовательского прототипа это важнее, чем заявлять качество тяжелой модели, которую нельзя воспроизвести на доступных ресурсах.</w:t>
+        <w:t>Для логики раздела «Редкие критические сценарии» этот фрагмент важен как переход от обзора к проверяемому эксперименту. Признак, связанный с малой частотой опасных событий, должен быть вычислен из реальной разметки, попасть в таблицу сценариев и повлиять на решение модели.</w:t>
       </w:r>
     </w:p>
     <w:p>
@@ -2867,7 +2897,35 @@
           <w:b w:val="0"/>
           <w:sz w:val="24"/>
         </w:rPr>
-        <w:t>Вывод для данного раздела состоит в том, что corner cases требуют отдельной классификации и учета в метриках. Этот вывод используется дальше при построении признаков reliability, uncertainty и risk score, а также при выборе метрик. В работе приоритет отдан recall и FNR, потому что пропуск критической сцены опаснее ложной тревоги, хотя большое число false positive также снижает доверие к системе.</w:t>
+        <w:t>Для текста ВКР раздел «Редкие критические сценарии» выполняет роль связки между обзором и реализацией. Он объясняет, почему фактор, связанный с малой частотой опасных событий, не является второстепенной деталью, зачем учитывается аспект, связанный с несбалансированностью наборов данных, и каким образом условие, связанное с дорогой ошибки false negative, попадает в проверяемую часть работы.</w:t>
+      </w:r>
+    </w:p>
+    <w:p>
+      <w:pPr>
+        <w:spacing w:line="360" w:lineRule="auto" w:after="0"/>
+        <w:ind w:firstLine="709"/>
+      </w:pPr>
+      <w:r>
+        <w:rPr>
+          <w:rFonts w:ascii="Times New Roman" w:hAnsi="Times New Roman" w:eastAsia="Times New Roman"/>
+          <w:b w:val="0"/>
+          <w:sz w:val="24"/>
+        </w:rPr>
+        <w:t>На уровне прототипа для раздела «Редкие критические сценарии» выбранное решение переводит понятие corner case в набор признаков, которые можно рассчитать из аннотаций. Оно сохраняет связь с реальной задачей ADAS и одновременно не подменяет промышленную валидацию исследовательским экспериментом.</w:t>
+      </w:r>
+    </w:p>
+    <w:p>
+      <w:pPr>
+        <w:spacing w:line="360" w:lineRule="auto" w:after="0"/>
+        <w:ind w:firstLine="709"/>
+      </w:pPr>
+      <w:r>
+        <w:rPr>
+          <w:rFonts w:ascii="Times New Roman" w:hAnsi="Times New Roman" w:eastAsia="Times New Roman"/>
+          <w:b w:val="0"/>
+          <w:sz w:val="24"/>
+        </w:rPr>
+        <w:t>Практический вывод раздела состоит в том, что corner cases требуют отдельной классификации и учета в метриках. Дальше это проверяется через признаки, сохраненные метрики и разбор конкретных FP/FN случаев.</w:t>
       </w:r>
     </w:p>
     <w:p>
@@ -2893,7 +2951,7 @@
           <w:b w:val="0"/>
           <w:sz w:val="24"/>
         </w:rPr>
-        <w:t>Деградация сенсоров важно рассматривать как инженерную задачу, а не как отдельный прием обработки изображения. В контуре ADAS ошибка возникает не только из-за неверного класса объекта. На результат влияет расстояние, положение относительно траектории, частичная видимость, качество геометрии и согласованность признаков разных сенсоров. Поэтому в работе выбран scenario-level уровень анализа, где дорожная сцена описывается набором признаков, а итогом является оценка критичности.</w:t>
+        <w:t>Раздел «Деградация сенсоров» вводит практическую рамку для дальнейшего эксперимента. При проверке темы «Деградация сенсоров» модель должна обучаться на реальных аннотациях, а пороги и метрики должны проверяться на отложенной выборке без ручной подгонки.</w:t>
       </w:r>
     </w:p>
     <w:p>
@@ -2907,7 +2965,7 @@
           <w:b w:val="0"/>
           <w:sz w:val="24"/>
         </w:rPr>
-        <w:t>Первый технический фактор связан с снижением видимости и частичной потерей контраста. Для обычной средней метрики такая деталь может быть почти незаметна, если основная часть тестового набора состоит из простых сцен. Для безопасности важны как раз редкие случаи, где ошибка восприятия ведет к поздней реакции. В этой работе такие случаи не маскируются общей точностью, а выделяются через отдельные признаки и через анализ false negative.</w:t>
+        <w:t>Для темы «Деградация сенсоров» характеристика, связанная с снижением видимости и частичной потерей контраста, выступает как проверяемый признак риска. Если ее игнорировать, часть сложных сцен будет выглядеть обычной, хотя для ADAS она требует отдельного внимания.</w:t>
       </w:r>
     </w:p>
     <w:p>
@@ -2921,7 +2979,7 @@
           <w:b w:val="0"/>
           <w:sz w:val="24"/>
         </w:rPr>
-        <w:t>Второй фактор связан с окклюзией объектов и усечением bounding box. В реальной дорожной сцене сенсоры не дают одинаково надежную картину. Камера лучше передает цвет и контур, LiDAR дает геометрию, radar устойчив к части погодных факторов, но имеет меньшую детализацию. Если один источник выглядит уверенно, а другой показывает деградацию, итоговая система должна учитывать это расхождение и не сводить все к одному confidence.</w:t>
+        <w:t>Характеристика, связанная с окклюзией объектов и усечением bounding box, уточняет качество сенсорной информации. В работе она нужна не для усложнения текста, а для объяснения, почему модель иногда должна снижать доверие к результату.</w:t>
       </w:r>
     </w:p>
     <w:p>
@@ -2935,7 +2993,7 @@
           <w:b w:val="0"/>
           <w:sz w:val="24"/>
         </w:rPr>
-        <w:t>Третий фактор связан с разным поведением сенсоров при плохой погоде. Для ВКР это означает, что метод должен быть проверяемым и воспроизводимым. Поэтому эксперимент построен на аннотациях KITTI, где есть реальные классы, 2D и 3D координаты, occlusion и truncation. Эти признаки не заменяют полный мультимодальный поток, но позволяют честно обучить модель риска на реальных дорожных сценах.</w:t>
+        <w:t>Характеристика, связанная с разным поведением сенсоров при плохой погоде, связывает методику с воспроизводимостью. Она задает условие, при котором эксперимент можно повторить без скрытых ручных решений и без подгонки test split.</w:t>
       </w:r>
     </w:p>
     <w:p>
@@ -2949,7 +3007,7 @@
           <w:b w:val="0"/>
           <w:sz w:val="24"/>
         </w:rPr>
-        <w:t>Практическая часть использует occlusion и truncation KITTI как реальные proxy-признаки деградации наблюдения. Такой выбор ограничивает масштаб эксперимента, но делает результат проверяемым. Любой проверяющий может повторить подготовку данных, обучение, подбор порога и расчет метрик. Для исследовательского прототипа это важнее, чем заявлять качество тяжелой модели, которую нельзя воспроизвести на доступных ресурсах.</w:t>
+        <w:t>Для логики раздела «Деградация сенсоров» этот фрагмент важен как переход от обзора к проверяемому эксперименту. Признак, связанный с снижением видимости и частичной потерей контраста, должен быть вычислен из реальной разметки, попасть в таблицу сценариев и повлиять на решение модели.</w:t>
       </w:r>
     </w:p>
     <w:p>
@@ -2963,7 +3021,35 @@
           <w:b w:val="0"/>
           <w:sz w:val="24"/>
         </w:rPr>
-        <w:t>Вывод для данного раздела состоит в том, что модель риска должна учитывать качество наблюдения. Этот вывод используется дальше при построении признаков reliability, uncertainty и risk score, а также при выборе метрик. В работе приоритет отдан recall и FNR, потому что пропуск критической сцены опаснее ложной тревоги, хотя большое число false positive также снижает доверие к системе.</w:t>
+        <w:t>Для текста ВКР раздел «Деградация сенсоров» выполняет роль связки между обзором и реализацией. Он объясняет, почему фактор, связанный с снижением видимости и частичной потерей контраста, не является второстепенной деталью, зачем учитывается аспект, связанный с окклюзией объектов и усечением bounding box, и каким образом условие, связанное с разным поведением сенсоров при плохой погоде, попадает в проверяемую часть работы.</w:t>
+      </w:r>
+    </w:p>
+    <w:p>
+      <w:pPr>
+        <w:spacing w:line="360" w:lineRule="auto" w:after="0"/>
+        <w:ind w:firstLine="709"/>
+      </w:pPr>
+      <w:r>
+        <w:rPr>
+          <w:rFonts w:ascii="Times New Roman" w:hAnsi="Times New Roman" w:eastAsia="Times New Roman"/>
+          <w:b w:val="0"/>
+          <w:sz w:val="24"/>
+        </w:rPr>
+        <w:t>На уровне прототипа для раздела «Деградация сенсоров» выбранное решение использует occlusion и truncation KITTI как реальные proxy-признаки деградации наблюдения. Оно сохраняет связь с реальной задачей ADAS и одновременно не подменяет промышленную валидацию исследовательским экспериментом.</w:t>
+      </w:r>
+    </w:p>
+    <w:p>
+      <w:pPr>
+        <w:spacing w:line="360" w:lineRule="auto" w:after="0"/>
+        <w:ind w:firstLine="709"/>
+      </w:pPr>
+      <w:r>
+        <w:rPr>
+          <w:rFonts w:ascii="Times New Roman" w:hAnsi="Times New Roman" w:eastAsia="Times New Roman"/>
+          <w:b w:val="0"/>
+          <w:sz w:val="24"/>
+        </w:rPr>
+        <w:t>Практический вывод раздела состоит в том, что модель риска должна учитывать качество наблюдения. Дальше это проверяется через признаки, сохраненные метрики и разбор конкретных FP/FN случаев.</w:t>
       </w:r>
     </w:p>
     <w:p>
@@ -2989,7 +3075,7 @@
           <w:b w:val="0"/>
           <w:sz w:val="24"/>
         </w:rPr>
-        <w:t>Средние метрики качества важно рассматривать как инженерную задачу, а не как отдельный прием обработки изображения. В контуре ADAS ошибка возникает не только из-за неверного класса объекта. На результат влияет расстояние, положение относительно траектории, частичная видимость, качество геометрии и согласованность признаков разных сенсоров. Поэтому в работе выбран scenario-level уровень анализа, где дорожная сцена описывается набором признаков, а итогом является оценка критичности.</w:t>
+        <w:t>Для темы «Средние метрики качества» важно отделить исследовательский прототип от промышленной ADAS-системы. В рамках «Средние метрики качества» ВКР показывает воспроизводимый способ оценки критичности, но не заявляет сертифицированную безопасность автомобиля.</w:t>
       </w:r>
     </w:p>
     <w:p>
@@ -3003,7 +3089,7 @@
           <w:b w:val="0"/>
           <w:sz w:val="24"/>
         </w:rPr>
-        <w:t>Первый технический фактор связан с усреднением простых и сложных сцен. Для обычной средней метрики такая деталь может быть почти незаметна, если основная часть тестового набора состоит из простых сцен. Для безопасности важны как раз редкие случаи, где ошибка восприятия ведет к поздней реакции. В этой работе такие случаи не маскируются общей точностью, а выделяются через отдельные признаки и через анализ false negative.</w:t>
+        <w:t>При анализе темы «Средние метрики качества» содержательным ориентиром становится фактор, связанный с усреднением простых и сложных сцен. Этот ориентир нужен, чтобы оценивать не только факт обнаружения объекта, но и последствия возможного пропуска.</w:t>
       </w:r>
     </w:p>
     <w:p>
@@ -3017,7 +3103,7 @@
           <w:b w:val="0"/>
           <w:sz w:val="24"/>
         </w:rPr>
-        <w:t>Второй фактор связан с малой долей критических примеров. В реальной дорожной сцене сенсоры не дают одинаково надежную картину. Камера лучше передает цвет и контур, LiDAR дает геометрию, radar устойчив к части погодных факторов, но имеет меньшую детализацию. Если один источник выглядит уверенно, а другой показывает деградацию, итоговая система должна учитывать это расхождение и не сводить все к одному confidence.</w:t>
+        <w:t>Следующий ориентир связан с малой долей критических примеров. Он связывает качество наблюдения с поведением модели и помогает отличать уверенное решение от ситуации, где требуется осторожный режим.</w:t>
       </w:r>
     </w:p>
     <w:p>
@@ -3031,7 +3117,7 @@
           <w:b w:val="0"/>
           <w:sz w:val="24"/>
         </w:rPr>
-        <w:t>Третий фактор связан с разной ценой ошибок FP и FN. Для ВКР это означает, что метод должен быть проверяемым и воспроизводимым. Поэтому эксперимент построен на аннотациях KITTI, где есть реальные классы, 2D и 3D координаты, occlusion и truncation. Эти признаки не заменяют полный мультимодальный поток, но позволяют честно обучить модель риска на реальных дорожных сценах.</w:t>
+        <w:t>Еще один ориентир связан с разной ценой ошибок FP и FN. Он не расширяет эксперимент искусственно, а фиксирует условия, при которых результат можно повторить и проверить на тех же данных.</w:t>
       </w:r>
     </w:p>
     <w:p>
@@ -3045,7 +3131,7 @@
           <w:b w:val="0"/>
           <w:sz w:val="24"/>
         </w:rPr>
-        <w:t>Практическая часть сохраняет accuracy, но выводит recall, FNR и error cases в отдельные результаты. Такой выбор ограничивает масштаб эксперимента, но делает результат проверяемым. Любой проверяющий может повторить подготовку данных, обучение, подбор порога и расчет метрик. Для исследовательского прототипа это важнее, чем заявлять качество тяжелой модели, которую нельзя воспроизвести на доступных ресурсах.</w:t>
+        <w:t>В результате раздел «Средние метрики качества» выполняет не только обзорную, но и контрольную функцию. Он показывает, как предпосылка о разной ценой ошибок FP и FN будет проверена программно и какие ограничения остаются в текущей версии.</w:t>
       </w:r>
     </w:p>
     <w:p>
@@ -3059,7 +3145,35 @@
           <w:b w:val="0"/>
           <w:sz w:val="24"/>
         </w:rPr>
-        <w:t>Вывод для данного раздела состоит в том, что для ADAS нужна отдельная оценка критических сценариев. Этот вывод используется дальше при построении признаков reliability, uncertainty и risk score, а также при выборе метрик. В работе приоритет отдан recall и FNR, потому что пропуск критической сцены опаснее ложной тревоги, хотя большое число false positive также снижает доверие к системе.</w:t>
+        <w:t>Внутренняя логика темы «Средние метрики качества» не требует громких утверждений. Достаточно показать, что фактор, связанный с усреднением простых и сложных сцен, влияет на риск, аспект, связанный с малой долей критических примеров, меняет доверие к сцене, а условие, связанное с разной ценой ошибок FP и FN, позволяет повторить эксперимент и проверить вывод «для ADAS нужна отдельная оценка критических сценариев».</w:t>
+      </w:r>
+    </w:p>
+    <w:p>
+      <w:pPr>
+        <w:spacing w:line="360" w:lineRule="auto" w:after="0"/>
+        <w:ind w:firstLine="709"/>
+      </w:pPr>
+      <w:r>
+        <w:rPr>
+          <w:rFonts w:ascii="Times New Roman" w:hAnsi="Times New Roman" w:eastAsia="Times New Roman"/>
+          <w:b w:val="0"/>
+          <w:sz w:val="24"/>
+        </w:rPr>
+        <w:t>В реализации темы «Средние метрики качества» выбранное решение сохраняет accuracy, но выводит recall, FNR и error cases в отдельные результаты. Благодаря этому положения раздела можно проследить в данных, коде, сохраненных моделях, графиках и таблицах результатов.</w:t>
+      </w:r>
+    </w:p>
+    <w:p>
+      <w:pPr>
+        <w:spacing w:line="360" w:lineRule="auto" w:after="0"/>
+        <w:ind w:firstLine="709"/>
+      </w:pPr>
+      <w:r>
+        <w:rPr>
+          <w:rFonts w:ascii="Times New Roman" w:hAnsi="Times New Roman" w:eastAsia="Times New Roman"/>
+          <w:b w:val="0"/>
+          <w:sz w:val="24"/>
+        </w:rPr>
+        <w:t>Итог раздела можно сформулировать так: для ADAS нужна отдельная оценка критических сценариев. На этой основе далее строится экспериментальная часть, где качество оценивается не только общей accuracy, но и способностью модели не пропускать критические сцены.</w:t>
       </w:r>
     </w:p>
     <w:p>
@@ -3085,7 +3199,7 @@
           <w:b w:val="0"/>
           <w:sz w:val="24"/>
         </w:rPr>
-        <w:t>Оценка неопределенности важно рассматривать как инженерную задачу, а не как отдельный прием обработки изображения. В контуре ADAS ошибка возникает не только из-за неверного класса объекта. На результат влияет расстояние, положение относительно траектории, частичная видимость, качество геометрии и согласованность признаков разных сенсоров. Поэтому в работе выбран scenario-level уровень анализа, где дорожная сцена описывается набором признаков, а итогом является оценка критичности.</w:t>
+        <w:t>В разделе «Оценка неопределенности» акцент сделан на инженерной проверяемости. Для «Оценка неопределенности» это особенно важно: если признак нельзя получить из разметки или воспроизвести в коде, он остается только общим требованием и не помогает доказать результат ВКР.</w:t>
       </w:r>
     </w:p>
     <w:p>
@@ -3099,7 +3213,7 @@
           <w:b w:val="0"/>
           <w:sz w:val="24"/>
         </w:rPr>
-        <w:t>Первый технический фактор связан с выходом сцены за привычное распределение. Для обычной средней метрики такая деталь может быть почти незаметна, если основная часть тестового набора состоит из простых сцен. Для безопасности важны как раз редкие случаи, где ошибка восприятия ведет к поздней реакции. В этой работе такие случаи не маскируются общей точностью, а выделяются через отдельные признаки и через анализ false negative.</w:t>
+        <w:t>С точки зрения данных особенно важна связь с выходом сцены за привычное распределение. Этот пункт определяет, какие строки scenario table будут считаться информативными для обучения и где может возникнуть риск пропуска критической сцены.</w:t>
       </w:r>
     </w:p>
     <w:p>
@@ -3113,7 +3227,7 @@
           <w:b w:val="0"/>
           <w:sz w:val="24"/>
         </w:rPr>
-        <w:t>Второй фактор связан с конфликтом признаков и деградацией наблюдения. В реальной дорожной сцене сенсоры не дают одинаково надежную картину. Камера лучше передает цвет и контур, LiDAR дает геометрию, radar устойчив к части погодных факторов, но имеет меньшую детализацию. Если один источник выглядит уверенно, а другой показывает деградацию, итоговая система должна учитывать это расхождение и не сводить все к одному confidence.</w:t>
+        <w:t>С точки зрения модели существенна связь с конфликтом признаков и деградацией наблюдения. Если такой признак ухудшается, итоговая оценка должна становиться осторожнее, иначе высокая средняя точность будет скрывать слабые места метода.</w:t>
       </w:r>
     </w:p>
     <w:p>
@@ -3127,7 +3241,7 @@
           <w:b w:val="0"/>
           <w:sz w:val="24"/>
         </w:rPr>
-        <w:t>Третий фактор связан с недостатком прямой уверенности модели. Для ВКР это означает, что метод должен быть проверяемым и воспроизводимым. Поэтому эксперимент построен на аннотациях KITTI, где есть реальные классы, 2D и 3D координаты, occlusion и truncation. Эти признаки не заменяют полный мультимодальный поток, но позволяют честно обучить модель риска на реальных дорожных сценах.</w:t>
+        <w:t>С точки зрения проверки значимым остается недостатком прямой уверенности модели. Он позволяет связать текст раздела с конкретными файлами, метриками и шагами запуска, а не оставлять выводы на уровне общих рассуждений.</w:t>
       </w:r>
     </w:p>
     <w:p>
@@ -3141,7 +3255,7 @@
           <w:b w:val="0"/>
           <w:sz w:val="24"/>
         </w:rPr>
-        <w:t>Практическая часть использует proxy uncertainty из качества камеры, 3D-геометрии, occlusion и truncation. Такой выбор ограничивает масштаб эксперимента, но делает результат проверяемым. Любой проверяющий может повторить подготовку данных, обучение, подбор порога и расчет метрик. Для исследовательского прототипа это важнее, чем заявлять качество тяжелой модели, которую нельзя воспроизвести на доступных ресурсах.</w:t>
+        <w:t>Раздел «Оценка неопределенности» также задает осторожность в формулировках. Методика работает на доступных реальных аннотациях, а утверждение о выходом сцены за привычное распределение не выдается за промышленную сертификацию системы.</w:t>
       </w:r>
     </w:p>
     <w:p>
@@ -3155,7 +3269,35 @@
           <w:b w:val="0"/>
           <w:sz w:val="24"/>
         </w:rPr>
-        <w:t>Вывод для данного раздела состоит в том, что uncertainty помогает объяснить осторожный режим. Этот вывод используется дальше при построении признаков reliability, uncertainty и risk score, а также при выборе метрик. В работе приоритет отдан recall и FNR, потому что пропуск критической сцены опаснее ложной тревоги, хотя большое число false positive также снижает доверие к системе.</w:t>
+        <w:t>Проверяющему по разделу «Оценка неопределенности» важно увидеть, что модель действительно обучалась на реальных данных. Поэтому фактор, связанный с выходом сцены за привычное распределение, рассматривается как измеримый источник риска, аспект, связанный с конфликтом признаков и деградацией наблюдения, — как причина возможной ненадежности, а условие, связанное с недостатком прямой уверенности модели, — как основа повторяемой оценки.</w:t>
+      </w:r>
+    </w:p>
+    <w:p>
+      <w:pPr>
+        <w:spacing w:line="360" w:lineRule="auto" w:after="0"/>
+        <w:ind w:firstLine="709"/>
+      </w:pPr>
+      <w:r>
+        <w:rPr>
+          <w:rFonts w:ascii="Times New Roman" w:hAnsi="Times New Roman" w:eastAsia="Times New Roman"/>
+          <w:b w:val="0"/>
+          <w:sz w:val="24"/>
+        </w:rPr>
+        <w:t>В экспериментальном контуре тема «Оценка неопределенности» реализована через решение, которое использует proxy uncertainty из качества камеры, 3D-геометрии, occlusion и truncation. Такой контур удобен для защиты: по нему можно пройти от исходных данных до метрик и ошибок.</w:t>
+      </w:r>
+    </w:p>
+    <w:p>
+      <w:pPr>
+        <w:spacing w:line="360" w:lineRule="auto" w:after="0"/>
+        <w:ind w:firstLine="709"/>
+      </w:pPr>
+      <w:r>
+        <w:rPr>
+          <w:rFonts w:ascii="Times New Roman" w:hAnsi="Times New Roman" w:eastAsia="Times New Roman"/>
+          <w:b w:val="0"/>
+          <w:sz w:val="24"/>
+        </w:rPr>
+        <w:t>Таким образом, uncertainty помогает объяснить осторожный режим. Этот вывод задает логику следующего шага: перейти от описания проблемы к признакам, модели и проверке на test split. В работе сохраняется баланс между полнотой объяснения и честным указанием ограничений данных.</w:t>
       </w:r>
     </w:p>
     <w:p>
@@ -3181,7 +3323,7 @@
           <w:b w:val="0"/>
           <w:sz w:val="24"/>
         </w:rPr>
-        <w:t>Sensor fusion важно рассматривать как инженерную задачу, а не как отдельный прием обработки изображения. В контуре ADAS ошибка возникает не только из-за неверного класса объекта. На результат влияет расстояние, положение относительно траектории, частичная видимость, качество геометрии и согласованность признаков разных сенсоров. Поэтому в работе выбран scenario-level уровень анализа, где дорожная сцена описывается набором признаков, а итогом является оценка критичности.</w:t>
+        <w:t>Для темы «Sensor fusion» важно отделить исследовательский прототип от промышленной ADAS-системы. В рамках «Sensor fusion» ВКР показывает воспроизводимый способ оценки критичности, но не заявляет сертифицированную безопасность автомобиля.</w:t>
       </w:r>
     </w:p>
     <w:p>
@@ -3195,7 +3337,7 @@
           <w:b w:val="0"/>
           <w:sz w:val="24"/>
         </w:rPr>
-        <w:t>Первый технический фактор связан с ранним объединением данных. Для обычной средней метрики такая деталь может быть почти незаметна, если основная часть тестового набора состоит из простых сцен. Для безопасности важны как раз редкие случаи, где ошибка восприятия ведет к поздней реакции. В этой работе такие случаи не маскируются общей точностью, а выделяются через отдельные признаки и через анализ false negative.</w:t>
+        <w:t>При анализе темы «Sensor fusion» содержательным ориентиром становится фактор, связанный с ранним объединением данных. Этот ориентир нужен, чтобы оценивать не только факт обнаружения объекта, но и последствия возможного пропуска.</w:t>
       </w:r>
     </w:p>
     <w:p>
@@ -3209,7 +3351,7 @@
           <w:b w:val="0"/>
           <w:sz w:val="24"/>
         </w:rPr>
-        <w:t>Второй фактор связан с поздним объединением решений. В реальной дорожной сцене сенсоры не дают одинаково надежную картину. Камера лучше передает цвет и контур, LiDAR дает геометрию, radar устойчив к части погодных факторов, но имеет меньшую детализацию. Если один источник выглядит уверенно, а другой показывает деградацию, итоговая система должна учитывать это расхождение и не сводить все к одному confidence.</w:t>
+        <w:t>Следующий ориентир связан с поздним объединением решений. Он связывает качество наблюдения с поведением модели и помогает отличать уверенное решение от ситуации, где требуется осторожный режим.</w:t>
       </w:r>
     </w:p>
     <w:p>
@@ -3223,7 +3365,7 @@
           <w:b w:val="0"/>
           <w:sz w:val="24"/>
         </w:rPr>
-        <w:t>Третий фактор связан с промежуточным объединением признаков. Для ВКР это означает, что метод должен быть проверяемым и воспроизводимым. Поэтому эксперимент построен на аннотациях KITTI, где есть реальные классы, 2D и 3D координаты, occlusion и truncation. Эти признаки не заменяют полный мультимодальный поток, но позволяют честно обучить модель риска на реальных дорожных сценах.</w:t>
+        <w:t>Еще один ориентир связан с промежуточным объединением признаков. Он не расширяет эксперимент искусственно, а фиксирует условия, при которых результат можно повторить и проверить на тех же данных.</w:t>
       </w:r>
     </w:p>
     <w:p>
@@ -3237,7 +3379,7 @@
           <w:b w:val="0"/>
           <w:sz w:val="24"/>
         </w:rPr>
-        <w:t>Практическая часть реализует scenario-level fusion признаков, а JSON demo показывает идею объединения camera, LiDAR и radar confidence. Такой выбор ограничивает масштаб эксперимента, но делает результат проверяемым. Любой проверяющий может повторить подготовку данных, обучение, подбор порога и расчет метрик. Для исследовательского прототипа это важнее, чем заявлять качество тяжелой модели, которую нельзя воспроизвести на доступных ресурсах.</w:t>
+        <w:t>В результате раздел «Sensor fusion» выполняет не только обзорную, но и контрольную функцию. Он показывает, как предпосылка о промежуточным объединением признаков будет проверена программно и какие ограничения остаются в текущей версии.</w:t>
       </w:r>
     </w:p>
     <w:p>
@@ -3251,7 +3393,35 @@
           <w:b w:val="0"/>
           <w:sz w:val="24"/>
         </w:rPr>
-        <w:t>Вывод для данного раздела состоит в том, что выбор уровня fusion зависит от данных и вычислительных ресурсов. Этот вывод используется дальше при построении признаков reliability, uncertainty и risk score, а также при выборе метрик. В работе приоритет отдан recall и FNR, потому что пропуск критической сцены опаснее ложной тревоги, хотя большое число false positive также снижает доверие к системе.</w:t>
+        <w:t>Внутренняя логика темы «Sensor fusion» не требует громких утверждений. Достаточно показать, что фактор, связанный с ранним объединением данных, влияет на риск, аспект, связанный с поздним объединением решений, меняет доверие к сцене, а условие, связанное с промежуточным объединением признаков, позволяет повторить эксперимент и проверить вывод «выбор уровня fusion зависит от данных и вычислительных ресурсов».</w:t>
+      </w:r>
+    </w:p>
+    <w:p>
+      <w:pPr>
+        <w:spacing w:line="360" w:lineRule="auto" w:after="0"/>
+        <w:ind w:firstLine="709"/>
+      </w:pPr>
+      <w:r>
+        <w:rPr>
+          <w:rFonts w:ascii="Times New Roman" w:hAnsi="Times New Roman" w:eastAsia="Times New Roman"/>
+          <w:b w:val="0"/>
+          <w:sz w:val="24"/>
+        </w:rPr>
+        <w:t>В реализации темы «Sensor fusion» выбранное решение реализует scenario-level fusion признаков, а JSON demo показывает идею объединения camera, LiDAR и radar confidence. Благодаря этому положения раздела можно проследить в данных, коде, сохраненных моделях, графиках и таблицах результатов.</w:t>
+      </w:r>
+    </w:p>
+    <w:p>
+      <w:pPr>
+        <w:spacing w:line="360" w:lineRule="auto" w:after="0"/>
+        <w:ind w:firstLine="709"/>
+      </w:pPr>
+      <w:r>
+        <w:rPr>
+          <w:rFonts w:ascii="Times New Roman" w:hAnsi="Times New Roman" w:eastAsia="Times New Roman"/>
+          <w:b w:val="0"/>
+          <w:sz w:val="24"/>
+        </w:rPr>
+        <w:t>Итог раздела можно сформулировать так: выбор уровня fusion зависит от данных и вычислительных ресурсов. На этой основе далее строится экспериментальная часть, где качество оценивается не только общей accuracy, но и способностью модели не пропускать критические сцены.</w:t>
       </w:r>
     </w:p>
     <w:p>
@@ -3277,7 +3447,7 @@
           <w:b w:val="0"/>
           <w:sz w:val="24"/>
         </w:rPr>
-        <w:t>Датасеты и симуляторы важно рассматривать как инженерную задачу, а не как отдельный прием обработки изображения. В контуре ADAS ошибка возникает не только из-за неверного класса объекта. На результат влияет расстояние, положение относительно траектории, частичная видимость, качество геометрии и согласованность признаков разных сенсоров. Поэтому в работе выбран scenario-level уровень анализа, где дорожная сцена описывается набором признаков, а итогом является оценка критичности.</w:t>
+        <w:t>Раздел «Датасеты и симуляторы» уточняет, какую часть задачи ADAS нужно контролировать при работе со сложной дорожной сценой. Для этой темы важна не только правильная метка класса, но и устойчивость решения при близком объекте, частичной видимости и неоднозначной геометрии.</w:t>
       </w:r>
     </w:p>
     <w:p>
@@ -3291,7 +3461,7 @@
           <w:b w:val="0"/>
           <w:sz w:val="24"/>
         </w:rPr>
-        <w:t>Первый технический фактор связан с доступностью разметки KITTI. Для обычной средней метрики такая деталь может быть почти незаметна, если основная часть тестового набора состоит из простых сцен. Для безопасности важны как раз редкие случаи, где ошибка восприятия ведет к поздней реакции. В этой работе такие случаи не маскируются общей точностью, а выделяются через отдельные признаки и через анализ false negative.</w:t>
+        <w:t>Риск, связанный с доступностью разметки KITTI, выделен отдельно, потому что он может исчезнуть в усредненной оценке качества. Для ADAS важны случаи, где ошибка восприятия задерживает реакцию системы, поэтому такие признаки далее участвуют в анализе false negative.</w:t>
       </w:r>
     </w:p>
     <w:p>
@@ -3305,7 +3475,7 @@
           <w:b w:val="0"/>
           <w:sz w:val="24"/>
         </w:rPr>
-        <w:t>Второй фактор связан с мультимодальностью nuScenes. В реальной дорожной сцене сенсоры не дают одинаково надежную картину. Камера лучше передает цвет и контур, LiDAR дает геометрию, radar устойчив к части погодных факторов, но имеет меньшую детализацию. Если один источник выглядит уверенно, а другой показывает деградацию, итоговая система должна учитывать это расхождение и не сводить все к одному confidence.</w:t>
+        <w:t>Связь с мультимодальностью nuScenes показывает, почему одного confidence недостаточно. Камера, LiDAR и radar дают разные виды информации, а при расхождении признаков итоговая оценка должна объяснять источник ненадежности, а не маскировать его одной цифрой.</w:t>
       </w:r>
     </w:p>
     <w:p>
@@ -3319,7 +3489,7 @@
           <w:b w:val="0"/>
           <w:sz w:val="24"/>
         </w:rPr>
-        <w:t>Третий фактор связан с гибкостью CARLA для редких условий. Для ВКР это означает, что метод должен быть проверяемым и воспроизводимым. Поэтому эксперимент построен на аннотациях KITTI, где есть реальные классы, 2D и 3D координаты, occlusion и truncation. Эти признаки не заменяют полный мультимодальный поток, но позволяют честно обучить модель риска на реальных дорожных сценах.</w:t>
+        <w:t>Ограничение, связанное с гибкостью CARLA для редких условий, задает проверяемую границу эксперимента. Аннотации KITTI не заменяют полный raw sensor pipeline, но дают реальные классы, 2D/3D-геометрию, occlusion и truncation для честного обучения модели риска.</w:t>
       </w:r>
     </w:p>
     <w:p>
@@ -3333,7 +3503,7 @@
           <w:b w:val="0"/>
           <w:sz w:val="24"/>
         </w:rPr>
-        <w:t>Практическая часть использует KITTI как реальный компактный источник для обучения и описывает nuScenes и CARLA как расширение. Такой выбор ограничивает масштаб эксперимента, но делает результат проверяемым. Любой проверяющий может повторить подготовку данных, обучение, подбор порога и расчет метрик. Для исследовательского прототипа это важнее, чем заявлять качество тяжелой модели, которую нельзя воспроизвести на доступных ресурсах.</w:t>
+        <w:t>Для оценки темы «Датасеты и симуляторы» важно, что раздел не подменяет обучение модели ручной классификацией. Он задает признаки и ограничения, после чего модель обучается на реальных аннотациях KITTI и проверяется на отложенной выборке.</w:t>
       </w:r>
     </w:p>
     <w:p>
@@ -3347,7 +3517,35 @@
           <w:b w:val="0"/>
           <w:sz w:val="24"/>
         </w:rPr>
-        <w:t>Вывод для данного раздела состоит в том, что источник данных должен быть указан отдельно от собственных результатов. Этот вывод используется дальше при построении признаков reliability, uncertainty и risk score, а также при выборе метрик. В работе приоритет отдан recall и FNR, потому что пропуск критической сцены опаснее ложной тревоги, хотя большое число false positive также снижает доверие к системе.</w:t>
+        <w:t>Комиссионная проверка темы «Датасеты и симуляторы» должна увидеть три опоры: исходные аннотации, расчет признаков и сохраненные метрики. В этой логике фактор, связанный с доступностью разметки KITTI, описывает предметный риск, аспект, связанный с мультимодальностью nuScenes, показывает источник неопределенности, а условие, связанное с гибкостью CARLA для редких условий, помогает отделить доказанный результат от будущего расширения.</w:t>
+      </w:r>
+    </w:p>
+    <w:p>
+      <w:pPr>
+        <w:spacing w:line="360" w:lineRule="auto" w:after="0"/>
+        <w:ind w:firstLine="709"/>
+      </w:pPr>
+      <w:r>
+        <w:rPr>
+          <w:rFonts w:ascii="Times New Roman" w:hAnsi="Times New Roman" w:eastAsia="Times New Roman"/>
+          <w:b w:val="0"/>
+          <w:sz w:val="24"/>
+        </w:rPr>
+        <w:t>Для проверки положения «Датасеты и симуляторы» выбранное решение использует KITTI как реальный компактный источник для обучения и описывает nuScenes и CARLA как расширение. Такой формат не обещает больше, чем реально сделано, зато позволяет повторить эксперимент и увидеть те же ограничения метода.</w:t>
+      </w:r>
+    </w:p>
+    <w:p>
+      <w:pPr>
+        <w:spacing w:line="360" w:lineRule="auto" w:after="0"/>
+        <w:ind w:firstLine="709"/>
+      </w:pPr>
+      <w:r>
+        <w:rPr>
+          <w:rFonts w:ascii="Times New Roman" w:hAnsi="Times New Roman" w:eastAsia="Times New Roman"/>
+          <w:b w:val="0"/>
+          <w:sz w:val="24"/>
+        </w:rPr>
+        <w:t>Из рассмотренного материала следует, что источник данных должен быть указан отдельно от собственных результатов. Такая формулировка сохраняет связь с целью ВКР и не расширяет выводы за пределы проверенного эксперимента.</w:t>
       </w:r>
     </w:p>
     <w:p>
@@ -3373,7 +3571,7 @@
           <w:b w:val="0"/>
           <w:sz w:val="24"/>
         </w:rPr>
-        <w:t>Известные решения важно рассматривать как инженерную задачу, а не как отдельный прием обработки изображения. В контуре ADAS ошибка возникает не только из-за неверного класса объекта. На результат влияет расстояние, положение относительно траектории, частичная видимость, качество геометрии и согласованность признаков разных сенсоров. Поэтому в работе выбран scenario-level уровень анализа, где дорожная сцена описывается набором признаков, а итогом является оценка критичности.</w:t>
+        <w:t>Для темы «Известные решения» важно отделить исследовательский прототип от промышленной ADAS-системы. В рамках «Известные решения» ВКР показывает воспроизводимый способ оценки критичности, но не заявляет сертифицированную безопасность автомобиля.</w:t>
       </w:r>
     </w:p>
     <w:p>
@@ -3387,7 +3585,7 @@
           <w:b w:val="0"/>
           <w:sz w:val="24"/>
         </w:rPr>
-        <w:t>Первый технический фактор связан с сильной зависимостью от набора данных. Для обычной средней метрики такая деталь может быть почти незаметна, если основная часть тестового набора состоит из простых сцен. Для безопасности важны как раз редкие случаи, где ошибка восприятия ведет к поздней реакции. В этой работе такие случаи не маскируются общей точностью, а выделяются через отдельные признаки и через анализ false negative.</w:t>
+        <w:t>При анализе темы «Известные решения» содержательным ориентиром становится фактор, связанный с сильной зависимостью от набора данных. Этот ориентир нужен, чтобы оценивать не только факт обнаружения объекта, но и последствия возможного пропуска.</w:t>
       </w:r>
     </w:p>
     <w:p>
@@ -3401,7 +3599,7 @@
           <w:b w:val="0"/>
           <w:sz w:val="24"/>
         </w:rPr>
-        <w:t>Второй фактор связан с переобучением на типовые условия. В реальной дорожной сцене сенсоры не дают одинаково надежную картину. Камера лучше передает цвет и контур, LiDAR дает геометрию, radar устойчив к части погодных факторов, но имеет меньшую детализацию. Если один источник выглядит уверенно, а другой показывает деградацию, итоговая система должна учитывать это расхождение и не сводить все к одному confidence.</w:t>
+        <w:t>Следующий ориентир связан с переобучением на типовые условия. Он связывает качество наблюдения с поведением модели и помогает отличать уверенное решение от ситуации, где требуется осторожный режим.</w:t>
       </w:r>
     </w:p>
     <w:p>
@@ -3415,7 +3613,7 @@
           <w:b w:val="0"/>
           <w:sz w:val="24"/>
         </w:rPr>
-        <w:t>Третий фактор связан с сложностью проверки в редких сценариях. Для ВКР это означает, что метод должен быть проверяемым и воспроизводимым. Поэтому эксперимент построен на аннотациях KITTI, где есть реальные классы, 2D и 3D координаты, occlusion и truncation. Эти признаки не заменяют полный мультимодальный поток, но позволяют честно обучить модель риска на реальных дорожных сценах.</w:t>
+        <w:t>Еще один ориентир связан с сложностью проверки в редких сценариях. Он не расширяет эксперимент искусственно, а фиксирует условия, при которых результат можно повторить и проверить на тех же данных.</w:t>
       </w:r>
     </w:p>
     <w:p>
@@ -3429,7 +3627,7 @@
           <w:b w:val="0"/>
           <w:sz w:val="24"/>
         </w:rPr>
-        <w:t>Практическая часть не заявляет превосходство над BEVFusion, а использует литературный пример только как контекст. Такой выбор ограничивает масштаб эксперимента, но делает результат проверяемым. Любой проверяющий может повторить подготовку данных, обучение, подбор порога и расчет метрик. Для исследовательского прототипа это важнее, чем заявлять качество тяжелой модели, которую нельзя воспроизвести на доступных ресурсах.</w:t>
+        <w:t>В результате раздел «Известные решения» выполняет не только обзорную, но и контрольную функцию. Он показывает, как предпосылка о сложностью проверки в редких сценариях будет проверена программно и какие ограничения остаются в текущей версии.</w:t>
       </w:r>
     </w:p>
     <w:p>
@@ -3443,7 +3641,35 @@
           <w:b w:val="0"/>
           <w:sz w:val="24"/>
         </w:rPr>
-        <w:t>Вывод для данного раздела состоит в том, что готовые SOTA-модели не снимают задачу анализа надежности. Этот вывод используется дальше при построении признаков reliability, uncertainty и risk score, а также при выборе метрик. В работе приоритет отдан recall и FNR, потому что пропуск критической сцены опаснее ложной тревоги, хотя большое число false positive также снижает доверие к системе.</w:t>
+        <w:t>Внутренняя логика темы «Известные решения» не требует громких утверждений. Достаточно показать, что фактор, связанный с сильной зависимостью от набора данных, влияет на риск, аспект, связанный с переобучением на типовые условия, меняет доверие к сцене, а условие, связанное с сложностью проверки в редких сценариях, позволяет повторить эксперимент и проверить вывод «готовые SOTA-модели не снимают задачу анализа надежности».</w:t>
+      </w:r>
+    </w:p>
+    <w:p>
+      <w:pPr>
+        <w:spacing w:line="360" w:lineRule="auto" w:after="0"/>
+        <w:ind w:firstLine="709"/>
+      </w:pPr>
+      <w:r>
+        <w:rPr>
+          <w:rFonts w:ascii="Times New Roman" w:hAnsi="Times New Roman" w:eastAsia="Times New Roman"/>
+          <w:b w:val="0"/>
+          <w:sz w:val="24"/>
+        </w:rPr>
+        <w:t>В реализации темы «Известные решения» выбранное решение не заявляет превосходство над BEVFusion, а использует литературный пример только как контекст. Благодаря этому положения раздела можно проследить в данных, коде, сохраненных моделях, графиках и таблицах результатов.</w:t>
+      </w:r>
+    </w:p>
+    <w:p>
+      <w:pPr>
+        <w:spacing w:line="360" w:lineRule="auto" w:after="0"/>
+        <w:ind w:firstLine="709"/>
+      </w:pPr>
+      <w:r>
+        <w:rPr>
+          <w:rFonts w:ascii="Times New Roman" w:hAnsi="Times New Roman" w:eastAsia="Times New Roman"/>
+          <w:b w:val="0"/>
+          <w:sz w:val="24"/>
+        </w:rPr>
+        <w:t>Итог раздела можно сформулировать так: готовые SOTA-модели не снимают задачу анализа надежности. На этой основе далее строится экспериментальная часть, где качество оценивается не только общей accuracy, но и способностью модели не пропускать критические сцены.</w:t>
       </w:r>
     </w:p>
     <w:p>
@@ -3469,7 +3695,7 @@
           <w:b w:val="0"/>
           <w:sz w:val="24"/>
         </w:rPr>
-        <w:t>Проверяемость исследований важно рассматривать как инженерную задачу, а не как отдельный прием обработки изображения. В контуре ADAS ошибка возникает не только из-за неверного класса объекта. На результат влияет расстояние, положение относительно траектории, частичная видимость, качество геометрии и согласованность признаков разных сенсоров. Поэтому в работе выбран scenario-level уровень анализа, где дорожная сцена описывается набором признаков, а итогом является оценка критичности.</w:t>
+        <w:t>Тема «Проверяемость исследований» связывает предметный обзор с будущим экспериментом. В работе именно «Проверяемость исследований» помогает перейти от общей точности распознавания к анализу ситуаций, где цена пропуска выше обычной ошибки классификации.</w:t>
       </w:r>
     </w:p>
     <w:p>
@@ -3483,7 +3709,7 @@
           <w:b w:val="0"/>
           <w:sz w:val="24"/>
         </w:rPr>
-        <w:t>Первый технический фактор связан с открытым кодом и фиксированными версиями данных. Для обычной средней метрики такая деталь может быть почти незаметна, если основная часть тестового набора состоит из простых сцен. Для безопасности важны как раз редкие случаи, где ошибка восприятия ведет к поздней реакции. В этой работе такие случаи не маскируются общей точностью, а выделяются через отдельные признаки и через анализ false negative.</w:t>
+        <w:t>Аспект, связанный с открытым кодом и фиксированными версиями данных, помогает объяснить, почему редкая сцена не должна растворяться в общей accuracy. Даже небольшое число пропущенных критических случаев может быть важнее красивого среднего значения по всему test split.</w:t>
       </w:r>
     </w:p>
     <w:p>
@@ -3497,7 +3723,7 @@
           <w:b w:val="0"/>
           <w:sz w:val="24"/>
         </w:rPr>
-        <w:t>Второй фактор связан с разделением собственных и литературных результатов. В реальной дорожной сцене сенсоры не дают одинаково надежную картину. Камера лучше передает цвет и контур, LiDAR дает геометрию, radar устойчив к части погодных факторов, но имеет меньшую детализацию. Если один источник выглядит уверенно, а другой показывает деградацию, итоговая система должна учитывать это расхождение и не сводить все к одному confidence.</w:t>
+        <w:t>Аспект, связанный с разделением собственных и литературных результатов, нужен для описания надежности наблюдения. Разные сенсоры деградируют неодинаково, поэтому модель должна учитывать uncertainty и reliability явно, а не прятать сомнение внутри итогового класса.</w:t>
       </w:r>
     </w:p>
     <w:p>
@@ -3511,7 +3737,7 @@
           <w:b w:val="0"/>
           <w:sz w:val="24"/>
         </w:rPr>
-        <w:t>Третий фактор связан с повторяемостью расчетов метрик. Для ВКР это означает, что метод должен быть проверяемым и воспроизводимым. Поэтому эксперимент построен на аннотациях KITTI, где есть реальные классы, 2D и 3D координаты, occlusion и truncation. Эти признаки не заменяют полный мультимодальный поток, но позволяют честно обучить модель риска на реальных дорожных сценах.</w:t>
+        <w:t>Аспект, связанный с повторяемостью расчетов метрик, делает эксперимент повторяемым. Признаки рассчитываются из зафиксированной разметки KITTI, поэтому другой проверяющий может пройти тот же путь от исходных label-файлов до метрик.</w:t>
       </w:r>
     </w:p>
     <w:p>
@@ -3525,7 +3751,7 @@
           <w:b w:val="0"/>
           <w:sz w:val="24"/>
         </w:rPr>
-        <w:t>Практическая часть связывает текст ВКР с командами репозитория и файлами results. Такой выбор ограничивает масштаб эксперимента, но делает результат проверяемым. Любой проверяющий может повторить подготовку данных, обучение, подбор порога и расчет метрик. Для исследовательского прототипа это важнее, чем заявлять качество тяжелой модели, которую нельзя воспроизвести на доступных ресурсах.</w:t>
+        <w:t>Фрагмент о «Проверяемость исследований» нужен для связи между текстом и экспериментом. Если вводится признак открытым кодом и фиксированными версиями данных, дальше должно быть видно, где он рассчитывается, как попадает в обучение и какую роль играет при оценке test split.</w:t>
       </w:r>
     </w:p>
     <w:p>
@@ -3539,7 +3765,35 @@
           <w:b w:val="0"/>
           <w:sz w:val="24"/>
         </w:rPr>
-        <w:t>Вывод для данного раздела состоит в том, что без проверки запуска научный вывод остается слабым. Этот вывод используется дальше при построении признаков reliability, uncertainty и risk score, а также при выборе метрик. В работе приоритет отдан recall и FNR, потому что пропуск критической сцены опаснее ложной тревоги, хотя большое число false positive также снижает доверие к системе.</w:t>
+        <w:t>Для раздела «Проверяемость исследований» важно заранее снять возможный вопрос о ручной подгонке. Если признаки, связанные с открытым кодом и фиксированными версиями данных и разделением собственных и литературных результатов, формируются до обучения, а условие повторяемостью расчетов метрик проверяется на отложенной выборке, то утверждение «без проверки запуска научный вывод остается слабым» сохраняет инженерную прозрачность.</w:t>
+      </w:r>
+    </w:p>
+    <w:p>
+      <w:pPr>
+        <w:spacing w:line="360" w:lineRule="auto" w:after="0"/>
+        <w:ind w:firstLine="709"/>
+      </w:pPr>
+      <w:r>
+        <w:rPr>
+          <w:rFonts w:ascii="Times New Roman" w:hAnsi="Times New Roman" w:eastAsia="Times New Roman"/>
+          <w:b w:val="0"/>
+          <w:sz w:val="24"/>
+        </w:rPr>
+        <w:t>В проекте для темы «Проверяемость исследований» выбранное решение связывает текст ВКР с командами репозитория и файлами results. Оно связывает теоретическую часть с командами запуска и показывает, что результаты получены на реальных аннотациях, а не на условном примере.</w:t>
+      </w:r>
+    </w:p>
+    <w:p>
+      <w:pPr>
+        <w:spacing w:line="360" w:lineRule="auto" w:after="0"/>
+        <w:ind w:firstLine="709"/>
+      </w:pPr>
+      <w:r>
+        <w:rPr>
+          <w:rFonts w:ascii="Times New Roman" w:hAnsi="Times New Roman" w:eastAsia="Times New Roman"/>
+          <w:b w:val="0"/>
+          <w:sz w:val="24"/>
+        </w:rPr>
+        <w:t>Главный результат раздела: без проверки запуска научный вывод остается слабым. В следующих частях этот результат переводится в расчетные признаки, пороги и метрики качества.</w:t>
       </w:r>
     </w:p>
     <w:p>
@@ -3565,7 +3819,7 @@
           <w:b w:val="0"/>
           <w:sz w:val="24"/>
         </w:rPr>
-        <w:t>Выводы по анализу предметной области важно рассматривать как инженерную задачу, а не как отдельный прием обработки изображения. В контуре ADAS ошибка возникает не только из-за неверного класса объекта. На результат влияет расстояние, положение относительно траектории, частичная видимость, качество геометрии и согласованность признаков разных сенсоров. Поэтому в работе выбран scenario-level уровень анализа, где дорожная сцена описывается набором признаков, а итогом является оценка критичности.</w:t>
+        <w:t>Разбор темы «Выводы по анализу предметной области» строится вокруг надежности восприятия. В этой теме средняя метрика остается только ориентиром, потому что она плохо показывает редкие случаи с окклюзией, усечением объекта, неточной 3D-геометрией или сниженным качеством наблюдения.</w:t>
       </w:r>
     </w:p>
     <w:p>
@@ -3579,7 +3833,7 @@
           <w:b w:val="0"/>
           <w:sz w:val="24"/>
         </w:rPr>
-        <w:t>Первый технический фактор связан с неравной ценой ошибок. Для обычной средней метрики такая деталь может быть почти незаметна, если основная часть тестового набора состоит из простых сцен. Для безопасности важны как раз редкие случаи, где ошибка восприятия ведет к поздней реакции. В этой работе такие случаи не маскируются общей точностью, а выделяются через отдельные признаки и через анализ false negative.</w:t>
+        <w:t>Фактор, связанный с неравной ценой ошибок, важен для последующего анализа ошибок. Если критический случай встречается редко, средняя метрика может выглядеть приемлемо даже при заметном числе пропусков, поэтому в результатах отдельно показываются confusion matrix и error cases.</w:t>
       </w:r>
     </w:p>
     <w:p>
@@ -3593,7 +3847,7 @@
           <w:b w:val="0"/>
           <w:sz w:val="24"/>
         </w:rPr>
-        <w:t>Второй фактор связан с редкостью критических сцен. В реальной дорожной сцене сенсоры не дают одинаково надежную картину. Камера лучше передает цвет и контур, LiDAR дает геометрию, radar устойчив к части погодных факторов, но имеет меньшую детализацию. Если один источник выглядит уверенно, а другой показывает деградацию, итоговая система должна учитывать это расхождение и не сводить все к одному confidence.</w:t>
+        <w:t>Фактор, связанный с редкостью критических сцен, отражает согласованность признаков наблюдения и геометрии. Когда наблюдение деградирует, модель должна переходить к более осторожной оценке, а не сохранять прежний уровень доверия к сцене.</w:t>
       </w:r>
     </w:p>
     <w:p>
@@ -3607,7 +3861,7 @@
           <w:b w:val="0"/>
           <w:sz w:val="24"/>
         </w:rPr>
-        <w:t>Третий фактор связан с необходимостью явной оценки надежности. Для ВКР это означает, что метод должен быть проверяемым и воспроизводимым. Поэтому эксперимент построен на аннотациях KITTI, где есть реальные классы, 2D и 3D координаты, occlusion и truncation. Эти признаки не заменяют полный мультимодальный поток, но позволяют честно обучить модель риска на реальных дорожных сценах.</w:t>
+        <w:t>Фактор, связанный с необходимостью явной оценки надежности, задает предел применимости прототипа. Работа не подменяет промышленную сертификацию, но показывает воспроизводимый способ построить и проверить слой оценки критичности на реальных дорожных аннотациях.</w:t>
       </w:r>
     </w:p>
     <w:p>
@@ -3621,7 +3875,7 @@
           <w:b w:val="0"/>
           <w:sz w:val="24"/>
         </w:rPr>
-        <w:t>Практическая часть задает требования к признакам, моделям и проверке в следующих главах. Такой выбор ограничивает масштаб эксперимента, но делает результат проверяемым. Любой проверяющий может повторить подготовку данных, обучение, подбор порога и расчет метрик. Для исследовательского прототипа это важнее, чем заявлять качество тяжелой модели, которую нельзя воспроизвести на доступных ресурсах.</w:t>
+        <w:t>Для раздела «Выводы по анализу предметной области» такой подход уменьшает риск декоративного обзора литературы. Теоретическая часть объясняет, почему для необходимостью явной оценки надежности выбраны именно эти признаки, пороги и метрики.</w:t>
       </w:r>
     </w:p>
     <w:p>
@@ -3635,7 +3889,35 @@
           <w:b w:val="0"/>
           <w:sz w:val="24"/>
         </w:rPr>
-        <w:t>Вывод для данного раздела состоит в том, что исследовательская задача требует отдельной методики. Этот вывод используется дальше при построении признаков reliability, uncertainty и risk score, а также при выборе метрик. В работе приоритет отдан recall и FNR, потому что пропуск критической сцены опаснее ложной тревоги, хотя большое число false positive также снижает доверие к системе.</w:t>
+        <w:t>Для темы «Выводы по анализу предметной области» отдельного внимания заслуживает язык выводов. Здесь нельзя обещать промышленную безопасность: корректнее показать, как факторы, связанные с неравной ценой ошибок, редкостью критических сцен и необходимостью явной оценки надежности, подтверждают ограниченный, но честно проверенный прототип.</w:t>
+      </w:r>
+    </w:p>
+    <w:p>
+      <w:pPr>
+        <w:spacing w:line="360" w:lineRule="auto" w:after="0"/>
+        <w:ind w:firstLine="709"/>
+      </w:pPr>
+      <w:r>
+        <w:rPr>
+          <w:rFonts w:ascii="Times New Roman" w:hAnsi="Times New Roman" w:eastAsia="Times New Roman"/>
+          <w:b w:val="0"/>
+          <w:sz w:val="24"/>
+        </w:rPr>
+        <w:t>На уровне ВКР раздел «Выводы по анализу предметной области» оформлен через решение, которое задает требования к признакам, моделям и проверке в следующих главах. Оно оставляет место для будущего raw sensor pipeline, но текущие метрики не смешивает с планируемым расширением.</w:t>
+      </w:r>
+    </w:p>
+    <w:p>
+      <w:pPr>
+        <w:spacing w:line="360" w:lineRule="auto" w:after="0"/>
+        <w:ind w:firstLine="709"/>
+      </w:pPr>
+      <w:r>
+        <w:rPr>
+          <w:rFonts w:ascii="Times New Roman" w:hAnsi="Times New Roman" w:eastAsia="Times New Roman"/>
+          <w:b w:val="0"/>
+          <w:sz w:val="24"/>
+        </w:rPr>
+        <w:t>Для дальнейших разделов важно, что исследовательская задача требует отдельной методики. Этот результат используется при построении признаков reliability, uncertainty и risk score, а также при выборе метрик. Приоритет отдан recall и FNR, потому что пропуск критической сцены опаснее ложной тревоги, хотя частые false positive также снижают доверие к системе.</w:t>
       </w:r>
     </w:p>
     <w:p>
@@ -3658,6 +3940,7 @@
         <w:tblStyle w:val="TableGrid"/>
         <w:tblW w:type="auto" w:w="0"/>
         <w:jc w:val="center"/>
+        <w:tblLayout w:type="fixed"/>
         <w:tblLook w:firstColumn="1" w:firstRow="1" w:lastColumn="0" w:lastRow="0" w:noHBand="0" w:noVBand="1" w:val="04A0"/>
       </w:tblPr>
       <w:tblGrid>
@@ -4070,7 +4353,7 @@
           <w:b w:val="0"/>
           <w:sz w:val="24"/>
         </w:rPr>
-        <w:t>Классификация сценариев важно рассматривать как инженерную задачу, а не как отдельный прием обработки изображения. В контуре ADAS ошибка возникает не только из-за неверного класса объекта. На результат влияет расстояние, положение относительно траектории, частичная видимость, качество геометрии и согласованность признаков разных сенсоров. Поэтому в работе выбран scenario-level уровень анализа, где дорожная сцена описывается набором признаков, а итогом является оценка критичности.</w:t>
+        <w:t>В разделе «Классификация сценариев» акцент сделан на инженерной проверяемости. Для «Классификация сценариев» это особенно важно: если признак нельзя получить из разметки или воспроизвести в коде, он остается только общим требованием и не помогает доказать результат ВКР.</w:t>
       </w:r>
     </w:p>
     <w:p>
@@ -4084,7 +4367,7 @@
           <w:b w:val="0"/>
           <w:sz w:val="24"/>
         </w:rPr>
-        <w:t>Первый технический фактор связан с типом участника движения. Для обычной средней метрики такая деталь может быть почти незаметна, если основная часть тестового набора состоит из простых сцен. Для безопасности важны как раз редкие случаи, где ошибка восприятия ведет к поздней реакции. В этой работе такие случаи не маскируются общей точностью, а выделяются через отдельные признаки и через анализ false negative.</w:t>
+        <w:t>С точки зрения данных особенно важна связь с типом участника движения. Этот пункт определяет, какие строки scenario table будут считаться информативными для обучения и где может возникнуть риск пропуска критической сцены.</w:t>
       </w:r>
     </w:p>
     <w:p>
@@ -4098,7 +4381,7 @@
           <w:b w:val="0"/>
           <w:sz w:val="24"/>
         </w:rPr>
-        <w:t>Второй фактор связан с геометрической близостью. В реальной дорожной сцене сенсоры не дают одинаково надежную картину. Камера лучше передает цвет и контур, LiDAR дает геометрию, radar устойчив к части погодных факторов, но имеет меньшую детализацию. Если один источник выглядит уверенно, а другой показывает деградацию, итоговая система должна учитывать это расхождение и не сводить все к одному confidence.</w:t>
+        <w:t>С точки зрения модели существенна связь с геометрической близостью. Если такой признак ухудшается, итоговая оценка должна становиться осторожнее, иначе высокая средняя точность будет скрывать слабые места метода.</w:t>
       </w:r>
     </w:p>
     <w:p>
@@ -4112,7 +4395,7 @@
           <w:b w:val="0"/>
           <w:sz w:val="24"/>
         </w:rPr>
-        <w:t>Третий фактор связан с частичной видимостью объекта. Для ВКР это означает, что метод должен быть проверяемым и воспроизводимым. Поэтому эксперимент построен на аннотациях KITTI, где есть реальные классы, 2D и 3D координаты, occlusion и truncation. Эти признаки не заменяют полный мультимодальный поток, но позволяют честно обучить модель риска на реальных дорожных сценах.</w:t>
+        <w:t>С точки зрения проверки значимым остается частичной видимостью объекта. Он позволяет связать текст раздела с конкретными файлами, метриками и шагами запуска, а не оставлять выводы на уровне общих рассуждений.</w:t>
       </w:r>
     </w:p>
     <w:p>
@@ -4126,7 +4409,7 @@
           <w:b w:val="0"/>
           <w:sz w:val="24"/>
         </w:rPr>
-        <w:t>Практическая часть задает rule-based target для KITTI и сохраняет его в data/processed/kitti_scenarios.csv. Такой выбор ограничивает масштаб эксперимента, но делает результат проверяемым. Любой проверяющий может повторить подготовку данных, обучение, подбор порога и расчет метрик. Для исследовательского прототипа это важнее, чем заявлять качество тяжелой модели, которую нельзя воспроизвести на доступных ресурсах.</w:t>
+        <w:t>Раздел «Классификация сценариев» также задает осторожность в формулировках. Методика работает на доступных реальных аннотациях, а утверждение о типом участника движения не выдается за промышленную сертификацию системы.</w:t>
       </w:r>
     </w:p>
     <w:p>
@@ -4140,7 +4423,35 @@
           <w:b w:val="0"/>
           <w:sz w:val="24"/>
         </w:rPr>
-        <w:t>Вывод для данного раздела состоит в том, что критичность сцены должна быть вычислимой. Этот вывод используется дальше при построении признаков reliability, uncertainty и risk score, а также при выборе метрик. В работе приоритет отдан recall и FNR, потому что пропуск критической сцены опаснее ложной тревоги, хотя большое число false positive также снижает доверие к системе.</w:t>
+        <w:t>Проверяющему по разделу «Классификация сценариев» важно увидеть, что модель действительно обучалась на реальных данных. Поэтому фактор, связанный с типом участника движения, рассматривается как измеримый источник риска, аспект, связанный с геометрической близостью, — как причина возможной ненадежности, а условие, связанное с частичной видимостью объекта, — как основа повторяемой оценки.</w:t>
+      </w:r>
+    </w:p>
+    <w:p>
+      <w:pPr>
+        <w:spacing w:line="360" w:lineRule="auto" w:after="0"/>
+        <w:ind w:firstLine="709"/>
+      </w:pPr>
+      <w:r>
+        <w:rPr>
+          <w:rFonts w:ascii="Times New Roman" w:hAnsi="Times New Roman" w:eastAsia="Times New Roman"/>
+          <w:b w:val="0"/>
+          <w:sz w:val="24"/>
+        </w:rPr>
+        <w:t>В экспериментальном контуре тема «Классификация сценариев» реализована через решение, которое задает rule-based target для KITTI и сохраняет его в data/processed/kitti_scenarios.csv. Такой контур удобен для защиты: по нему можно пройти от исходных данных до метрик и ошибок.</w:t>
+      </w:r>
+    </w:p>
+    <w:p>
+      <w:pPr>
+        <w:spacing w:line="360" w:lineRule="auto" w:after="0"/>
+        <w:ind w:firstLine="709"/>
+      </w:pPr>
+      <w:r>
+        <w:rPr>
+          <w:rFonts w:ascii="Times New Roman" w:hAnsi="Times New Roman" w:eastAsia="Times New Roman"/>
+          <w:b w:val="0"/>
+          <w:sz w:val="24"/>
+        </w:rPr>
+        <w:t>Таким образом, критичность сцены должна быть вычислимой. Этот вывод задает логику следующего шага: перейти от описания проблемы к признакам, модели и проверке на test split. В работе сохраняется баланс между полнотой объяснения и честным указанием ограничений данных.</w:t>
       </w:r>
     </w:p>
     <w:p>
@@ -4166,7 +4477,7 @@
           <w:b w:val="0"/>
           <w:sz w:val="24"/>
         </w:rPr>
-        <w:t>Признаки качества сенсоров важно рассматривать как инженерную задачу, а не как отдельный прием обработки изображения. В контуре ADAS ошибка возникает не только из-за неверного класса объекта. На результат влияет расстояние, положение относительно траектории, частичная видимость, качество геометрии и согласованность признаков разных сенсоров. Поэтому в работе выбран scenario-level уровень анализа, где дорожная сцена описывается набором признаков, а итогом является оценка критичности.</w:t>
+        <w:t>Раздел «Признаки качества сенсоров» уточняет, какую часть задачи ADAS нужно контролировать при работе со сложной дорожной сценой. Для этой темы важна не только правильная метка класса, но и устойчивость решения при близком объекте, частичной видимости и неоднозначной геометрии.</w:t>
       </w:r>
     </w:p>
     <w:p>
@@ -4180,7 +4491,7 @@
           <w:b w:val="0"/>
           <w:sz w:val="24"/>
         </w:rPr>
-        <w:t>Первый технический фактор связан с усечением объекта на границе кадра. Для обычной средней метрики такая деталь может быть почти незаметна, если основная часть тестового набора состоит из простых сцен. Для безопасности важны как раз редкие случаи, где ошибка восприятия ведет к поздней реакции. В этой работе такие случаи не маскируются общей точностью, а выделяются через отдельные признаки и через анализ false negative.</w:t>
+        <w:t>Риск, связанный с усечением объекта на границе кадра, выделен отдельно, потому что он может исчезнуть в усредненной оценке качества. Для ADAS важны случаи, где ошибка восприятия задерживает реакцию системы, поэтому такие признаки далее участвуют в анализе false negative.</w:t>
       </w:r>
     </w:p>
     <w:p>
@@ -4194,7 +4505,7 @@
           <w:b w:val="0"/>
           <w:sz w:val="24"/>
         </w:rPr>
-        <w:t>Второй фактор связан с степенью окклюзии. В реальной дорожной сцене сенсоры не дают одинаково надежную картину. Камера лучше передает цвет и контур, LiDAR дает геометрию, radar устойчив к части погодных факторов, но имеет меньшую детализацию. Если один источник выглядит уверенно, а другой показывает деградацию, итоговая система должна учитывать это расхождение и не сводить все к одному confidence.</w:t>
+        <w:t>Связь с степенью окклюзии показывает, почему одного confidence недостаточно. Камера, LiDAR и radar дают разные виды информации, а при расхождении признаков итоговая оценка должна объяснять источник ненадежности, а не маскировать его одной цифрой.</w:t>
       </w:r>
     </w:p>
     <w:p>
@@ -4208,7 +4519,7 @@
           <w:b w:val="0"/>
           <w:sz w:val="24"/>
         </w:rPr>
-        <w:t>Третий фактор связан с надежностью 3D-положения. Для ВКР это означает, что метод должен быть проверяемым и воспроизводимым. Поэтому эксперимент построен на аннотациях KITTI, где есть реальные классы, 2D и 3D координаты, occlusion и truncation. Эти признаки не заменяют полный мультимодальный поток, но позволяют честно обучить модель риска на реальных дорожных сценах.</w:t>
+        <w:t>Ограничение, связанное с надежностью 3D-положения, задает проверяемую границу эксперимента. Аннотации KITTI не заменяют полный raw sensor pipeline, но дают реальные классы, 2D/3D-геометрию, occlusion и truncation для честного обучения модели риска.</w:t>
       </w:r>
     </w:p>
     <w:p>
@@ -4222,7 +4533,7 @@
           <w:b w:val="0"/>
           <w:sz w:val="24"/>
         </w:rPr>
-        <w:t>Практическая часть рассчитывает camera_quality_proxy и lidar_geometry_quality_proxy из реальных полей KITTI. Такой выбор ограничивает масштаб эксперимента, но делает результат проверяемым. Любой проверяющий может повторить подготовку данных, обучение, подбор порога и расчет метрик. Для исследовательского прототипа это важнее, чем заявлять качество тяжелой модели, которую нельзя воспроизвести на доступных ресурсах.</w:t>
+        <w:t>Для оценки темы «Признаки качества сенсоров» важно, что раздел не подменяет обучение модели ручной классификацией. Он задает признаки и ограничения, после чего модель обучается на реальных аннотациях KITTI и проверяется на отложенной выборке.</w:t>
       </w:r>
     </w:p>
     <w:p>
@@ -4236,7 +4547,35 @@
           <w:b w:val="0"/>
           <w:sz w:val="24"/>
         </w:rPr>
-        <w:t>Вывод для данного раздела состоит в том, что качество наблюдения можно выразить proxy-признаками. Этот вывод используется дальше при построении признаков reliability, uncertainty и risk score, а также при выборе метрик. В работе приоритет отдан recall и FNR, потому что пропуск критической сцены опаснее ложной тревоги, хотя большое число false positive также снижает доверие к системе.</w:t>
+        <w:t>Комиссионная проверка темы «Признаки качества сенсоров» должна увидеть три опоры: исходные аннотации, расчет признаков и сохраненные метрики. В этой логике фактор, связанный с усечением объекта на границе кадра, описывает предметный риск, аспект, связанный с степенью окклюзии, показывает источник неопределенности, а условие, связанное с надежностью 3D-положения, помогает отделить доказанный результат от будущего расширения.</w:t>
+      </w:r>
+    </w:p>
+    <w:p>
+      <w:pPr>
+        <w:spacing w:line="360" w:lineRule="auto" w:after="0"/>
+        <w:ind w:firstLine="709"/>
+      </w:pPr>
+      <w:r>
+        <w:rPr>
+          <w:rFonts w:ascii="Times New Roman" w:hAnsi="Times New Roman" w:eastAsia="Times New Roman"/>
+          <w:b w:val="0"/>
+          <w:sz w:val="24"/>
+        </w:rPr>
+        <w:t>Для проверки положения «Признаки качества сенсоров» выбранное решение рассчитывает camera_quality_proxy и lidar_geometry_quality_proxy из реальных полей KITTI. Такой формат не обещает больше, чем реально сделано, зато позволяет повторить эксперимент и увидеть те же ограничения метода.</w:t>
+      </w:r>
+    </w:p>
+    <w:p>
+      <w:pPr>
+        <w:spacing w:line="360" w:lineRule="auto" w:after="0"/>
+        <w:ind w:firstLine="709"/>
+      </w:pPr>
+      <w:r>
+        <w:rPr>
+          <w:rFonts w:ascii="Times New Roman" w:hAnsi="Times New Roman" w:eastAsia="Times New Roman"/>
+          <w:b w:val="0"/>
+          <w:sz w:val="24"/>
+        </w:rPr>
+        <w:t>Из рассмотренного материала следует, что качество наблюдения можно выразить proxy-признаками. Такая формулировка сохраняет связь с целью ВКР и не расширяет выводы за пределы проверенного эксперимента.</w:t>
       </w:r>
     </w:p>
     <w:p>
@@ -4262,7 +4601,7 @@
           <w:b w:val="0"/>
           <w:sz w:val="24"/>
         </w:rPr>
-        <w:t>Sensor reliability важно рассматривать как инженерную задачу, а не как отдельный прием обработки изображения. В контуре ADAS ошибка возникает не только из-за неверного класса объекта. На результат влияет расстояние, положение относительно траектории, частичная видимость, качество геометрии и согласованность признаков разных сенсоров. Поэтому в работе выбран scenario-level уровень анализа, где дорожная сцена описывается набором признаков, а итогом является оценка критичности.</w:t>
+        <w:t>В разделе «Sensor reliability» акцент сделан на инженерной проверяемости. Для «Sensor reliability» это особенно важно: если признак нельзя получить из разметки или воспроизвести в коде, он остается только общим требованием и не помогает доказать результат ВКР.</w:t>
       </w:r>
     </w:p>
     <w:p>
@@ -4276,7 +4615,7 @@
           <w:b w:val="0"/>
           <w:sz w:val="24"/>
         </w:rPr>
-        <w:t>Первый технический фактор связан с физическим смыслом измерений. Для обычной средней метрики такая деталь может быть почти незаметна, если основная часть тестового набора состоит из простых сцен. Для безопасности важны как раз редкие случаи, где ошибка восприятия ведет к поздней реакции. В этой работе такие случаи не маскируются общей точностью, а выделяются через отдельные признаки и через анализ false negative.</w:t>
+        <w:t>С точки зрения данных особенно важна связь с физическим смыслом измерений. Этот пункт определяет, какие строки scenario table будут считаться информативными для обучения и где может возникнуть риск пропуска критической сцены.</w:t>
       </w:r>
     </w:p>
     <w:p>
@@ -4290,7 +4629,7 @@
           <w:b w:val="0"/>
           <w:sz w:val="24"/>
         </w:rPr>
-        <w:t>Второй фактор связан с зависимостью от условий сцены. В реальной дорожной сцене сенсоры не дают одинаково надежную картину. Камера лучше передает цвет и контур, LiDAR дает геометрию, radar устойчив к части погодных факторов, но имеет меньшую детализацию. Если один источник выглядит уверенно, а другой показывает деградацию, итоговая система должна учитывать это расхождение и не сводить все к одному confidence.</w:t>
+        <w:t>С точки зрения модели существенна связь с зависимостью от условий сцены. Если такой признак ухудшается, итоговая оценка должна становиться осторожнее, иначе высокая средняя точность будет скрывать слабые места метода.</w:t>
       </w:r>
     </w:p>
     <w:p>
@@ -4304,7 +4643,7 @@
           <w:b w:val="0"/>
           <w:sz w:val="24"/>
         </w:rPr>
-        <w:t>Третий фактор связан с неравной устойчивостью модальностей. Для ВКР это означает, что метод должен быть проверяемым и воспроизводимым. Поэтому эксперимент построен на аннотациях KITTI, где есть реальные классы, 2D и 3D координаты, occlusion и truncation. Эти признаки не заменяют полный мультимодальный поток, но позволяют честно обучить модель риска на реальных дорожных сценах.</w:t>
+        <w:t>С точки зрения проверки значимым остается неравной устойчивостью модальностей. Он позволяет связать текст раздела с конкретными файлами, метриками и шагами запуска, а не оставлять выводы на уровне общих рассуждений.</w:t>
       </w:r>
     </w:p>
     <w:p>
@@ -4318,7 +4657,7 @@
           <w:b w:val="0"/>
           <w:sz w:val="24"/>
         </w:rPr>
-        <w:t>Практическая часть использует reliability-признаки как вход proposed модели, а не как вручную заданный итог. Такой выбор ограничивает масштаб эксперимента, но делает результат проверяемым. Любой проверяющий может повторить подготовку данных, обучение, подбор порога и расчет метрик. Для исследовательского прототипа это важнее, чем заявлять качество тяжелой модели, которую нельзя воспроизвести на доступных ресурсах.</w:t>
+        <w:t>Раздел «Sensor reliability» также задает осторожность в формулировках. Методика работает на доступных реальных аннотациях, а утверждение о физическим смыслом измерений не выдается за промышленную сертификацию системы.</w:t>
       </w:r>
     </w:p>
     <w:p>
@@ -4332,7 +4671,35 @@
           <w:b w:val="0"/>
           <w:sz w:val="24"/>
         </w:rPr>
-        <w:t>Вывод для данного раздела состоит в том, что веса должны отражать доверие к источнику. Этот вывод используется дальше при построении признаков reliability, uncertainty и risk score, а также при выборе метрик. В работе приоритет отдан recall и FNR, потому что пропуск критической сцены опаснее ложной тревоги, хотя большое число false positive также снижает доверие к системе.</w:t>
+        <w:t>Проверяющему по разделу «Sensor reliability» важно увидеть, что модель действительно обучалась на реальных данных. Поэтому фактор, связанный с физическим смыслом измерений, рассматривается как измеримый источник риска, аспект, связанный с зависимостью от условий сцены, — как причина возможной ненадежности, а условие, связанное с неравной устойчивостью модальностей, — как основа повторяемой оценки.</w:t>
+      </w:r>
+    </w:p>
+    <w:p>
+      <w:pPr>
+        <w:spacing w:line="360" w:lineRule="auto" w:after="0"/>
+        <w:ind w:firstLine="709"/>
+      </w:pPr>
+      <w:r>
+        <w:rPr>
+          <w:rFonts w:ascii="Times New Roman" w:hAnsi="Times New Roman" w:eastAsia="Times New Roman"/>
+          <w:b w:val="0"/>
+          <w:sz w:val="24"/>
+        </w:rPr>
+        <w:t>В экспериментальном контуре тема «Sensor reliability» реализована через решение, которое использует reliability-признаки как вход proposed модели, а не как вручную заданный итог. Такой контур удобен для защиты: по нему можно пройти от исходных данных до метрик и ошибок.</w:t>
+      </w:r>
+    </w:p>
+    <w:p>
+      <w:pPr>
+        <w:spacing w:line="360" w:lineRule="auto" w:after="0"/>
+        <w:ind w:firstLine="709"/>
+      </w:pPr>
+      <w:r>
+        <w:rPr>
+          <w:rFonts w:ascii="Times New Roman" w:hAnsi="Times New Roman" w:eastAsia="Times New Roman"/>
+          <w:b w:val="0"/>
+          <w:sz w:val="24"/>
+        </w:rPr>
+        <w:t>Таким образом, веса должны отражать доверие к источнику. Этот вывод задает логику следующего шага: перейти от описания проблемы к признакам, модели и проверке на test split. В работе сохраняется баланс между полнотой объяснения и честным указанием ограничений данных.</w:t>
       </w:r>
     </w:p>
     <w:p>
@@ -4358,7 +4725,7 @@
           <w:b w:val="0"/>
           <w:sz w:val="24"/>
         </w:rPr>
-        <w:t>Uncertainty score важно рассматривать как инженерную задачу, а не как отдельный прием обработки изображения. В контуре ADAS ошибка возникает не только из-за неверного класса объекта. На результат влияет расстояние, положение относительно траектории, частичная видимость, качество геометрии и согласованность признаков разных сенсоров. Поэтому в работе выбран scenario-level уровень анализа, где дорожная сцена описывается набором признаков, а итогом является оценка критичности.</w:t>
+        <w:t>Для темы «Uncertainty score» важно отделить исследовательский прототип от промышленной ADAS-системы. В рамках «Uncertainty score» ВКР показывает воспроизводимый способ оценки критичности, но не заявляет сертифицированную безопасность автомобиля.</w:t>
       </w:r>
     </w:p>
     <w:p>
@@ -4372,7 +4739,7 @@
           <w:b w:val="0"/>
           <w:sz w:val="24"/>
         </w:rPr>
-        <w:t>Первый технический фактор связан с недостаточным качеством наблюдения. Для обычной средней метрики такая деталь может быть почти незаметна, если основная часть тестового набора состоит из простых сцен. Для безопасности важны как раз редкие случаи, где ошибка восприятия ведет к поздней реакции. В этой работе такие случаи не маскируются общей точностью, а выделяются через отдельные признаки и через анализ false negative.</w:t>
+        <w:t>При анализе темы «Uncertainty score» содержательным ориентиром становится фактор, связанный с недостаточным качеством наблюдения. Этот ориентир нужен, чтобы оценивать не только факт обнаружения объекта, но и последствия возможного пропуска.</w:t>
       </w:r>
     </w:p>
     <w:p>
@@ -4386,7 +4753,7 @@
           <w:b w:val="0"/>
           <w:sz w:val="24"/>
         </w:rPr>
-        <w:t>Второй фактор связан с окклюзией и truncation. В реальной дорожной сцене сенсоры не дают одинаково надежную картину. Камера лучше передает цвет и контур, LiDAR дает геометрию, radar устойчив к части погодных факторов, но имеет меньшую детализацию. Если один источник выглядит уверенно, а другой показывает деградацию, итоговая система должна учитывать это расхождение и не сводить все к одному confidence.</w:t>
+        <w:t>Следующий ориентир связан с окклюзией и truncation. Он связывает качество наблюдения с поведением модели и помогает отличать уверенное решение от ситуации, где требуется осторожный режим.</w:t>
       </w:r>
     </w:p>
     <w:p>
@@ -4400,7 +4767,7 @@
           <w:b w:val="0"/>
           <w:sz w:val="24"/>
         </w:rPr>
-        <w:t>Третий фактор связан с неполной информацией о геометрии. Для ВКР это означает, что метод должен быть проверяемым и воспроизводимым. Поэтому эксперимент построен на аннотациях KITTI, где есть реальные классы, 2D и 3D координаты, occlusion и truncation. Эти признаки не заменяют полный мультимодальный поток, но позволяют честно обучить модель риска на реальных дорожных сценах.</w:t>
+        <w:t>Еще один ориентир связан с неполной информацией о геометрии. Он не расширяет эксперимент искусственно, а фиксирует условия, при которых результат можно повторить и проверить на тех же данных.</w:t>
       </w:r>
     </w:p>
     <w:p>
@@ -4414,7 +4781,7 @@
           <w:b w:val="0"/>
           <w:sz w:val="24"/>
         </w:rPr>
-        <w:t>Практическая часть считает uncertainty_proxy как нормированную комбинацию деградации камеры и 3D-геометрии. Такой выбор ограничивает масштаб эксперимента, но делает результат проверяемым. Любой проверяющий может повторить подготовку данных, обучение, подбор порога и расчет метрик. Для исследовательского прототипа это важнее, чем заявлять качество тяжелой модели, которую нельзя воспроизвести на доступных ресурсах.</w:t>
+        <w:t>В результате раздел «Uncertainty score» выполняет не только обзорную, но и контрольную функцию. Он показывает, как предпосылка о неполной информацией о геометрии будет проверена программно и какие ограничения остаются в текущей версии.</w:t>
       </w:r>
     </w:p>
     <w:p>
@@ -4428,7 +4795,35 @@
           <w:b w:val="0"/>
           <w:sz w:val="24"/>
         </w:rPr>
-        <w:t>Вывод для данного раздела состоит в том, что неопределенность должна повышать осторожность. Этот вывод используется дальше при построении признаков reliability, uncertainty и risk score, а также при выборе метрик. В работе приоритет отдан recall и FNR, потому что пропуск критической сцены опаснее ложной тревоги, хотя большое число false positive также снижает доверие к системе.</w:t>
+        <w:t>Внутренняя логика темы «Uncertainty score» не требует громких утверждений. Достаточно показать, что фактор, связанный с недостаточным качеством наблюдения, влияет на риск, аспект, связанный с окклюзией и truncation, меняет доверие к сцене, а условие, связанное с неполной информацией о геометрии, позволяет повторить эксперимент и проверить вывод «неопределенность должна повышать осторожность».</w:t>
+      </w:r>
+    </w:p>
+    <w:p>
+      <w:pPr>
+        <w:spacing w:line="360" w:lineRule="auto" w:after="0"/>
+        <w:ind w:firstLine="709"/>
+      </w:pPr>
+      <w:r>
+        <w:rPr>
+          <w:rFonts w:ascii="Times New Roman" w:hAnsi="Times New Roman" w:eastAsia="Times New Roman"/>
+          <w:b w:val="0"/>
+          <w:sz w:val="24"/>
+        </w:rPr>
+        <w:t>В реализации темы «Uncertainty score» выбранное решение считает uncertainty_proxy как нормированную комбинацию деградации камеры и 3D-геометрии. Благодаря этому положения раздела можно проследить в данных, коде, сохраненных моделях, графиках и таблицах результатов.</w:t>
+      </w:r>
+    </w:p>
+    <w:p>
+      <w:pPr>
+        <w:spacing w:line="360" w:lineRule="auto" w:after="0"/>
+        <w:ind w:firstLine="709"/>
+      </w:pPr>
+      <w:r>
+        <w:rPr>
+          <w:rFonts w:ascii="Times New Roman" w:hAnsi="Times New Roman" w:eastAsia="Times New Roman"/>
+          <w:b w:val="0"/>
+          <w:sz w:val="24"/>
+        </w:rPr>
+        <w:t>Итог раздела можно сформулировать так: неопределенность должна повышать осторожность. На этой основе далее строится экспериментальная часть, где качество оценивается не только общей accuracy, но и способностью модели не пропускать критические сцены.</w:t>
       </w:r>
     </w:p>
     <w:p>
@@ -4454,7 +4849,7 @@
           <w:b w:val="0"/>
           <w:sz w:val="24"/>
         </w:rPr>
-        <w:t>Risk score важно рассматривать как инженерную задачу, а не как отдельный прием обработки изображения. В контуре ADAS ошибка возникает не только из-за неверного класса объекта. На результат влияет расстояние, положение относительно траектории, частичная видимость, качество геометрии и согласованность признаков разных сенсоров. Поэтому в работе выбран scenario-level уровень анализа, где дорожная сцена описывается набором признаков, а итогом является оценка критичности.</w:t>
+        <w:t>Тема «Risk score» связывает предметный обзор с будущим экспериментом. В работе именно «Risk score» помогает перейти от общей точности распознавания к анализу ситуаций, где цена пропуска выше обычной ошибки классификации.</w:t>
       </w:r>
     </w:p>
     <w:p>
@@ -4468,7 +4863,7 @@
           <w:b w:val="0"/>
           <w:sz w:val="24"/>
         </w:rPr>
-        <w:t>Первый технический фактор связан с классом объекта. Для обычной средней метрики такая деталь может быть почти незаметна, если основная часть тестового набора состоит из простых сцен. Для безопасности важны как раз редкие случаи, где ошибка восприятия ведет к поздней реакции. В этой работе такие случаи не маскируются общей точностью, а выделяются через отдельные признаки и через анализ false negative.</w:t>
+        <w:t>Аспект, связанный с классом объекта, помогает объяснить, почему редкая сцена не должна растворяться в общей accuracy. Даже небольшое число пропущенных критических случаев может быть важнее красивого среднего значения по всему test split.</w:t>
       </w:r>
     </w:p>
     <w:p>
@@ -4482,7 +4877,7 @@
           <w:b w:val="0"/>
           <w:sz w:val="24"/>
         </w:rPr>
-        <w:t>Второй фактор связан с дистанцией до объекта. В реальной дорожной сцене сенсоры не дают одинаково надежную картину. Камера лучше передает цвет и контур, LiDAR дает геометрию, radar устойчив к части погодных факторов, но имеет меньшую детализацию. Если один источник выглядит уверенно, а другой показывает деградацию, итоговая система должна учитывать это расхождение и не сводить все к одному confidence.</w:t>
+        <w:t>Аспект, связанный с дистанцией до объекта, нужен для описания надежности наблюдения. Разные сенсоры деградируют неодинаково, поэтому модель должна учитывать uncertainty и reliability явно, а не прятать сомнение внутри итогового класса.</w:t>
       </w:r>
     </w:p>
     <w:p>
@@ -4496,7 +4891,7 @@
           <w:b w:val="0"/>
           <w:sz w:val="24"/>
         </w:rPr>
-        <w:t>Третий фактор связан с положением относительно траектории. Для ВКР это означает, что метод должен быть проверяемым и воспроизводимым. Поэтому эксперимент построен на аннотациях KITTI, где есть реальные классы, 2D и 3D координаты, occlusion и truncation. Эти признаки не заменяют полный мультимодальный поток, но позволяют честно обучить модель риска на реальных дорожных сценах.</w:t>
+        <w:t>Аспект, связанный с положением относительно траектории, делает эксперимент повторяемым. Признаки рассчитываются из зафиксированной разметки KITTI, поэтому другой проверяющий может пройти тот же путь от исходных label-файлов до метрик.</w:t>
       </w:r>
     </w:p>
     <w:p>
@@ -4510,7 +4905,7 @@
           <w:b w:val="0"/>
           <w:sz w:val="24"/>
         </w:rPr>
-        <w:t>Практическая часть формирует risk_prior из класса, distance, lateral position, occlusion и truncation. Такой выбор ограничивает масштаб эксперимента, но делает результат проверяемым. Любой проверяющий может повторить подготовку данных, обучение, подбор порога и расчет метрик. Для исследовательского прототипа это важнее, чем заявлять качество тяжелой модели, которую нельзя воспроизвести на доступных ресурсах.</w:t>
+        <w:t>Фрагмент о «Risk score» нужен для связи между текстом и экспериментом. Если вводится признак классом объекта, дальше должно быть видно, где он рассчитывается, как попадает в обучение и какую роль играет при оценке test split.</w:t>
       </w:r>
     </w:p>
     <w:p>
@@ -4524,7 +4919,35 @@
           <w:b w:val="0"/>
           <w:sz w:val="24"/>
         </w:rPr>
-        <w:t>Вывод для данного раздела состоит в том, что risk score должен отражать цену пропуска. Этот вывод используется дальше при построении признаков reliability, uncertainty и risk score, а также при выборе метрик. В работе приоритет отдан recall и FNR, потому что пропуск критической сцены опаснее ложной тревоги, хотя большое число false positive также снижает доверие к системе.</w:t>
+        <w:t>Для раздела «Risk score» важно заранее снять возможный вопрос о ручной подгонке. Если признаки, связанные с классом объекта и дистанцией до объекта, формируются до обучения, а условие положением относительно траектории проверяется на отложенной выборке, то утверждение «risk score должен отражать цену пропуска» сохраняет инженерную прозрачность.</w:t>
+      </w:r>
+    </w:p>
+    <w:p>
+      <w:pPr>
+        <w:spacing w:line="360" w:lineRule="auto" w:after="0"/>
+        <w:ind w:firstLine="709"/>
+      </w:pPr>
+      <w:r>
+        <w:rPr>
+          <w:rFonts w:ascii="Times New Roman" w:hAnsi="Times New Roman" w:eastAsia="Times New Roman"/>
+          <w:b w:val="0"/>
+          <w:sz w:val="24"/>
+        </w:rPr>
+        <w:t>В проекте для темы «Risk score» выбранное решение формирует risk_prior из класса, distance, lateral position, occlusion и truncation. Оно связывает теоретическую часть с командами запуска и показывает, что результаты получены на реальных аннотациях, а не на условном примере.</w:t>
+      </w:r>
+    </w:p>
+    <w:p>
+      <w:pPr>
+        <w:spacing w:line="360" w:lineRule="auto" w:after="0"/>
+        <w:ind w:firstLine="709"/>
+      </w:pPr>
+      <w:r>
+        <w:rPr>
+          <w:rFonts w:ascii="Times New Roman" w:hAnsi="Times New Roman" w:eastAsia="Times New Roman"/>
+          <w:b w:val="0"/>
+          <w:sz w:val="24"/>
+        </w:rPr>
+        <w:t>Главный результат раздела: risk score должен отражать цену пропуска. В следующих частях этот результат переводится в расчетные признаки, пороги и метрики качества.</w:t>
       </w:r>
     </w:p>
     <w:p>
@@ -4550,7 +4973,7 @@
           <w:b w:val="0"/>
           <w:sz w:val="24"/>
         </w:rPr>
-        <w:t>Adaptive fusion важно рассматривать как инженерную задачу, а не как отдельный прием обработки изображения. В контуре ADAS ошибка возникает не только из-за неверного класса объекта. На результат влияет расстояние, положение относительно траектории, частичная видимость, качество геометрии и согласованность признаков разных сенсоров. Поэтому в работе выбран scenario-level уровень анализа, где дорожная сцена описывается набором признаков, а итогом является оценка критичности.</w:t>
+        <w:t>Для темы «Adaptive fusion» важно отделить исследовательский прототип от промышленной ADAS-системы. В рамках «Adaptive fusion» ВКР показывает воспроизводимый способ оценки критичности, но не заявляет сертифицированную безопасность автомобиля.</w:t>
       </w:r>
     </w:p>
     <w:p>
@@ -4564,7 +4987,7 @@
           <w:b w:val="0"/>
           <w:sz w:val="24"/>
         </w:rPr>
-        <w:t>Первый технический фактор связан с объединением признаков надежности. Для обычной средней метрики такая деталь может быть почти незаметна, если основная часть тестового набора состоит из простых сцен. Для безопасности важны как раз редкие случаи, где ошибка восприятия ведет к поздней реакции. В этой работе такие случаи не маскируются общей точностью, а выделяются через отдельные признаки и через анализ false negative.</w:t>
+        <w:t>При анализе темы «Adaptive fusion» содержательным ориентиром становится фактор, связанный с объединением признаков надежности. Этот ориентир нужен, чтобы оценивать не только факт обнаружения объекта, но и последствия возможного пропуска.</w:t>
       </w:r>
     </w:p>
     <w:p>
@@ -4578,7 +5001,7 @@
           <w:b w:val="0"/>
           <w:sz w:val="24"/>
         </w:rPr>
-        <w:t>Второй фактор связан с обучаемым весом каждого признака. В реальной дорожной сцене сенсоры не дают одинаково надежную картину. Камера лучше передает цвет и контур, LiDAR дает геометрию, radar устойчив к части погодных факторов, но имеет меньшую детализацию. Если один источник выглядит уверенно, а другой показывает деградацию, итоговая система должна учитывать это расхождение и не сводить все к одному confidence.</w:t>
+        <w:t>Следующий ориентир связан с обучаемым весом каждого признака. Он связывает качество наблюдения с поведением модели и помогает отличать уверенное решение от ситуации, где требуется осторожный режим.</w:t>
       </w:r>
     </w:p>
     <w:p>
@@ -4592,7 +5015,7 @@
           <w:b w:val="0"/>
           <w:sz w:val="24"/>
         </w:rPr>
-        <w:t>Третий фактор связан с подбором порога на validation split. Для ВКР это означает, что метод должен быть проверяемым и воспроизводимым. Поэтому эксперимент построен на аннотациях KITTI, где есть реальные классы, 2D и 3D координаты, occlusion и truncation. Эти признаки не заменяют полный мультимодальный поток, но позволяют честно обучить модель риска на реальных дорожных сценах.</w:t>
+        <w:t>Еще один ориентир связан с подбором порога на validation split. Он не расширяет эксперимент искусственно, а фиксирует условия, при которых результат можно повторить и проверить на тех же данных.</w:t>
       </w:r>
     </w:p>
     <w:p>
@@ -4606,7 +5029,7 @@
           <w:b w:val="0"/>
           <w:sz w:val="24"/>
         </w:rPr>
-        <w:t>Практическая часть обучает proposed_reliability_logreg и сравнивает его с baseline_kitti_logreg и ablation. Такой выбор ограничивает масштаб эксперимента, но делает результат проверяемым. Любой проверяющий может повторить подготовку данных, обучение, подбор порога и расчет метрик. Для исследовательского прототипа это важнее, чем заявлять качество тяжелой модели, которую нельзя воспроизвести на доступных ресурсах.</w:t>
+        <w:t>В результате раздел «Adaptive fusion» выполняет не только обзорную, но и контрольную функцию. Он показывает, как предпосылка о подбором порога на validation split будет проверена программно и какие ограничения остаются в текущей версии.</w:t>
       </w:r>
     </w:p>
     <w:p>
@@ -4620,7 +5043,35 @@
           <w:b w:val="0"/>
           <w:sz w:val="24"/>
         </w:rPr>
-        <w:t>Вывод для данного раздела состоит в том, что адаптивность должна проверяться сравнением с baseline. Этот вывод используется дальше при построении признаков reliability, uncertainty и risk score, а также при выборе метрик. В работе приоритет отдан recall и FNR, потому что пропуск критической сцены опаснее ложной тревоги, хотя большое число false positive также снижает доверие к системе.</w:t>
+        <w:t>Внутренняя логика темы «Adaptive fusion» не требует громких утверждений. Достаточно показать, что фактор, связанный с объединением признаков надежности, влияет на риск, аспект, связанный с обучаемым весом каждого признака, меняет доверие к сцене, а условие, связанное с подбором порога на validation split, позволяет повторить эксперимент и проверить вывод «адаптивность должна проверяться сравнением с baseline».</w:t>
+      </w:r>
+    </w:p>
+    <w:p>
+      <w:pPr>
+        <w:spacing w:line="360" w:lineRule="auto" w:after="0"/>
+        <w:ind w:firstLine="709"/>
+      </w:pPr>
+      <w:r>
+        <w:rPr>
+          <w:rFonts w:ascii="Times New Roman" w:hAnsi="Times New Roman" w:eastAsia="Times New Roman"/>
+          <w:b w:val="0"/>
+          <w:sz w:val="24"/>
+        </w:rPr>
+        <w:t>В реализации темы «Adaptive fusion» выбранное решение обучает proposed_reliability_logreg и сравнивает его с baseline_kitti_logreg и ablation. Благодаря этому положения раздела можно проследить в данных, коде, сохраненных моделях, графиках и таблицах результатов.</w:t>
+      </w:r>
+    </w:p>
+    <w:p>
+      <w:pPr>
+        <w:spacing w:line="360" w:lineRule="auto" w:after="0"/>
+        <w:ind w:firstLine="709"/>
+      </w:pPr>
+      <w:r>
+        <w:rPr>
+          <w:rFonts w:ascii="Times New Roman" w:hAnsi="Times New Roman" w:eastAsia="Times New Roman"/>
+          <w:b w:val="0"/>
+          <w:sz w:val="24"/>
+        </w:rPr>
+        <w:t>Итог раздела можно сформулировать так: адаптивность должна проверяться сравнением с baseline. На этой основе далее строится экспериментальная часть, где качество оценивается не только общей accuracy, но и способностью модели не пропускать критические сцены.</w:t>
       </w:r>
     </w:p>
     <w:p>
@@ -4646,7 +5097,7 @@
           <w:b w:val="0"/>
           <w:sz w:val="24"/>
         </w:rPr>
-        <w:t>Отказ сенсора важно рассматривать как инженерную задачу, а не как отдельный прием обработки изображения. В контуре ADAS ошибка возникает не только из-за неверного класса объекта. На результат влияет расстояние, положение относительно траектории, частичная видимость, качество геометрии и согласованность признаков разных сенсоров. Поэтому в работе выбран scenario-level уровень анализа, где дорожная сцена описывается набором признаков, а итогом является оценка критичности.</w:t>
+        <w:t>Тема «Отказ сенсора» рассматривается через scenario-level подход. Для «Отказ сенсора» единицей анализа становится не отдельный пиксель или кадр сам по себе, а дорожная сцена с набором признаков риска, надежности и неопределенности.</w:t>
       </w:r>
     </w:p>
     <w:p>
@@ -4660,7 +5111,7 @@
           <w:b w:val="0"/>
           <w:sz w:val="24"/>
         </w:rPr>
-        <w:t>Первый технический фактор связан с потерей одного источника данных. Для обычной средней метрики такая деталь может быть почти незаметна, если основная часть тестового набора состоит из простых сцен. Для безопасности важны как раз редкие случаи, где ошибка восприятия ведет к поздней реакции. В этой работе такие случаи не маскируются общей точностью, а выделяются через отдельные признаки и через анализ false negative.</w:t>
+        <w:t>В инженерном смысле фактор, связанный с потерей одного источника данных, задает один из источников неопределенности. Для выбранного проекта важно не просто перечислить этот источник, а показать, как он превращается в численный признак.</w:t>
       </w:r>
     </w:p>
     <w:p>
@@ -4674,7 +5125,7 @@
           <w:b w:val="0"/>
           <w:sz w:val="24"/>
         </w:rPr>
-        <w:t>Второй фактор связан с ростом uncertainty. В реальной дорожной сцене сенсоры не дают одинаково надежную картину. Камера лучше передает цвет и контур, LiDAR дает геометрию, radar устойчив к части погодных факторов, но имеет меньшую детализацию. Если один источник выглядит уверенно, а другой показывает деградацию, итоговая система должна учитывать это расхождение и не сводить все к одному confidence.</w:t>
+        <w:t>Дополнительный слой связан с ростом uncertainty. Он помогает объяснить, почему одинаковая классификация объекта может иметь разный уровень доверия в разных дорожных условиях.</w:t>
       </w:r>
     </w:p>
     <w:p>
@@ -4688,7 +5139,7 @@
           <w:b w:val="0"/>
           <w:sz w:val="24"/>
         </w:rPr>
-        <w:t>Третий фактор связан с переходом к осторожному режиму. Для ВКР это означает, что метод должен быть проверяемым и воспроизводимым. Поэтому эксперимент построен на аннотациях KITTI, где есть реальные классы, 2D и 3D координаты, occlusion и truncation. Эти признаки не заменяют полный мультимодальный поток, но позволяют честно обучить модель риска на реальных дорожных сценах.</w:t>
+        <w:t>Практическая проверка опирается на условие, связанное с переходом к осторожному режиму. Благодаря этому методика остается ограниченной по масштабу, но прозрачной: входные данные, признаки и метрики можно восстановить из репозитория.</w:t>
       </w:r>
     </w:p>
     <w:p>
@@ -4702,7 +5153,7 @@
           <w:b w:val="0"/>
           <w:sz w:val="24"/>
         </w:rPr>
-        <w:t>Практическая часть фиксирует этот сценарий в архитектуре и в ограничениях, но не выдает KITTI без radar за полный сенсорный benchmark. Такой выбор ограничивает масштаб эксперимента, но делает результат проверяемым. Любой проверяющий может повторить подготовку данных, обучение, подбор порога и расчет метрик. Для исследовательского прототипа это важнее, чем заявлять качество тяжелой модели, которую нельзя воспроизвести на доступных ресурсах.</w:t>
+        <w:t>Для защиты темы «Отказ сенсора» важно, что аргументация не опирается на скрытые действия. Подготовка данных, обучение, оценка и анализ ростом uncertainty описаны так, чтобы проверяющий мог восстановить цепочку решений.</w:t>
       </w:r>
     </w:p>
     <w:p>
@@ -4716,7 +5167,35 @@
           <w:b w:val="0"/>
           <w:sz w:val="24"/>
         </w:rPr>
-        <w:t>Вывод для данного раздела состоит в том, что полная потеря всех сенсоров не дает надежного вывода. Этот вывод используется дальше при построении признаков reliability, uncertainty и risk score, а также при выборе метрик. В работе приоритет отдан recall и FNR, потому что пропуск критической сцены опаснее ложной тревоги, хотя большое число false positive также снижает доверие к системе.</w:t>
+        <w:t>Раздел «Отказ сенсора» также помогает подготовиться к вопросам защиты. Если спросят о практической значимости, ответ строится вокруг фактора, связанного с потерей одного источника данных; если спросят об ограничениях, нужно ссылаться на аспект, связанный с ростом uncertainty; если спросят о воспроизводимости, ключевым становится условие, связанное с переходом к осторожному режиму.</w:t>
+      </w:r>
+    </w:p>
+    <w:p>
+      <w:pPr>
+        <w:spacing w:line="360" w:lineRule="auto" w:after="0"/>
+        <w:ind w:firstLine="709"/>
+      </w:pPr>
+      <w:r>
+        <w:rPr>
+          <w:rFonts w:ascii="Times New Roman" w:hAnsi="Times New Roman" w:eastAsia="Times New Roman"/>
+          <w:b w:val="0"/>
+          <w:sz w:val="24"/>
+        </w:rPr>
+        <w:t>В практической части по теме «Отказ сенсора» выбранное решение фиксирует этот сценарий в архитектуре и в ограничениях, но не выдает KITTI без radar за полный сенсорный benchmark. Такой выбор для «Отказ сенсора» ограничивает масштаб эксперимента, но делает результат проверяемым: можно повторить подготовку данных, обучение, подбор порога и расчет метрик.</w:t>
+      </w:r>
+    </w:p>
+    <w:p>
+      <w:pPr>
+        <w:spacing w:line="360" w:lineRule="auto" w:after="0"/>
+        <w:ind w:firstLine="709"/>
+      </w:pPr>
+      <w:r>
+        <w:rPr>
+          <w:rFonts w:ascii="Times New Roman" w:hAnsi="Times New Roman" w:eastAsia="Times New Roman"/>
+          <w:b w:val="0"/>
+          <w:sz w:val="24"/>
+        </w:rPr>
+        <w:t>Следовательно, полная потеря всех сенсоров не дает надежного вывода. В дальнейшем это положение проверяется не декларативно, а через подготовку таблицы сценариев, обучение baseline и proposed моделей, сравнение метрик и анализ ошибок.</w:t>
       </w:r>
     </w:p>
     <w:p>
@@ -4742,7 +5221,7 @@
           <w:b w:val="0"/>
           <w:sz w:val="24"/>
         </w:rPr>
-        <w:t>Метрики важно рассматривать как инженерную задачу, а не как отдельный прием обработки изображения. В контуре ADAS ошибка возникает не только из-за неверного класса объекта. На результат влияет расстояние, положение относительно траектории, частичная видимость, качество геометрии и согласованность признаков разных сенсоров. Поэтому в работе выбран scenario-level уровень анализа, где дорожная сцена описывается набором признаков, а итогом является оценка критичности.</w:t>
+        <w:t>Раздел «Метрики» нужен для того, чтобы заранее определить границы метода. В этой теме такой подход снижает риск завышенных выводов: сильные стороны показываются через метрики, а слабые места выносятся в анализ ошибок и ограничения.</w:t>
       </w:r>
     </w:p>
     <w:p>
@@ -4756,7 +5235,7 @@
           <w:b w:val="0"/>
           <w:sz w:val="24"/>
         </w:rPr>
-        <w:t>Первый технический фактор связан с разной ценой FP и FN. Для обычной средней метрики такая деталь может быть почти незаметна, если основная часть тестового набора состоит из простых сцен. Для безопасности важны как раз редкие случаи, где ошибка восприятия ведет к поздней реакции. В этой работе такие случаи не маскируются общей точностью, а выделяются через отдельные признаки и через анализ false negative.</w:t>
+        <w:t>Для дальнейшей реализации важно, что фактор, связанный с разной ценой FP и FN, можно перевести в конкретное поле или расчетный признак. Это снижает разрыв между теоретическим разделом и программной частью.</w:t>
       </w:r>
     </w:p>
     <w:p>
@@ -4770,7 +5249,7 @@
           <w:b w:val="0"/>
           <w:sz w:val="24"/>
         </w:rPr>
-        <w:t>Второй фактор связан с необходимостью видеть confusion matrix. В реальной дорожной сцене сенсоры не дают одинаково надежную картину. Камера лучше передает цвет и контур, LiDAR дает геометрию, radar устойчив к части погодных факторов, но имеет меньшую детализацию. Если один источник выглядит уверенно, а другой показывает деградацию, итоговая система должна учитывать это расхождение и не сводить все к одному confidence.</w:t>
+        <w:t>Также важно, что аспект, связанный с необходимостью видеть confusion matrix, влияет на интерпретацию результата. Одинаковый класс объекта не означает одинаковый риск, если условия наблюдения и геометрия сцены различаются.</w:t>
       </w:r>
     </w:p>
     <w:p>
@@ -4784,7 +5263,7 @@
           <w:b w:val="0"/>
           <w:sz w:val="24"/>
         </w:rPr>
-        <w:t>Третий фактор связан с важностью ROC и PR анализа. Для ВКР это означает, что метод должен быть проверяемым и воспроизводимым. Поэтому эксперимент построен на аннотациях KITTI, где есть реальные классы, 2D и 3D координаты, occlusion и truncation. Эти признаки не заменяют полный мультимодальный поток, но позволяют честно обучить модель риска на реальных дорожных сценах.</w:t>
+        <w:t>Наконец, условие, связанное с важностью ROC и PR анализа, определяет, как будет устроена проверка. Итоговый вывод должен вытекать из сохраненных артефактов, а не из устного объяснения или ручной корректировки таблиц.</w:t>
       </w:r>
     </w:p>
     <w:p>
@@ -4798,7 +5277,7 @@
           <w:b w:val="0"/>
           <w:sz w:val="24"/>
         </w:rPr>
-        <w:t>Практическая часть сохраняет metrics.json, metrics.csv, confusion_matrix.csv, roc_points и pr_points. Такой выбор ограничивает масштаб эксперимента, но делает результат проверяемым. Любой проверяющий может повторить подготовку данных, обучение, подбор порога и расчет метрик. Для исследовательского прототипа это важнее, чем заявлять качество тяжелой модели, которую нельзя воспроизвести на доступных ресурсах.</w:t>
+        <w:t>Смысловой акцент раздела «Метрики» сделан на прослеживаемости. Для положения о важностью ROC и PR анализа должно быть понятно, какой артефакт его подтверждает: сценарная таблица, расчет признаков, validation/test split, метрика качества или список ошибок.</w:t>
       </w:r>
     </w:p>
     <w:p>
@@ -4812,7 +5291,35 @@
           <w:b w:val="0"/>
           <w:sz w:val="24"/>
         </w:rPr>
-        <w:t>Вывод для данного раздела состоит в том, что метрики должны строиться из результатов запуска. Этот вывод используется дальше при построении признаков reliability, uncertainty и risk score, а также при выборе метрик. В работе приоритет отдан recall и FNR, потому что пропуск критической сцены опаснее ложной тревоги, хотя большое число false positive также снижает доверие к системе.</w:t>
+        <w:t>При защите раздела «Метрики» удобно показать цепочку проверки: фактор, связанный с разной ценой FP и FN, фиксируется в данных, аспект, связанный с необходимостью видеть confusion matrix, объясняет надежность наблюдения, а условие, связанное с важностью ROC и PR анализа, задает границы эксперимента. Тогда тезис «метрики должны строиться из результатов запуска» выглядит как проверяемый вывод из подготовленной scenario table.</w:t>
+      </w:r>
+    </w:p>
+    <w:p>
+      <w:pPr>
+        <w:spacing w:line="360" w:lineRule="auto" w:after="0"/>
+        <w:ind w:firstLine="709"/>
+      </w:pPr>
+      <w:r>
+        <w:rPr>
+          <w:rFonts w:ascii="Times New Roman" w:hAnsi="Times New Roman" w:eastAsia="Times New Roman"/>
+          <w:b w:val="0"/>
+          <w:sz w:val="24"/>
+        </w:rPr>
+        <w:t>В программной реализации раздела «Метрики» выбранное решение сохраняет metrics.json, metrics.csv, confusion_matrix.csv, roc_points и pr_points. Это привязывает выводы к артефактам: данным, сценарной таблице, обученным весам, графикам и итоговым документам.</w:t>
+      </w:r>
+    </w:p>
+    <w:p>
+      <w:pPr>
+        <w:spacing w:line="360" w:lineRule="auto" w:after="0"/>
+        <w:ind w:firstLine="709"/>
+      </w:pPr>
+      <w:r>
+        <w:rPr>
+          <w:rFonts w:ascii="Times New Roman" w:hAnsi="Times New Roman" w:eastAsia="Times New Roman"/>
+          <w:b w:val="0"/>
+          <w:sz w:val="24"/>
+        </w:rPr>
+        <w:t>Раздел подводит к выводу: метрики должны строиться из результатов запуска. Именно это положение затем связывает подготовку данных, обучение модели и интерпретацию результатов.</w:t>
       </w:r>
     </w:p>
     <w:p>
@@ -4838,7 +5345,7 @@
           <w:b w:val="0"/>
           <w:sz w:val="24"/>
         </w:rPr>
-        <w:t>План эксперимента важно рассматривать как инженерную задачу, а не как отдельный прием обработки изображения. В контуре ADAS ошибка возникает не только из-за неверного класса объекта. На результат влияет расстояние, положение относительно траектории, частичная видимость, качество геометрии и согласованность признаков разных сенсоров. Поэтому в работе выбран scenario-level уровень анализа, где дорожная сцена описывается набором признаков, а итогом является оценка критичности.</w:t>
+        <w:t>Раздел «План эксперимента» нужен для того, чтобы заранее определить границы метода. В этой теме такой подход снижает риск завышенных выводов: сильные стороны показываются через метрики, а слабые места выносятся в анализ ошибок и ограничения.</w:t>
       </w:r>
     </w:p>
     <w:p>
@@ -4852,7 +5359,7 @@
           <w:b w:val="0"/>
           <w:sz w:val="24"/>
         </w:rPr>
-        <w:t>Первый технический фактор связан с фиксированным seed. Для обычной средней метрики такая деталь может быть почти незаметна, если основная часть тестового набора состоит из простых сцен. Для безопасности важны как раз редкие случаи, где ошибка восприятия ведет к поздней реакции. В этой работе такие случаи не маскируются общей точностью, а выделяются через отдельные признаки и через анализ false negative.</w:t>
+        <w:t>Для дальнейшей реализации важно, что фактор, связанный с фиксированным seed, можно перевести в конкретное поле или расчетный признак. Это снижает разрыв между теоретическим разделом и программной частью.</w:t>
       </w:r>
     </w:p>
     <w:p>
@@ -4866,7 +5373,7 @@
           <w:b w:val="0"/>
           <w:sz w:val="24"/>
         </w:rPr>
-        <w:t>Второй фактор связан с разделением train validation test. В реальной дорожной сцене сенсоры не дают одинаково надежную картину. Камера лучше передает цвет и контур, LiDAR дает геометрию, radar устойчив к части погодных факторов, но имеет меньшую детализацию. Если один источник выглядит уверенно, а другой показывает деградацию, итоговая система должна учитывать это расхождение и не сводить все к одному confidence.</w:t>
+        <w:t>Также важно, что аспект, связанный с разделением train validation test, влияет на интерпретацию результата. Одинаковый класс объекта не означает одинаковый риск, если условия наблюдения и геометрия сцены различаются.</w:t>
       </w:r>
     </w:p>
     <w:p>
@@ -4880,7 +5387,7 @@
           <w:b w:val="0"/>
           <w:sz w:val="24"/>
         </w:rPr>
-        <w:t>Третий фактор связан с обучением нескольких подходов. Для ВКР это означает, что метод должен быть проверяемым и воспроизводимым. Поэтому эксперимент построен на аннотациях KITTI, где есть реальные классы, 2D и 3D координаты, occlusion и truncation. Эти признаки не заменяют полный мультимодальный поток, но позволяют честно обучить модель риска на реальных дорожных сценах.</w:t>
+        <w:t>Наконец, условие, связанное с обучением нескольких подходов, определяет, как будет устроена проверка. Итоговый вывод должен вытекать из сохраненных артефактов, а не из устного объяснения или ручной корректировки таблиц.</w:t>
       </w:r>
     </w:p>
     <w:p>
@@ -4894,7 +5401,7 @@
           <w:b w:val="0"/>
           <w:sz w:val="24"/>
         </w:rPr>
-        <w:t>Практическая часть реализован командами prepare_data, train, evaluate, make_figures и export_results. Такой выбор ограничивает масштаб эксперимента, но делает результат проверяемым. Любой проверяющий может повторить подготовку данных, обучение, подбор порога и расчет метрик. Для исследовательского прототипа это важнее, чем заявлять качество тяжелой модели, которую нельзя воспроизвести на доступных ресурсах.</w:t>
+        <w:t>Смысловой акцент раздела «План эксперимента» сделан на прослеживаемости. Для положения о обучением нескольких подходов должно быть понятно, какой артефакт его подтверждает: сценарная таблица, расчет признаков, validation/test split, метрика качества или список ошибок.</w:t>
       </w:r>
     </w:p>
     <w:p>
@@ -4908,7 +5415,35 @@
           <w:b w:val="0"/>
           <w:sz w:val="24"/>
         </w:rPr>
-        <w:t>Вывод для данного раздела состоит в том, что результат должен повторяться на чистой копии репозитория. Этот вывод используется дальше при построении признаков reliability, uncertainty и risk score, а также при выборе метрик. В работе приоритет отдан recall и FNR, потому что пропуск критической сцены опаснее ложной тревоги, хотя большое число false positive также снижает доверие к системе.</w:t>
+        <w:t>При защите раздела «План эксперимента» удобно показать цепочку проверки: фактор, связанный с фиксированным seed, фиксируется в данных, аспект, связанный с разделением train validation test, объясняет надежность наблюдения, а условие, связанное с обучением нескольких подходов, задает границы эксперимента. Тогда тезис «результат должен повторяться на чистой копии репозитория» выглядит как проверяемый вывод из подготовленной scenario table.</w:t>
+      </w:r>
+    </w:p>
+    <w:p>
+      <w:pPr>
+        <w:spacing w:line="360" w:lineRule="auto" w:after="0"/>
+        <w:ind w:firstLine="709"/>
+      </w:pPr>
+      <w:r>
+        <w:rPr>
+          <w:rFonts w:ascii="Times New Roman" w:hAnsi="Times New Roman" w:eastAsia="Times New Roman"/>
+          <w:b w:val="0"/>
+          <w:sz w:val="24"/>
+        </w:rPr>
+        <w:t>В программной реализации раздела «План эксперимента» выбранное решение реализован командами prepare_data, train, evaluate, make_figures и export_results. Это привязывает выводы к артефактам: данным, сценарной таблице, обученным весам, графикам и итоговым документам.</w:t>
+      </w:r>
+    </w:p>
+    <w:p>
+      <w:pPr>
+        <w:spacing w:line="360" w:lineRule="auto" w:after="0"/>
+        <w:ind w:firstLine="709"/>
+      </w:pPr>
+      <w:r>
+        <w:rPr>
+          <w:rFonts w:ascii="Times New Roman" w:hAnsi="Times New Roman" w:eastAsia="Times New Roman"/>
+          <w:b w:val="0"/>
+          <w:sz w:val="24"/>
+        </w:rPr>
+        <w:t>Раздел подводит к выводу: результат должен повторяться на чистой копии репозитория. Именно это положение затем связывает подготовку данных, обучение модели и интерпретацию результатов.</w:t>
       </w:r>
     </w:p>
     <w:p>
@@ -4934,7 +5469,7 @@
           <w:b w:val="0"/>
           <w:sz w:val="24"/>
         </w:rPr>
-        <w:t>Этика и приватность важно рассматривать как инженерную задачу, а не как отдельный прием обработки изображения. В контуре ADAS ошибка возникает не только из-за неверного класса объекта. На результат влияет расстояние, положение относительно траектории, частичная видимость, качество геометрии и согласованность признаков разных сенсоров. Поэтому в работе выбран scenario-level уровень анализа, где дорожная сцена описывается набором признаков, а итогом является оценка критичности.</w:t>
+        <w:t>В теме «Этика и приватность» соединяются три уровня работы: данные, признаки и интерпретация результата. Для «Этика и приватность» такой порядок помогает не потерять связь между теоретическим описанием ADAS и тем, что реально проверяется в проекте.</w:t>
       </w:r>
     </w:p>
     <w:p>
@@ -4948,7 +5483,7 @@
           <w:b w:val="0"/>
           <w:sz w:val="24"/>
         </w:rPr>
-        <w:t>Первый технический фактор связан с дорожными изображениями с номерами и лицами. Для обычной средней метрики такая деталь может быть почти незаметна, если основная часть тестового набора состоит из простых сцен. Для безопасности важны как раз редкие случаи, где ошибка восприятия ведет к поздней реакции. В этой работе такие случаи не маскируются общей точностью, а выделяются через отдельные признаки и через анализ false negative.</w:t>
+        <w:t>В разделе «Этика и приватность» тезис, связанный с дорожными изображениями с номерами и лицами, помогает перейти от общей безопасности к измеряемому признаку. Такой переход важен: комиссия должна видеть, что утверждение подтверждается данными, а не только описанием предметной области.</w:t>
       </w:r>
     </w:p>
     <w:p>
@@ -4962,7 +5497,7 @@
           <w:b w:val="0"/>
           <w:sz w:val="24"/>
         </w:rPr>
-        <w:t>Второй фактор связан с лицензиями датасетов. В реальной дорожной сцене сенсоры не дают одинаково надежную картину. Камера лучше передает цвет и контур, LiDAR дает геометрию, radar устойчив к части погодных факторов, но имеет меньшую детализацию. Если один источник выглядит уверенно, а другой показывает деградацию, итоговая система должна учитывать это расхождение и не сводить все к одному confidence.</w:t>
+        <w:t>Тезис, связанный с лицензиями датасетов, добавляет к модели контекст надежности. Он показывает, какие ограничения возникают у восприятия, когда разные признаки сцены дают неполную или неодинаково устойчивую информацию.</w:t>
       </w:r>
     </w:p>
     <w:p>
@@ -4976,7 +5511,7 @@
           <w:b w:val="0"/>
           <w:sz w:val="24"/>
         </w:rPr>
-        <w:t>Третий фактор связан с опасностью неверной интерпретации прототипа. Для ВКР это означает, что метод должен быть проверяемым и воспроизводимым. Поэтому эксперимент построен на аннотациях KITTI, где есть реальные классы, 2D и 3D координаты, occlusion и truncation. Эти признаки не заменяют полный мультимодальный поток, но позволяют честно обучить модель риска на реальных дорожных сценах.</w:t>
+        <w:t>Тезис, связанный с опасностью неверной интерпретации прототипа, закрепляет экспериментальную дисциплину. Подготовка данных, обучение, выбор порога и оценка должны идти по фиксированному сценарию, иначе сравнение моделей теряет смысл.</w:t>
       </w:r>
     </w:p>
     <w:p>
@@ -4990,7 +5525,7 @@
           <w:b w:val="0"/>
           <w:sz w:val="24"/>
         </w:rPr>
-        <w:t>Практическая часть работает с аннотациями KITTI и не хранит изображения людей или номера автомобилей в репозитории. Такой выбор ограничивает масштаб эксперимента, но делает результат проверяемым. Любой проверяющий может повторить подготовку данных, обучение, подбор порога и расчет метрик. Для исследовательского прототипа это важнее, чем заявлять качество тяжелой модели, которую нельзя воспроизвести на доступных ресурсах.</w:t>
+        <w:t>В практической части материал о «Этика и приватность» используется как критерий инженерной состоятельности решения. Эксперимент по признаку лицензиями датасетов должен показать не только итоговую метрику, но и причину, по которой отдельные сцены получают высокий или низкий риск.</w:t>
       </w:r>
     </w:p>
     <w:p>
@@ -5004,7 +5539,35 @@
           <w:b w:val="0"/>
           <w:sz w:val="24"/>
         </w:rPr>
-        <w:t>Вывод для данного раздела состоит в том, что исследовательский результат нельзя выдавать за сертифицированную систему. Этот вывод используется дальше при построении признаков reliability, uncertainty и risk score, а также при выборе метрик. В работе приоритет отдан recall и FNR, потому что пропуск критической сцены опаснее ложной тревоги, хотя большое число false positive также снижает доверие к системе.</w:t>
+        <w:t>Практический смысл темы «Этика и приватность» проявляется в том, что по ней можно задать проверочный вопрос и найти ответ в артефактах. В данных отражается фактор, связанный с дорожными изображениями с номерами и лицами, в модели учитывается аспект, связанный с лицензиями датасетов, а в процедуре оценки закрепляется условие, связанное с опасностью неверной интерпретации прототипа.</w:t>
+      </w:r>
+    </w:p>
+    <w:p>
+      <w:pPr>
+        <w:spacing w:line="360" w:lineRule="auto" w:after="0"/>
+        <w:ind w:firstLine="709"/>
+      </w:pPr>
+      <w:r>
+        <w:rPr>
+          <w:rFonts w:ascii="Times New Roman" w:hAnsi="Times New Roman" w:eastAsia="Times New Roman"/>
+          <w:b w:val="0"/>
+          <w:sz w:val="24"/>
+        </w:rPr>
+        <w:t>В экспериментальной части темы «Этика и приватность» выбранное решение работает с аннотациями KITTI и не хранит изображения людей или номера автомобилей в репозитории. Проверка строится так, чтобы путь от исходных аннотаций до метрик не зависел от скрытых ручных шагов.</w:t>
+      </w:r>
+    </w:p>
+    <w:p>
+      <w:pPr>
+        <w:spacing w:line="360" w:lineRule="auto" w:after="0"/>
+        <w:ind w:firstLine="709"/>
+      </w:pPr>
+      <w:r>
+        <w:rPr>
+          <w:rFonts w:ascii="Times New Roman" w:hAnsi="Times New Roman" w:eastAsia="Times New Roman"/>
+          <w:b w:val="0"/>
+          <w:sz w:val="24"/>
+        </w:rPr>
+        <w:t>Для проектной части это означает, что исследовательский результат нельзя выдавать за сертифицированную систему. Поэтому в эксперименте важны не только итоговые числа, но и возможность объяснить, почему модель ошиблась в отдельных сценах.</w:t>
       </w:r>
     </w:p>
     <w:p>
@@ -5030,7 +5593,7 @@
           <w:b w:val="0"/>
           <w:sz w:val="24"/>
         </w:rPr>
-        <w:t>Промышленная проверка важно рассматривать как инженерную задачу, а не как отдельный прием обработки изображения. В контуре ADAS ошибка возникает не только из-за неверного класса объекта. На результат влияет расстояние, положение относительно траектории, частичная видимость, качество геометрии и согласованность признаков разных сенсоров. Поэтому в работе выбран scenario-level уровень анализа, где дорожная сцена описывается набором признаков, а итогом является оценка критичности.</w:t>
+        <w:t>Раздел «Промышленная проверка» нужен для того, чтобы заранее определить границы метода. В этой теме такой подход снижает риск завышенных выводов: сильные стороны показываются через метрики, а слабые места выносятся в анализ ошибок и ограничения.</w:t>
       </w:r>
     </w:p>
     <w:p>
@@ -5044,7 +5607,7 @@
           <w:b w:val="0"/>
           <w:sz w:val="24"/>
         </w:rPr>
-        <w:t>Первый технический фактор связан с реальными сенсорными потоками. Для обычной средней метрики такая деталь может быть почти незаметна, если основная часть тестового набора состоит из простых сцен. Для безопасности важны как раз редкие случаи, где ошибка восприятия ведет к поздней реакции. В этой работе такие случаи не маскируются общей точностью, а выделяются через отдельные признаки и через анализ false negative.</w:t>
+        <w:t>Для дальнейшей реализации важно, что фактор, связанный с реальными сенсорными потоками, можно перевести в конкретное поле или расчетный признак. Это снижает разрыв между теоретическим разделом и программной частью.</w:t>
       </w:r>
     </w:p>
     <w:p>
@@ -5058,7 +5621,7 @@
           <w:b w:val="0"/>
           <w:sz w:val="24"/>
         </w:rPr>
-        <w:t>Второй фактор связан с синхронизацией camera, LiDAR и radar. В реальной дорожной сцене сенсоры не дают одинаково надежную картину. Камера лучше передает цвет и контур, LiDAR дает геометрию, radar устойчив к части погодных факторов, но имеет меньшую детализацию. Если один источник выглядит уверенно, а другой показывает деградацию, итоговая система должна учитывать это расхождение и не сводить все к одному confidence.</w:t>
+        <w:t>Также важно, что аспект, связанный с синхронизацией camera, LiDAR и radar, влияет на интерпретацию результата. Одинаковый класс объекта не означает одинаковый риск, если условия наблюдения и геометрия сцены различаются.</w:t>
       </w:r>
     </w:p>
     <w:p>
@@ -5072,7 +5635,7 @@
           <w:b w:val="0"/>
           <w:sz w:val="24"/>
         </w:rPr>
-        <w:t>Третий фактор связан с проверкой отказов и деградации. Для ВКР это означает, что метод должен быть проверяемым и воспроизводимым. Поэтому эксперимент построен на аннотациях KITTI, где есть реальные классы, 2D и 3D координаты, occlusion и truncation. Эти признаки не заменяют полный мультимодальный поток, но позволяют честно обучить модель риска на реальных дорожных сценах.</w:t>
+        <w:t>Наконец, условие, связанное с проверкой отказов и деградации, определяет, как будет устроена проверка. Итоговый вывод должен вытекать из сохраненных артефактов, а не из устного объяснения или ручной корректировки таблиц.</w:t>
       </w:r>
     </w:p>
     <w:p>
@@ -5086,7 +5649,7 @@
           <w:b w:val="0"/>
           <w:sz w:val="24"/>
         </w:rPr>
-        <w:t>Практическая часть фиксирует границу между ВКР и будущей инженерной валидацией. Такой выбор ограничивает масштаб эксперимента, но делает результат проверяемым. Любой проверяющий может повторить подготовку данных, обучение, подбор порога и расчет метрик. Для исследовательского прототипа это важнее, чем заявлять качество тяжелой модели, которую нельзя воспроизвести на доступных ресурсах.</w:t>
+        <w:t>Смысловой акцент раздела «Промышленная проверка» сделан на прослеживаемости. Для положения о проверкой отказов и деградации должно быть понятно, какой артефакт его подтверждает: сценарная таблица, расчет признаков, validation/test split, метрика качества или список ошибок.</w:t>
       </w:r>
     </w:p>
     <w:p>
@@ -5100,7 +5663,35 @@
           <w:b w:val="0"/>
           <w:sz w:val="24"/>
         </w:rPr>
-        <w:t>Вывод для данного раздела состоит в том, что лабораторный прототип не равен сертифицированному компоненту. Этот вывод используется дальше при построении признаков reliability, uncertainty и risk score, а также при выборе метрик. В работе приоритет отдан recall и FNR, потому что пропуск критической сцены опаснее ложной тревоги, хотя большое число false positive также снижает доверие к системе.</w:t>
+        <w:t>При защите раздела «Промышленная проверка» удобно показать цепочку проверки: фактор, связанный с реальными сенсорными потоками, фиксируется в данных, аспект, связанный с синхронизацией camera, LiDAR и radar, объясняет надежность наблюдения, а условие, связанное с проверкой отказов и деградации, задает границы эксперимента. Тогда тезис «лабораторный прототип не равен сертифицированному компоненту» выглядит как проверяемый вывод из подготовленной scenario table.</w:t>
+      </w:r>
+    </w:p>
+    <w:p>
+      <w:pPr>
+        <w:spacing w:line="360" w:lineRule="auto" w:after="0"/>
+        <w:ind w:firstLine="709"/>
+      </w:pPr>
+      <w:r>
+        <w:rPr>
+          <w:rFonts w:ascii="Times New Roman" w:hAnsi="Times New Roman" w:eastAsia="Times New Roman"/>
+          <w:b w:val="0"/>
+          <w:sz w:val="24"/>
+        </w:rPr>
+        <w:t>В программной реализации раздела «Промышленная проверка» выбранное решение фиксирует границу между ВКР и будущей инженерной валидацией. Это привязывает выводы к артефактам: данным, сценарной таблице, обученным весам, графикам и итоговым документам.</w:t>
+      </w:r>
+    </w:p>
+    <w:p>
+      <w:pPr>
+        <w:spacing w:line="360" w:lineRule="auto" w:after="0"/>
+        <w:ind w:firstLine="709"/>
+      </w:pPr>
+      <w:r>
+        <w:rPr>
+          <w:rFonts w:ascii="Times New Roman" w:hAnsi="Times New Roman" w:eastAsia="Times New Roman"/>
+          <w:b w:val="0"/>
+          <w:sz w:val="24"/>
+        </w:rPr>
+        <w:t>Раздел подводит к выводу: лабораторный прототип не равен сертифицированному компоненту. Именно это положение затем связывает подготовку данных, обучение модели и интерпретацию результатов.</w:t>
       </w:r>
     </w:p>
     <w:p>
@@ -5126,7 +5717,7 @@
           <w:b w:val="0"/>
           <w:sz w:val="24"/>
         </w:rPr>
-        <w:t>Выводы по методике важно рассматривать как инженерную задачу, а не как отдельный прием обработки изображения. В контуре ADAS ошибка возникает не только из-за неверного класса объекта. На результат влияет расстояние, положение относительно траектории, частичная видимость, качество геометрии и согласованность признаков разных сенсоров. Поэтому в работе выбран scenario-level уровень анализа, где дорожная сцена описывается набором признаков, а итогом является оценка критичности.</w:t>
+        <w:t>Тема «Выводы по методике» рассматривается через scenario-level подход. Для «Выводы по методике» единицей анализа становится не отдельный пиксель или кадр сам по себе, а дорожная сцена с набором признаков риска, надежности и неопределенности.</w:t>
       </w:r>
     </w:p>
     <w:p>
@@ -5140,7 +5731,7 @@
           <w:b w:val="0"/>
           <w:sz w:val="24"/>
         </w:rPr>
-        <w:t>Первый технический фактор связан с формализацией critical_scene. Для обычной средней метрики такая деталь может быть почти незаметна, если основная часть тестового набора состоит из простых сцен. Для безопасности важны как раз редкие случаи, где ошибка восприятия ведет к поздней реакции. В этой работе такие случаи не маскируются общей точностью, а выделяются через отдельные признаки и через анализ false negative.</w:t>
+        <w:t>В инженерном смысле фактор, связанный с формализацией critical_scene, задает один из источников неопределенности. Для выбранного проекта важно не просто перечислить этот источник, а показать, как он превращается в численный признак.</w:t>
       </w:r>
     </w:p>
     <w:p>
@@ -5154,7 +5745,7 @@
           <w:b w:val="0"/>
           <w:sz w:val="24"/>
         </w:rPr>
-        <w:t>Второй фактор связан с разделением baseline и proposed. В реальной дорожной сцене сенсоры не дают одинаково надежную картину. Камера лучше передает цвет и контур, LiDAR дает геометрию, radar устойчив к части погодных факторов, но имеет меньшую детализацию. Если один источник выглядит уверенно, а другой показывает деградацию, итоговая система должна учитывать это расхождение и не сводить все к одному confidence.</w:t>
+        <w:t>Дополнительный слой связан с разделением baseline и proposed. Он помогает объяснить, почему одинаковая классификация объекта может иметь разный уровень доверия в разных дорожных условиях.</w:t>
       </w:r>
     </w:p>
     <w:p>
@@ -5168,7 +5759,7 @@
           <w:b w:val="0"/>
           <w:sz w:val="24"/>
         </w:rPr>
-        <w:t>Третий фактор связан с прозрачными формулами. Для ВКР это означает, что метод должен быть проверяемым и воспроизводимым. Поэтому эксперимент построен на аннотациях KITTI, где есть реальные классы, 2D и 3D координаты, occlusion и truncation. Эти признаки не заменяют полный мультимодальный поток, но позволяют честно обучить модель риска на реальных дорожных сценах.</w:t>
+        <w:t>Практическая проверка опирается на условие, связанное с прозрачными формулами. Благодаря этому методика остается ограниченной по масштабу, но прозрачной: входные данные, признаки и метрики можно восстановить из репозитория.</w:t>
       </w:r>
     </w:p>
     <w:p>
@@ -5182,7 +5773,7 @@
           <w:b w:val="0"/>
           <w:sz w:val="24"/>
         </w:rPr>
-        <w:t>Практическая часть переводит научную идею в конкретный план реализации. Такой выбор ограничивает масштаб эксперимента, но делает результат проверяемым. Любой проверяющий может повторить подготовку данных, обучение, подбор порога и расчет метрик. Для исследовательского прототипа это важнее, чем заявлять качество тяжелой модели, которую нельзя воспроизвести на доступных ресурсах.</w:t>
+        <w:t>Для защиты темы «Выводы по методике» важно, что аргументация не опирается на скрытые действия. Подготовка данных, обучение, оценка и анализ разделением baseline и proposed описаны так, чтобы проверяющий мог восстановить цепочку решений.</w:t>
       </w:r>
     </w:p>
     <w:p>
@@ -5196,7 +5787,35 @@
           <w:b w:val="0"/>
           <w:sz w:val="24"/>
         </w:rPr>
-        <w:t>Вывод для данного раздела состоит в том, что методика должна быть понятна без скрытых ручных шагов. Этот вывод используется дальше при построении признаков reliability, uncertainty и risk score, а также при выборе метрик. В работе приоритет отдан recall и FNR, потому что пропуск критической сцены опаснее ложной тревоги, хотя большое число false positive также снижает доверие к системе.</w:t>
+        <w:t>Раздел «Выводы по методике» также помогает подготовиться к вопросам защиты. Если спросят о практической значимости, ответ строится вокруг фактора, связанного с формализацией critical_scene; если спросят об ограничениях, нужно ссылаться на аспект, связанный с разделением baseline и proposed; если спросят о воспроизводимости, ключевым становится условие, связанное с прозрачными формулами.</w:t>
+      </w:r>
+    </w:p>
+    <w:p>
+      <w:pPr>
+        <w:spacing w:line="360" w:lineRule="auto" w:after="0"/>
+        <w:ind w:firstLine="709"/>
+      </w:pPr>
+      <w:r>
+        <w:rPr>
+          <w:rFonts w:ascii="Times New Roman" w:hAnsi="Times New Roman" w:eastAsia="Times New Roman"/>
+          <w:b w:val="0"/>
+          <w:sz w:val="24"/>
+        </w:rPr>
+        <w:t>В практической части по теме «Выводы по методике» выбранное решение переводит научную идею в конкретный план реализации. Такой выбор для «Выводы по методике» ограничивает масштаб эксперимента, но делает результат проверяемым: можно повторить подготовку данных, обучение, подбор порога и расчет метрик.</w:t>
+      </w:r>
+    </w:p>
+    <w:p>
+      <w:pPr>
+        <w:spacing w:line="360" w:lineRule="auto" w:after="0"/>
+        <w:ind w:firstLine="709"/>
+      </w:pPr>
+      <w:r>
+        <w:rPr>
+          <w:rFonts w:ascii="Times New Roman" w:hAnsi="Times New Roman" w:eastAsia="Times New Roman"/>
+          <w:b w:val="0"/>
+          <w:sz w:val="24"/>
+        </w:rPr>
+        <w:t>Следовательно, методика должна быть понятна без скрытых ручных шагов. В дальнейшем это положение проверяется не декларативно, а через подготовку таблицы сценариев, обучение baseline и proposed моделей, сравнение метрик и анализ ошибок.</w:t>
       </w:r>
     </w:p>
     <w:p>
@@ -5219,6 +5838,7 @@
         <w:tblStyle w:val="TableGrid"/>
         <w:tblW w:type="auto" w:w="0"/>
         <w:jc w:val="center"/>
+        <w:tblLayout w:type="fixed"/>
         <w:tblLook w:firstColumn="1" w:firstRow="1" w:lastColumn="0" w:lastRow="0" w:noHBand="0" w:noVBand="1" w:val="04A0"/>
       </w:tblPr>
       <w:tblGrid>
@@ -5792,7 +6412,7 @@
       <w:r>
         <w:drawing>
           <wp:inline xmlns:a="http://schemas.openxmlformats.org/drawingml/2006/main" xmlns:pic="http://schemas.openxmlformats.org/drawingml/2006/picture">
-            <wp:extent cx="5486400" cy="2824834"/>
+            <wp:extent cx="5486400" cy="2564763"/>
             <wp:docPr id="2" name="Picture 2"/>
             <wp:cNvGraphicFramePr>
               <a:graphicFrameLocks noChangeAspect="1"/>
@@ -5813,7 +6433,7 @@
                   <pic:spPr>
                     <a:xfrm>
                       <a:off x="0" y="0"/>
-                      <a:ext cx="5486400" cy="2824834"/>
+                      <a:ext cx="5486400" cy="2564763"/>
                     </a:xfrm>
                     <a:prstGeom prst="rect"/>
                   </pic:spPr>
@@ -5846,7 +6466,7 @@
       <w:r>
         <w:drawing>
           <wp:inline xmlns:a="http://schemas.openxmlformats.org/drawingml/2006/main" xmlns:pic="http://schemas.openxmlformats.org/drawingml/2006/picture">
-            <wp:extent cx="5486400" cy="3265796"/>
+            <wp:extent cx="5486400" cy="2748805"/>
             <wp:docPr id="3" name="Picture 3"/>
             <wp:cNvGraphicFramePr>
               <a:graphicFrameLocks noChangeAspect="1"/>
@@ -5867,7 +6487,7 @@
                   <pic:spPr>
                     <a:xfrm>
                       <a:off x="0" y="0"/>
-                      <a:ext cx="5486400" cy="3265796"/>
+                      <a:ext cx="5486400" cy="2748805"/>
                     </a:xfrm>
                     <a:prstGeom prst="rect"/>
                   </pic:spPr>
@@ -5890,7 +6510,7 @@
           <w:b w:val="0"/>
           <w:sz w:val="24"/>
         </w:rPr>
-        <w:t>Рисунок 3 – Use Case Diagram прототипа</w:t>
+        <w:t>Рисунок 3 – Сценарии использования прототипа</w:t>
       </w:r>
     </w:p>
     <w:p>
@@ -5933,7 +6553,7 @@
           <w:b w:val="0"/>
           <w:sz w:val="24"/>
         </w:rPr>
-        <w:t>Структура репозитория важно рассматривать как инженерную задачу, а не как отдельный прием обработки изображения. В контуре ADAS ошибка возникает не только из-за неверного класса объекта. На результат влияет расстояние, положение относительно траектории, частичная видимость, качество геометрии и согласованность признаков разных сенсоров. Поэтому в работе выбран scenario-level уровень анализа, где дорожная сцена описывается набором признаков, а итогом является оценка критичности.</w:t>
+        <w:t>Тема «Структура репозитория» рассматривается через scenario-level подход. Для «Структура репозитория» единицей анализа становится не отдельный пиксель или кадр сам по себе, а дорожная сцена с набором признаков риска, надежности и неопределенности.</w:t>
       </w:r>
     </w:p>
     <w:p>
@@ -5947,7 +6567,7 @@
           <w:b w:val="0"/>
           <w:sz w:val="24"/>
         </w:rPr>
-        <w:t>Первый технический фактор связан с разделением исходного кода и данных. Для обычной средней метрики такая деталь может быть почти незаметна, если основная часть тестового набора состоит из простых сцен. Для безопасности важны как раз редкие случаи, где ошибка восприятия ведет к поздней реакции. В этой работе такие случаи не маскируются общей точностью, а выделяются через отдельные признаки и через анализ false negative.</w:t>
+        <w:t>В инженерном смысле фактор, связанный с разделением исходного кода и данных, задает один из источников неопределенности. Для выбранного проекта важно не просто перечислить этот источник, а показать, как он превращается в численный признак.</w:t>
       </w:r>
     </w:p>
     <w:p>
@@ -5961,7 +6581,7 @@
           <w:b w:val="0"/>
           <w:sz w:val="24"/>
         </w:rPr>
-        <w:t>Второй фактор связан с наличием отдельных scripts. В реальной дорожной сцене сенсоры не дают одинаково надежную картину. Камера лучше передает цвет и контур, LiDAR дает геометрию, radar устойчив к части погодных факторов, но имеет меньшую детализацию. Если один источник выглядит уверенно, а другой показывает деградацию, итоговая система должна учитывать это расхождение и не сводить все к одному confidence.</w:t>
+        <w:t>Дополнительный слой связан с наличием отдельных scripts. Он помогает объяснить, почему одинаковая классификация объекта может иметь разный уровень доверия в разных дорожных условиях.</w:t>
       </w:r>
     </w:p>
     <w:p>
@@ -5975,7 +6595,7 @@
           <w:b w:val="0"/>
           <w:sz w:val="24"/>
         </w:rPr>
-        <w:t>Третий фактор связан с сохранением results и figures. Для ВКР это означает, что метод должен быть проверяемым и воспроизводимым. Поэтому эксперимент построен на аннотациях KITTI, где есть реальные классы, 2D и 3D координаты, occlusion и truncation. Эти признаки не заменяют полный мультимодальный поток, но позволяют честно обучить модель риска на реальных дорожных сценах.</w:t>
+        <w:t>Практическая проверка опирается на условие, связанное с сохранением results и figures. Благодаря этому методика остается ограниченной по масштабу, но прозрачной: входные данные, признаки и метрики можно восстановить из репозитория.</w:t>
       </w:r>
     </w:p>
     <w:p>
@@ -5989,7 +6609,7 @@
           <w:b w:val="0"/>
           <w:sz w:val="24"/>
         </w:rPr>
-        <w:t>Практическая часть содержит README, CHANGELOG, LICENSE, src, scripts, data, tests, results, figures и docs. Такой выбор ограничивает масштаб эксперимента, но делает результат проверяемым. Любой проверяющий может повторить подготовку данных, обучение, подбор порога и расчет метрик. Для исследовательского прототипа это важнее, чем заявлять качество тяжелой модели, которую нельзя воспроизвести на доступных ресурсах.</w:t>
+        <w:t>Для защиты темы «Структура репозитория» важно, что аргументация не опирается на скрытые действия. Подготовка данных, обучение, оценка и анализ наличием отдельных scripts описаны так, чтобы проверяющий мог восстановить цепочку решений.</w:t>
       </w:r>
     </w:p>
     <w:p>
@@ -6003,7 +6623,35 @@
           <w:b w:val="0"/>
           <w:sz w:val="24"/>
         </w:rPr>
-        <w:t>Вывод для данного раздела состоит в том, что проверяемость проекта зависит от ясной структуры. Этот вывод используется дальше при построении признаков reliability, uncertainty и risk score, а также при выборе метрик. В работе приоритет отдан recall и FNR, потому что пропуск критической сцены опаснее ложной тревоги, хотя большое число false positive также снижает доверие к системе.</w:t>
+        <w:t>Раздел «Структура репозитория» также помогает подготовиться к вопросам защиты. Если спросят о практической значимости, ответ строится вокруг фактора, связанного с разделением исходного кода и данных; если спросят об ограничениях, нужно ссылаться на аспект, связанный с наличием отдельных scripts; если спросят о воспроизводимости, ключевым становится условие, связанное с сохранением results и figures.</w:t>
+      </w:r>
+    </w:p>
+    <w:p>
+      <w:pPr>
+        <w:spacing w:line="360" w:lineRule="auto" w:after="0"/>
+        <w:ind w:firstLine="709"/>
+      </w:pPr>
+      <w:r>
+        <w:rPr>
+          <w:rFonts w:ascii="Times New Roman" w:hAnsi="Times New Roman" w:eastAsia="Times New Roman"/>
+          <w:b w:val="0"/>
+          <w:sz w:val="24"/>
+        </w:rPr>
+        <w:t>В практической части по теме «Структура репозитория» выбранное решение содержит README, CHANGELOG, LICENSE, src, scripts, data, tests, results, figures и docs. Такой выбор для «Структура репозитория» ограничивает масштаб эксперимента, но делает результат проверяемым: можно повторить подготовку данных, обучение, подбор порога и расчет метрик.</w:t>
+      </w:r>
+    </w:p>
+    <w:p>
+      <w:pPr>
+        <w:spacing w:line="360" w:lineRule="auto" w:after="0"/>
+        <w:ind w:firstLine="709"/>
+      </w:pPr>
+      <w:r>
+        <w:rPr>
+          <w:rFonts w:ascii="Times New Roman" w:hAnsi="Times New Roman" w:eastAsia="Times New Roman"/>
+          <w:b w:val="0"/>
+          <w:sz w:val="24"/>
+        </w:rPr>
+        <w:t>Следовательно, проверяемость проекта зависит от ясной структуры. В дальнейшем это положение проверяется не декларативно, а через подготовку таблицы сценариев, обучение baseline и proposed моделей, сравнение метрик и анализ ошибок.</w:t>
       </w:r>
     </w:p>
     <w:p>
@@ -6029,7 +6677,7 @@
           <w:b w:val="0"/>
           <w:sz w:val="24"/>
         </w:rPr>
-        <w:t>Инструменты реализации важно рассматривать как инженерную задачу, а не как отдельный прием обработки изображения. В контуре ADAS ошибка возникает не только из-за неверного класса объекта. На результат влияет расстояние, положение относительно траектории, частичная видимость, качество геометрии и согласованность признаков разных сенсоров. Поэтому в работе выбран scenario-level уровень анализа, где дорожная сцена описывается набором признаков, а итогом является оценка критичности.</w:t>
+        <w:t>Разбор темы «Инструменты реализации» строится вокруг надежности восприятия. В этой теме средняя метрика остается только ориентиром, потому что она плохо показывает редкие случаи с окклюзией, усечением объекта, неточной 3D-геометрией или сниженным качеством наблюдения.</w:t>
       </w:r>
     </w:p>
     <w:p>
@@ -6043,7 +6691,7 @@
           <w:b w:val="0"/>
           <w:sz w:val="24"/>
         </w:rPr>
-        <w:t>Первый технический фактор связан с Python и NumPy. Для обычной средней метрики такая деталь может быть почти незаметна, если основная часть тестового набора состоит из простых сцен. Для безопасности важны как раз редкие случаи, где ошибка восприятия ведет к поздней реакции. В этой работе такие случаи не маскируются общей точностью, а выделяются через отдельные признаки и через анализ false negative.</w:t>
+        <w:t>Фактор, связанный с Python и NumPy, важен для последующего анализа ошибок. Если критический случай встречается редко, средняя метрика может выглядеть приемлемо даже при заметном числе пропусков, поэтому в результатах отдельно показываются confusion matrix и error cases.</w:t>
       </w:r>
     </w:p>
     <w:p>
@@ -6057,7 +6705,7 @@
           <w:b w:val="0"/>
           <w:sz w:val="24"/>
         </w:rPr>
-        <w:t>Второй фактор связан с python-docx и matplotlib. В реальной дорожной сцене сенсоры не дают одинаково надежную картину. Камера лучше передает цвет и контур, LiDAR дает геометрию, radar устойчив к части погодных факторов, но имеет меньшую детализацию. Если один источник выглядит уверенно, а другой показывает деградацию, итоговая система должна учитывать это расхождение и не сводить все к одному confidence.</w:t>
+        <w:t>Фактор, связанный с python-docx и matplotlib, отражает согласованность признаков наблюдения и геометрии. Когда наблюдение деградирует, модель должна переходить к более осторожной оценке, а не сохранять прежний уровень доверия к сцене.</w:t>
       </w:r>
     </w:p>
     <w:p>
@@ -6071,7 +6719,7 @@
           <w:b w:val="0"/>
           <w:sz w:val="24"/>
         </w:rPr>
-        <w:t>Третий фактор связан с pytest для unit-тестов. Для ВКР это означает, что метод должен быть проверяемым и воспроизводимым. Поэтому эксперимент построен на аннотациях KITTI, где есть реальные классы, 2D и 3D координаты, occlusion и truncation. Эти признаки не заменяют полный мультимодальный поток, но позволяют честно обучить модель риска на реальных дорожных сценах.</w:t>
+        <w:t>Фактор, связанный с pytest для unit-тестов, задает предел применимости прототипа. Работа не подменяет промышленную сертификацию, но показывает воспроизводимый способ построить и проверить слой оценки критичности на реальных дорожных аннотациях.</w:t>
       </w:r>
     </w:p>
     <w:p>
@@ -6085,7 +6733,7 @@
           <w:b w:val="0"/>
           <w:sz w:val="24"/>
         </w:rPr>
-        <w:t>Практическая часть не требует GPU для основного эксперимента и работает на Windows. Такой выбор ограничивает масштаб эксперимента, но делает результат проверяемым. Любой проверяющий может повторить подготовку данных, обучение, подбор порога и расчет метрик. Для исследовательского прототипа это важнее, чем заявлять качество тяжелой модели, которую нельзя воспроизвести на доступных ресурсах.</w:t>
+        <w:t>Для раздела «Инструменты реализации» такой подход уменьшает риск декоративного обзора литературы. Теоретическая часть объясняет, почему для pytest для unit-тестов выбраны именно эти признаки, пороги и метрики.</w:t>
       </w:r>
     </w:p>
     <w:p>
@@ -6099,7 +6747,35 @@
           <w:b w:val="0"/>
           <w:sz w:val="24"/>
         </w:rPr>
-        <w:t>Вывод для данного раздела состоит в том, что минимальный стек снижает риск невоспроизводимости. Этот вывод используется дальше при построении признаков reliability, uncertainty и risk score, а также при выборе метрик. В работе приоритет отдан recall и FNR, потому что пропуск критической сцены опаснее ложной тревоги, хотя большое число false positive также снижает доверие к системе.</w:t>
+        <w:t>Для темы «Инструменты реализации» отдельного внимания заслуживает язык выводов. Здесь нельзя обещать промышленную безопасность: корректнее показать, как факторы, связанные с Python и NumPy, python-docx и matplotlib и pytest для unit-тестов, подтверждают ограниченный, но честно проверенный прототип.</w:t>
+      </w:r>
+    </w:p>
+    <w:p>
+      <w:pPr>
+        <w:spacing w:line="360" w:lineRule="auto" w:after="0"/>
+        <w:ind w:firstLine="709"/>
+      </w:pPr>
+      <w:r>
+        <w:rPr>
+          <w:rFonts w:ascii="Times New Roman" w:hAnsi="Times New Roman" w:eastAsia="Times New Roman"/>
+          <w:b w:val="0"/>
+          <w:sz w:val="24"/>
+        </w:rPr>
+        <w:t>На уровне ВКР раздел «Инструменты реализации» оформлен через решение, которое не требует GPU для основного эксперимента и работает на Windows. Оно оставляет место для будущего raw sensor pipeline, но текущие метрики не смешивает с планируемым расширением.</w:t>
+      </w:r>
+    </w:p>
+    <w:p>
+      <w:pPr>
+        <w:spacing w:line="360" w:lineRule="auto" w:after="0"/>
+        <w:ind w:firstLine="709"/>
+      </w:pPr>
+      <w:r>
+        <w:rPr>
+          <w:rFonts w:ascii="Times New Roman" w:hAnsi="Times New Roman" w:eastAsia="Times New Roman"/>
+          <w:b w:val="0"/>
+          <w:sz w:val="24"/>
+        </w:rPr>
+        <w:t>Для дальнейших разделов важно, что минимальный стек снижает риск невоспроизводимости. Этот результат используется при построении признаков reliability, uncertainty и risk score, а также при выборе метрик. Приоритет отдан recall и FNR, потому что пропуск критической сцены опаснее ложной тревоги, хотя частые false positive также снижают доверие к системе.</w:t>
       </w:r>
     </w:p>
     <w:p>
@@ -6125,7 +6801,7 @@
           <w:b w:val="0"/>
           <w:sz w:val="24"/>
         </w:rPr>
-        <w:t>Подготовка KITTI scenario table важно рассматривать как инженерную задачу, а не как отдельный прием обработки изображения. В контуре ADAS ошибка возникает не только из-за неверного класса объекта. На результат влияет расстояние, положение относительно траектории, частичная видимость, качество геометрии и согласованность признаков разных сенсоров. Поэтому в работе выбран scenario-level уровень анализа, где дорожная сцена описывается набором признаков, а итогом является оценка критичности.</w:t>
+        <w:t>Раздел «Подготовка KITTI scenario table» нужен для того, чтобы заранее определить границы метода. В этой теме такой подход снижает риск завышенных выводов: сильные стороны показываются через метрики, а слабые места выносятся в анализ ошибок и ограничения.</w:t>
       </w:r>
     </w:p>
     <w:p>
@@ -6139,7 +6815,7 @@
           <w:b w:val="0"/>
           <w:sz w:val="24"/>
         </w:rPr>
-        <w:t>Первый технический фактор связан с парсингом label_2. Для обычной средней метрики такая деталь может быть почти незаметна, если основная часть тестового набора состоит из простых сцен. Для безопасности важны как раз редкие случаи, где ошибка восприятия ведет к поздней реакции. В этой работе такие случаи не маскируются общей точностью, а выделяются через отдельные признаки и через анализ false negative.</w:t>
+        <w:t>Для дальнейшей реализации важно, что фактор, связанный с парсингом label_2, можно перевести в конкретное поле или расчетный признак. Это снижает разрыв между теоретическим разделом и программной частью.</w:t>
       </w:r>
     </w:p>
     <w:p>
@@ -6153,7 +6829,7 @@
           <w:b w:val="0"/>
           <w:sz w:val="24"/>
         </w:rPr>
-        <w:t>Второй фактор связан с расчетом признаков из 3D-аннотаций. В реальной дорожной сцене сенсоры не дают одинаково надежную картину. Камера лучше передает цвет и контур, LiDAR дает геометрию, radar устойчив к части погодных факторов, но имеет меньшую детализацию. Если один источник выглядит уверенно, а другой показывает деградацию, итоговая система должна учитывать это расхождение и не сводить все к одному confidence.</w:t>
+        <w:t>Также важно, что аспект, связанный с расчетом признаков из 3D-аннотаций, влияет на интерпретацию результата. Одинаковый класс объекта не означает одинаковый риск, если условия наблюдения и геометрия сцены различаются.</w:t>
       </w:r>
     </w:p>
     <w:p>
@@ -6167,7 +6843,7 @@
           <w:b w:val="0"/>
           <w:sz w:val="24"/>
         </w:rPr>
-        <w:t>Третий фактор связан с фиксированным split. Для ВКР это означает, что метод должен быть проверяемым и воспроизводимым. Поэтому эксперимент построен на аннотациях KITTI, где есть реальные классы, 2D и 3D координаты, occlusion и truncation. Эти признаки не заменяют полный мультимодальный поток, но позволяют честно обучить модель риска на реальных дорожных сценах.</w:t>
+        <w:t>Наконец, условие, связанное с фиксированным split, определяет, как будет устроена проверка. Итоговый вывод должен вытекать из сохраненных артефактов, а не из устного объяснения или ручной корректировки таблиц.</w:t>
       </w:r>
     </w:p>
     <w:p>
@@ -6181,7 +6857,7 @@
           <w:b w:val="0"/>
           <w:sz w:val="24"/>
         </w:rPr>
-        <w:t>Практическая часть создает таблицу из 7481 сцен с 2715 положительными метками. Такой выбор ограничивает масштаб эксперимента, но делает результат проверяемым. Любой проверяющий может повторить подготовку данных, обучение, подбор порога и расчет метрик. Для исследовательского прототипа это важнее, чем заявлять качество тяжелой модели, которую нельзя воспроизвести на доступных ресурсах.</w:t>
+        <w:t>Смысловой акцент раздела «Подготовка KITTI scenario table» сделан на прослеживаемости. Для положения о фиксированным split должно быть понятно, какой артефакт его подтверждает: сценарная таблица, расчет признаков, validation/test split, метрика качества или список ошибок.</w:t>
       </w:r>
     </w:p>
     <w:p>
@@ -6195,7 +6871,35 @@
           <w:b w:val="0"/>
           <w:sz w:val="24"/>
         </w:rPr>
-        <w:t>Вывод для данного раздела состоит в том, что данные должны быть реальными и повторяемыми. Этот вывод используется дальше при построении признаков reliability, uncertainty и risk score, а также при выборе метрик. В работе приоритет отдан recall и FNR, потому что пропуск критической сцены опаснее ложной тревоги, хотя большое число false positive также снижает доверие к системе.</w:t>
+        <w:t>При защите раздела «Подготовка KITTI scenario table» удобно показать цепочку проверки: фактор, связанный с парсингом label_2, фиксируется в данных, аспект, связанный с расчетом признаков из 3D-аннотаций, объясняет надежность наблюдения, а условие, связанное с фиксированным split, задает границы эксперимента. Тогда тезис «данные должны быть реальными и повторяемыми» выглядит как проверяемый вывод из подготовленной scenario table.</w:t>
+      </w:r>
+    </w:p>
+    <w:p>
+      <w:pPr>
+        <w:spacing w:line="360" w:lineRule="auto" w:after="0"/>
+        <w:ind w:firstLine="709"/>
+      </w:pPr>
+      <w:r>
+        <w:rPr>
+          <w:rFonts w:ascii="Times New Roman" w:hAnsi="Times New Roman" w:eastAsia="Times New Roman"/>
+          <w:b w:val="0"/>
+          <w:sz w:val="24"/>
+        </w:rPr>
+        <w:t>В программной реализации раздела «Подготовка KITTI scenario table» выбранное решение создает таблицу из 7481 сцен с 2715 положительными метками. Это привязывает выводы к артефактам: данным, сценарной таблице, обученным весам, графикам и итоговым документам.</w:t>
+      </w:r>
+    </w:p>
+    <w:p>
+      <w:pPr>
+        <w:spacing w:line="360" w:lineRule="auto" w:after="0"/>
+        <w:ind w:firstLine="709"/>
+      </w:pPr>
+      <w:r>
+        <w:rPr>
+          <w:rFonts w:ascii="Times New Roman" w:hAnsi="Times New Roman" w:eastAsia="Times New Roman"/>
+          <w:b w:val="0"/>
+          <w:sz w:val="24"/>
+        </w:rPr>
+        <w:t>Раздел подводит к выводу: данные должны быть реальными и повторяемыми. Именно это положение затем связывает подготовку данных, обучение модели и интерпретацию результатов.</w:t>
       </w:r>
     </w:p>
     <w:p>
@@ -6221,7 +6925,7 @@
           <w:b w:val="0"/>
           <w:sz w:val="24"/>
         </w:rPr>
-        <w:t>Обучение baseline, proposed и ablation важно рассматривать как инженерную задачу, а не как отдельный прием обработки изображения. В контуре ADAS ошибка возникает не только из-за неверного класса объекта. На результат влияет расстояние, положение относительно траектории, частичная видимость, качество геометрии и согласованность признаков разных сенсоров. Поэтому в работе выбран scenario-level уровень анализа, где дорожная сцена описывается набором признаков, а итогом является оценка критичности.</w:t>
+        <w:t>Раздел «Обучение baseline, proposed и ablation» вводит практическую рамку для дальнейшего эксперимента. При проверке темы «Обучение baseline, proposed и ablation» модель должна обучаться на реальных аннотациях, а пороги и метрики должны проверяться на отложенной выборке без ручной подгонки.</w:t>
       </w:r>
     </w:p>
     <w:p>
@@ -6235,7 +6939,7 @@
           <w:b w:val="0"/>
           <w:sz w:val="24"/>
         </w:rPr>
-        <w:t>Первый технический фактор связан с логистической регрессией. Для обычной средней метрики такая деталь может быть почти незаметна, если основная часть тестового набора состоит из простых сцен. Для безопасности важны как раз редкие случаи, где ошибка восприятия ведет к поздней реакции. В этой работе такие случаи не маскируются общей точностью, а выделяются через отдельные признаки и через анализ false negative.</w:t>
+        <w:t>Для темы «Обучение baseline, proposed и ablation» характеристика, связанная с логистической регрессией, выступает как проверяемый признак риска. Если ее игнорировать, часть сложных сцен будет выглядеть обычной, хотя для ADAS она требует отдельного внимания.</w:t>
       </w:r>
     </w:p>
     <w:p>
@@ -6249,7 +6953,7 @@
           <w:b w:val="0"/>
           <w:sz w:val="24"/>
         </w:rPr>
-        <w:t>Второй фактор связан с стандартизацией признаков. В реальной дорожной сцене сенсоры не дают одинаково надежную картину. Камера лучше передает цвет и контур, LiDAR дает геометрию, radar устойчив к части погодных факторов, но имеет меньшую детализацию. Если один источник выглядит уверенно, а другой показывает деградацию, итоговая система должна учитывать это расхождение и не сводить все к одному confidence.</w:t>
+        <w:t>Характеристика, связанная с стандартизацией признаков, уточняет качество сенсорной информации. В работе она нужна не для усложнения текста, а для объяснения, почему модель иногда должна снижать доверие к результату.</w:t>
       </w:r>
     </w:p>
     <w:p>
@@ -6263,7 +6967,7 @@
           <w:b w:val="0"/>
           <w:sz w:val="24"/>
         </w:rPr>
-        <w:t>Третий фактор связан с подбором порога на validation. Для ВКР это означает, что метод должен быть проверяемым и воспроизводимым. Поэтому эксперимент построен на аннотациях KITTI, где есть реальные классы, 2D и 3D координаты, occlusion и truncation. Эти признаки не заменяют полный мультимодальный поток, но позволяют честно обучить модель риска на реальных дорожных сценах.</w:t>
+        <w:t>Характеристика, связанная с подбором порога на validation, связывает методику с воспроизводимостью. Она задает условие, при котором эксперимент можно повторить без скрытых ручных решений и без подгонки test split.</w:t>
       </w:r>
     </w:p>
     <w:p>
@@ -6277,7 +6981,7 @@
           <w:b w:val="0"/>
           <w:sz w:val="24"/>
         </w:rPr>
-        <w:t>Практическая часть сохраняет веса и пороги в results/models.json. Такой выбор ограничивает масштаб эксперимента, но делает результат проверяемым. Любой проверяющий может повторить подготовку данных, обучение, подбор порога и расчет метрик. Для исследовательского прототипа это важнее, чем заявлять качество тяжелой модели, которую нельзя воспроизвести на доступных ресурсах.</w:t>
+        <w:t>Для логики раздела «Обучение baseline, proposed и ablation» этот фрагмент важен как переход от обзора к проверяемому эксперименту. Признак, связанный с логистической регрессией, должен быть вычислен из реальной разметки, попасть в таблицу сценариев и повлиять на решение модели.</w:t>
       </w:r>
     </w:p>
     <w:p>
@@ -6291,7 +6995,35 @@
           <w:b w:val="0"/>
           <w:sz w:val="24"/>
         </w:rPr>
-        <w:t>Вывод для данного раздела состоит в том, что сравнение моделей показывает вклад признаков надежности. Этот вывод используется дальше при построении признаков reliability, uncertainty и risk score, а также при выборе метрик. В работе приоритет отдан recall и FNR, потому что пропуск критической сцены опаснее ложной тревоги, хотя большое число false positive также снижает доверие к системе.</w:t>
+        <w:t>Для текста ВКР раздел «Обучение baseline, proposed и ablation» выполняет роль связки между обзором и реализацией. Он объясняет, почему фактор, связанный с логистической регрессией, не является второстепенной деталью, зачем учитывается аспект, связанный с стандартизацией признаков, и каким образом условие, связанное с подбором порога на validation, попадает в проверяемую часть работы.</w:t>
+      </w:r>
+    </w:p>
+    <w:p>
+      <w:pPr>
+        <w:spacing w:line="360" w:lineRule="auto" w:after="0"/>
+        <w:ind w:firstLine="709"/>
+      </w:pPr>
+      <w:r>
+        <w:rPr>
+          <w:rFonts w:ascii="Times New Roman" w:hAnsi="Times New Roman" w:eastAsia="Times New Roman"/>
+          <w:b w:val="0"/>
+          <w:sz w:val="24"/>
+        </w:rPr>
+        <w:t>На уровне прототипа для раздела «Обучение baseline, proposed и ablation» выбранное решение сохраняет веса и пороги в results/models.json. Оно сохраняет связь с реальной задачей ADAS и одновременно не подменяет промышленную валидацию исследовательским экспериментом.</w:t>
+      </w:r>
+    </w:p>
+    <w:p>
+      <w:pPr>
+        <w:spacing w:line="360" w:lineRule="auto" w:after="0"/>
+        <w:ind w:firstLine="709"/>
+      </w:pPr>
+      <w:r>
+        <w:rPr>
+          <w:rFonts w:ascii="Times New Roman" w:hAnsi="Times New Roman" w:eastAsia="Times New Roman"/>
+          <w:b w:val="0"/>
+          <w:sz w:val="24"/>
+        </w:rPr>
+        <w:t>Практический вывод раздела состоит в том, что сравнение моделей показывает вклад признаков надежности. Дальше это проверяется через признаки, сохраненные метрики и разбор конкретных FP/FN случаев.</w:t>
       </w:r>
     </w:p>
     <w:p>
@@ -6317,7 +7049,7 @@
           <w:b w:val="0"/>
           <w:sz w:val="24"/>
         </w:rPr>
-        <w:t>Настройка порогов важно рассматривать как инженерную задачу, а не как отдельный прием обработки изображения. В контуре ADAS ошибка возникает не только из-за неверного класса объекта. На результат влияет расстояние, положение относительно траектории, частичная видимость, качество геометрии и согласованность признаков разных сенсоров. Поэтому в работе выбран scenario-level уровень анализа, где дорожная сцена описывается набором признаков, а итогом является оценка критичности.</w:t>
+        <w:t>Раздел «Настройка порогов» вводит практическую рамку для дальнейшего эксперимента. При проверке темы «Настройка порогов» модель должна обучаться на реальных аннотациях, а пороги и метрики должны проверяться на отложенной выборке без ручной подгонки.</w:t>
       </w:r>
     </w:p>
     <w:p>
@@ -6331,7 +7063,7 @@
           <w:b w:val="0"/>
           <w:sz w:val="24"/>
         </w:rPr>
-        <w:t>Первый технический фактор связан с валидационным набором. Для обычной средней метрики такая деталь может быть почти незаметна, если основная часть тестового набора состоит из простых сцен. Для безопасности важны как раз редкие случаи, где ошибка восприятия ведет к поздней реакции. В этой работе такие случаи не маскируются общей точностью, а выделяются через отдельные признаки и через анализ false negative.</w:t>
+        <w:t>Для темы «Настройка порогов» характеристика, связанная с валидационным набором, выступает как проверяемый признак риска. Если ее игнорировать, часть сложных сцен будет выглядеть обычной, хотя для ADAS она требует отдельного внимания.</w:t>
       </w:r>
     </w:p>
     <w:p>
@@ -6345,7 +7077,7 @@
           <w:b w:val="0"/>
           <w:sz w:val="24"/>
         </w:rPr>
-        <w:t>Второй фактор связан с целевым балансом F1 и recall. В реальной дорожной сцене сенсоры не дают одинаково надежную картину. Камера лучше передает цвет и контур, LiDAR дает геометрию, radar устойчив к части погодных факторов, но имеет меньшую детализацию. Если один источник выглядит уверенно, а другой показывает деградацию, итоговая система должна учитывать это расхождение и не сводить все к одному confidence.</w:t>
+        <w:t>Характеристика, связанная с целевым балансом F1 и recall, уточняет качество сенсорной информации. В работе она нужна не для усложнения текста, а для объяснения, почему модель иногда должна снижать доверие к результату.</w:t>
       </w:r>
     </w:p>
     <w:p>
@@ -6359,7 +7091,7 @@
           <w:b w:val="0"/>
           <w:sz w:val="24"/>
         </w:rPr>
-        <w:t>Третий фактор связан с контролем false positive rate. Для ВКР это означает, что метод должен быть проверяемым и воспроизводимым. Поэтому эксперимент построен на аннотациях KITTI, где есть реальные классы, 2D и 3D координаты, occlusion и truncation. Эти признаки не заменяют полный мультимодальный поток, но позволяют честно обучить модель риска на реальных дорожных сценах.</w:t>
+        <w:t>Характеристика, связанная с контролем false positive rate, связывает методику с воспроизводимостью. Она задает условие, при котором эксперимент можно повторить без скрытых ручных решений и без подгонки test split.</w:t>
       </w:r>
     </w:p>
     <w:p>
@@ -6373,7 +7105,7 @@
           <w:b w:val="0"/>
           <w:sz w:val="24"/>
         </w:rPr>
-        <w:t>Практическая часть для primary model выбран threshold = 0.35. Такой выбор ограничивает масштаб эксперимента, но делает результат проверяемым. Любой проверяющий может повторить подготовку данных, обучение, подбор порога и расчет метрик. Для исследовательского прототипа это важнее, чем заявлять качество тяжелой модели, которую нельзя воспроизвести на доступных ресурсах.</w:t>
+        <w:t>Для логики раздела «Настройка порогов» этот фрагмент важен как переход от обзора к проверяемому эксперименту. Признак, связанный с валидационным набором, должен быть вычислен из реальной разметки, попасть в таблицу сценариев и повлиять на решение модели.</w:t>
       </w:r>
     </w:p>
     <w:p>
@@ -6387,7 +7119,35 @@
           <w:b w:val="0"/>
           <w:sz w:val="24"/>
         </w:rPr>
-        <w:t>Вывод для данного раздела состоит в том, что порог не подбирается на test split. Этот вывод используется дальше при построении признаков reliability, uncertainty и risk score, а также при выборе метрик. В работе приоритет отдан recall и FNR, потому что пропуск критической сцены опаснее ложной тревоги, хотя большое число false positive также снижает доверие к системе.</w:t>
+        <w:t>Для текста ВКР раздел «Настройка порогов» выполняет роль связки между обзором и реализацией. Он объясняет, почему фактор, связанный с валидационным набором, не является второстепенной деталью, зачем учитывается аспект, связанный с целевым балансом F1 и recall, и каким образом условие, связанное с контролем false positive rate, попадает в проверяемую часть работы.</w:t>
+      </w:r>
+    </w:p>
+    <w:p>
+      <w:pPr>
+        <w:spacing w:line="360" w:lineRule="auto" w:after="0"/>
+        <w:ind w:firstLine="709"/>
+      </w:pPr>
+      <w:r>
+        <w:rPr>
+          <w:rFonts w:ascii="Times New Roman" w:hAnsi="Times New Roman" w:eastAsia="Times New Roman"/>
+          <w:b w:val="0"/>
+          <w:sz w:val="24"/>
+        </w:rPr>
+        <w:t>На уровне прототипа для раздела «Настройка порогов» выбранное решение для primary model выбран threshold = 0.35. Оно сохраняет связь с реальной задачей ADAS и одновременно не подменяет промышленную валидацию исследовательским экспериментом.</w:t>
+      </w:r>
+    </w:p>
+    <w:p>
+      <w:pPr>
+        <w:spacing w:line="360" w:lineRule="auto" w:after="0"/>
+        <w:ind w:firstLine="709"/>
+      </w:pPr>
+      <w:r>
+        <w:rPr>
+          <w:rFonts w:ascii="Times New Roman" w:hAnsi="Times New Roman" w:eastAsia="Times New Roman"/>
+          <w:b w:val="0"/>
+          <w:sz w:val="24"/>
+        </w:rPr>
+        <w:t>Практический вывод раздела состоит в том, что порог не подбирается на test split. Дальше это проверяется через признаки, сохраненные метрики и разбор конкретных FP/FN случаев.</w:t>
       </w:r>
     </w:p>
     <w:p>
@@ -6413,7 +7173,7 @@
           <w:b w:val="0"/>
           <w:sz w:val="24"/>
         </w:rPr>
-        <w:t>Результаты эксперимента важно рассматривать как инженерную задачу, а не как отдельный прием обработки изображения. В контуре ADAS ошибка возникает не только из-за неверного класса объекта. На результат влияет расстояние, положение относительно траектории, частичная видимость, качество геометрии и согласованность признаков разных сенсоров. Поэтому в работе выбран scenario-level уровень анализа, где дорожная сцена описывается набором признаков, а итогом является оценка критичности.</w:t>
+        <w:t>Тема «Результаты эксперимента» связывает предметный обзор с будущим экспериментом. В работе именно «Результаты эксперимента» помогает перейти от общей точности распознавания к анализу ситуаций, где цена пропуска выше обычной ошибки классификации.</w:t>
       </w:r>
     </w:p>
     <w:p>
@@ -6427,7 +7187,7 @@
           <w:b w:val="0"/>
           <w:sz w:val="24"/>
         </w:rPr>
-        <w:t>Первый технический фактор связан с метриками test split. Для обычной средней метрики такая деталь может быть почти незаметна, если основная часть тестового набора состоит из простых сцен. Для безопасности важны как раз редкие случаи, где ошибка восприятия ведет к поздней реакции. В этой работе такие случаи не маскируются общей точностью, а выделяются через отдельные признаки и через анализ false negative.</w:t>
+        <w:t>Аспект, связанный с метриками test split, помогает объяснить, почему редкая сцена не должна растворяться в общей accuracy. Даже небольшое число пропущенных критических случаев может быть важнее красивого среднего значения по всему test split.</w:t>
       </w:r>
     </w:p>
     <w:p>
@@ -6441,7 +7201,7 @@
           <w:b w:val="0"/>
           <w:sz w:val="24"/>
         </w:rPr>
-        <w:t>Второй фактор связан с матрицей ошибок. В реальной дорожной сцене сенсоры не дают одинаково надежную картину. Камера лучше передает цвет и контур, LiDAR дает геометрию, radar устойчив к части погодных факторов, но имеет меньшую детализацию. Если один источник выглядит уверенно, а другой показывает деградацию, итоговая система должна учитывать это расхождение и не сводить все к одному confidence.</w:t>
+        <w:t>Аспект, связанный с матрицей ошибок, нужен для описания надежности наблюдения. Разные сенсоры деградируют неодинаково, поэтому модель должна учитывать uncertainty и reliability явно, а не прятать сомнение внутри итогового класса.</w:t>
       </w:r>
     </w:p>
     <w:p>
@@ -6455,7 +7215,7 @@
           <w:b w:val="0"/>
           <w:sz w:val="24"/>
         </w:rPr>
-        <w:t>Третий фактор связан с ROC и PR кривыми. Для ВКР это означает, что метод должен быть проверяемым и воспроизводимым. Поэтому эксперимент построен на аннотациях KITTI, где есть реальные классы, 2D и 3D координаты, occlusion и truncation. Эти признаки не заменяют полный мультимодальный поток, но позволяют честно обучить модель риска на реальных дорожных сценах.</w:t>
+        <w:t>Аспект, связанный с ROC и PR кривыми, делает эксперимент повторяемым. Признаки рассчитываются из зафиксированной разметки KITTI, поэтому другой проверяющий может пройти тот же путь от исходных label-файлов до метрик.</w:t>
       </w:r>
     </w:p>
     <w:p>
@@ -6469,7 +7229,7 @@
           <w:b w:val="0"/>
           <w:sz w:val="24"/>
         </w:rPr>
-        <w:t>Практическая часть primary model получила F1 = 0.911 и recall = 0.937. Такой выбор ограничивает масштаб эксперимента, но делает результат проверяемым. Любой проверяющий может повторить подготовку данных, обучение, подбор порога и расчет метрик. Для исследовательского прототипа это важнее, чем заявлять качество тяжелой модели, которую нельзя воспроизвести на доступных ресурсах.</w:t>
+        <w:t>Фрагмент о «Результаты эксперимента» нужен для связи между текстом и экспериментом. Если вводится признак метриками test split, дальше должно быть видно, где он рассчитывается, как попадает в обучение и какую роль играет при оценке test split.</w:t>
       </w:r>
     </w:p>
     <w:p>
@@ -6483,7 +7243,35 @@
           <w:b w:val="0"/>
           <w:sz w:val="24"/>
         </w:rPr>
-        <w:t>Вывод для данного раздела состоит в том, что числа должны совпадать с results. Этот вывод используется дальше при построении признаков reliability, uncertainty и risk score, а также при выборе метрик. В работе приоритет отдан recall и FNR, потому что пропуск критической сцены опаснее ложной тревоги, хотя большое число false positive также снижает доверие к системе.</w:t>
+        <w:t>Для раздела «Результаты эксперимента» важно заранее снять возможный вопрос о ручной подгонке. Если признаки, связанные с метриками test split и матрицей ошибок, формируются до обучения, а условие ROC и PR кривыми проверяется на отложенной выборке, то утверждение «числа должны совпадать с results» сохраняет инженерную прозрачность.</w:t>
+      </w:r>
+    </w:p>
+    <w:p>
+      <w:pPr>
+        <w:spacing w:line="360" w:lineRule="auto" w:after="0"/>
+        <w:ind w:firstLine="709"/>
+      </w:pPr>
+      <w:r>
+        <w:rPr>
+          <w:rFonts w:ascii="Times New Roman" w:hAnsi="Times New Roman" w:eastAsia="Times New Roman"/>
+          <w:b w:val="0"/>
+          <w:sz w:val="24"/>
+        </w:rPr>
+        <w:t>В проекте для темы «Результаты эксперимента» выбранное решение primary model получила F1 = 0.911 и recall = 0.937. Оно связывает теоретическую часть с командами запуска и показывает, что результаты получены на реальных аннотациях, а не на условном примере.</w:t>
+      </w:r>
+    </w:p>
+    <w:p>
+      <w:pPr>
+        <w:spacing w:line="360" w:lineRule="auto" w:after="0"/>
+        <w:ind w:firstLine="709"/>
+      </w:pPr>
+      <w:r>
+        <w:rPr>
+          <w:rFonts w:ascii="Times New Roman" w:hAnsi="Times New Roman" w:eastAsia="Times New Roman"/>
+          <w:b w:val="0"/>
+          <w:sz w:val="24"/>
+        </w:rPr>
+        <w:t>Главный результат раздела: числа должны совпадать с results. В следующих частях этот результат переводится в расчетные признаки, пороги и метрики качества.</w:t>
       </w:r>
     </w:p>
     <w:p>
@@ -6509,7 +7297,7 @@
           <w:b w:val="0"/>
           <w:sz w:val="24"/>
         </w:rPr>
-        <w:t>Анализ ошибок важно рассматривать как инженерную задачу, а не как отдельный прием обработки изображения. В контуре ADAS ошибка возникает не только из-за неверного класса объекта. На результат влияет расстояние, положение относительно траектории, частичная видимость, качество геометрии и согласованность признаков разных сенсоров. Поэтому в работе выбран scenario-level уровень анализа, где дорожная сцена описывается набором признаков, а итогом является оценка критичности.</w:t>
+        <w:t>В разделе «Анализ ошибок» акцент сделан на инженерной проверяемости. Для «Анализ ошибок» это особенно важно: если признак нельзя получить из разметки или воспроизвести в коде, он остается только общим требованием и не помогает доказать результат ВКР.</w:t>
       </w:r>
     </w:p>
     <w:p>
@@ -6523,7 +7311,7 @@
           <w:b w:val="0"/>
           <w:sz w:val="24"/>
         </w:rPr>
-        <w:t>Первый технический фактор связан с false positive на похожих на опасные сценах. Для обычной средней метрики такая деталь может быть почти незаметна, если основная часть тестового набора состоит из простых сцен. Для безопасности важны как раз редкие случаи, где ошибка восприятия ведет к поздней реакции. В этой работе такие случаи не маскируются общей точностью, а выделяются через отдельные признаки и через анализ false negative.</w:t>
+        <w:t>С точки зрения данных особенно важна связь с false positive на похожих на опасные сценах. Этот пункт определяет, какие строки scenario table будут считаться информативными для обучения и где может возникнуть риск пропуска критической сцены.</w:t>
       </w:r>
     </w:p>
     <w:p>
@@ -6537,7 +7325,7 @@
           <w:b w:val="0"/>
           <w:sz w:val="24"/>
         </w:rPr>
-        <w:t>Второй фактор связан с false negative при недостаточном score. В реальной дорожной сцене сенсоры не дают одинаково надежную картину. Камера лучше передает цвет и контур, LiDAR дает геометрию, radar устойчив к части погодных факторов, но имеет меньшую детализацию. Если один источник выглядит уверенно, а другой показывает деградацию, итоговая система должна учитывать это расхождение и не сводить все к одному confidence.</w:t>
+        <w:t>С точки зрения модели существенна связь с false negative при недостаточном score. Если такой признак ухудшается, итоговая оценка должна становиться осторожнее, иначе высокая средняя точность будет скрывать слабые места метода.</w:t>
       </w:r>
     </w:p>
     <w:p>
@@ -6551,7 +7339,7 @@
           <w:b w:val="0"/>
           <w:sz w:val="24"/>
         </w:rPr>
-        <w:t>Третий фактор связан с окклюзией и truncation. Для ВКР это означает, что метод должен быть проверяемым и воспроизводимым. Поэтому эксперимент построен на аннотациях KITTI, где есть реальные классы, 2D и 3D координаты, occlusion и truncation. Эти признаки не заменяют полный мультимодальный поток, но позволяют честно обучить модель риска на реальных дорожных сценах.</w:t>
+        <w:t>С точки зрения проверки значимым остается окклюзией и truncation. Он позволяет связать текст раздела с конкретными файлами, метриками и шагами запуска, а не оставлять выводы на уровне общих рассуждений.</w:t>
       </w:r>
     </w:p>
     <w:p>
@@ -6565,7 +7353,7 @@
           <w:b w:val="0"/>
           <w:sz w:val="24"/>
         </w:rPr>
-        <w:t>Практическая часть сохраняет results/error_cases.csv и docs/error_analysis.md. Такой выбор ограничивает масштаб эксперимента, но делает результат проверяемым. Любой проверяющий может повторить подготовку данных, обучение, подбор порога и расчет метрик. Для исследовательского прототипа это важнее, чем заявлять качество тяжелой модели, которую нельзя воспроизвести на доступных ресурсах.</w:t>
+        <w:t>Раздел «Анализ ошибок» также задает осторожность в формулировках. Методика работает на доступных реальных аннотациях, а утверждение о false positive на похожих на опасные сценах не выдается за промышленную сертификацию системы.</w:t>
       </w:r>
     </w:p>
     <w:p>
@@ -6579,7 +7367,35 @@
           <w:b w:val="0"/>
           <w:sz w:val="24"/>
         </w:rPr>
-        <w:t>Вывод для данного раздела состоит в том, что ошибки нужно разбирать по конкретным scene_id. Этот вывод используется дальше при построении признаков reliability, uncertainty и risk score, а также при выборе метрик. В работе приоритет отдан recall и FNR, потому что пропуск критической сцены опаснее ложной тревоги, хотя большое число false positive также снижает доверие к системе.</w:t>
+        <w:t>Проверяющему по разделу «Анализ ошибок» важно увидеть, что модель действительно обучалась на реальных данных. Поэтому фактор, связанный с false positive на похожих на опасные сценах, рассматривается как измеримый источник риска, аспект, связанный с false negative при недостаточном score, — как причина возможной ненадежности, а условие, связанное с окклюзией и truncation, — как основа повторяемой оценки.</w:t>
+      </w:r>
+    </w:p>
+    <w:p>
+      <w:pPr>
+        <w:spacing w:line="360" w:lineRule="auto" w:after="0"/>
+        <w:ind w:firstLine="709"/>
+      </w:pPr>
+      <w:r>
+        <w:rPr>
+          <w:rFonts w:ascii="Times New Roman" w:hAnsi="Times New Roman" w:eastAsia="Times New Roman"/>
+          <w:b w:val="0"/>
+          <w:sz w:val="24"/>
+        </w:rPr>
+        <w:t>В экспериментальном контуре тема «Анализ ошибок» реализована через решение, которое сохраняет results/error_cases.csv и docs/error_analysis.md. Такой контур удобен для защиты: по нему можно пройти от исходных данных до метрик и ошибок.</w:t>
+      </w:r>
+    </w:p>
+    <w:p>
+      <w:pPr>
+        <w:spacing w:line="360" w:lineRule="auto" w:after="0"/>
+        <w:ind w:firstLine="709"/>
+      </w:pPr>
+      <w:r>
+        <w:rPr>
+          <w:rFonts w:ascii="Times New Roman" w:hAnsi="Times New Roman" w:eastAsia="Times New Roman"/>
+          <w:b w:val="0"/>
+          <w:sz w:val="24"/>
+        </w:rPr>
+        <w:t>Таким образом, ошибки нужно разбирать по конкретным scene_id. Этот вывод задает логику следующего шага: перейти от описания проблемы к признакам, модели и проверке на test split. В работе сохраняется баланс между полнотой объяснения и честным указанием ограничений данных.</w:t>
       </w:r>
     </w:p>
     <w:p>
@@ -6605,7 +7421,7 @@
           <w:b w:val="0"/>
           <w:sz w:val="24"/>
         </w:rPr>
-        <w:t>Ограничения прототипа важно рассматривать как инженерную задачу, а не как отдельный прием обработки изображения. В контуре ADAS ошибка возникает не только из-за неверного класса объекта. На результат влияет расстояние, положение относительно траектории, частичная видимость, качество геометрии и согласованность признаков разных сенсоров. Поэтому в работе выбран scenario-level уровень анализа, где дорожная сцена описывается набором признаков, а итогом является оценка критичности.</w:t>
+        <w:t>Для раздела «Ограничения прототипа» ключевой вопрос состоит в том, какие признаки действительно можно проверить на данных. Поэтому рассуждение о «Ограничения прототипа» не сводится к описанию ADAS в целом: каждый тезис должен быть связан с измеряемой сценой и последующей оценкой модели.</w:t>
       </w:r>
     </w:p>
     <w:p>
@@ -6619,7 +7435,7 @@
           <w:b w:val="0"/>
           <w:sz w:val="24"/>
         </w:rPr>
-        <w:t>Первый технический фактор связан с отсутствием radar в KITTI. Для обычной средней метрики такая деталь может быть почти незаметна, если основная часть тестового набора состоит из простых сцен. Для безопасности важны как раз редкие случаи, где ошибка восприятия ведет к поздней реакции. В этой работе такие случаи не маскируются общей точностью, а выделяются через отдельные признаки и через анализ false negative.</w:t>
+        <w:t>Положение, связанное с отсутствием radar в KITTI, помогает отделить обычные сцены от случаев с более высокой ценой пропуска. Близкий или плохо видимый объект важнее для безопасности, чем далекий и хорошо наблюдаемый объект, поэтому recall и FNR рассматриваются рядом с общей точностью.</w:t>
       </w:r>
     </w:p>
     <w:p>
@@ -6633,7 +7449,7 @@
           <w:b w:val="0"/>
           <w:sz w:val="24"/>
         </w:rPr>
-        <w:t>Второй фактор связан с derived target вместо экспертной метки. В реальной дорожной сцене сенсоры не дают одинаково надежную картину. Камера лучше передает цвет и контур, LiDAR дает геометрию, radar устойчив к части погодных факторов, но имеет меньшую детализацию. Если один источник выглядит уверенно, а другой показывает деградацию, итоговая система должна учитывать это расхождение и не сводить все к одному confidence.</w:t>
+        <w:t>Положение, связанное с derived target вместо экспертной метки, добавляет к оценке контекст наблюдения. Сцена не является статичной картинкой: часть информации может теряться из-за условий съемки, окклюзии или усечения, и это должно отражаться в признаках надежности.</w:t>
       </w:r>
     </w:p>
     <w:p>
@@ -6647,7 +7463,7 @@
           <w:b w:val="0"/>
           <w:sz w:val="24"/>
         </w:rPr>
-        <w:t>Третий фактор связан с scenario-level признаками. Для ВКР это означает, что метод должен быть проверяемым и воспроизводимым. Поэтому эксперимент построен на аннотациях KITTI, где есть реальные классы, 2D и 3D координаты, occlusion и truncation. Эти признаки не заменяют полный мультимодальный поток, но позволяют честно обучить модель риска на реальных дорожных сценах.</w:t>
+        <w:t>Положение, связанное с scenario-level признаками, переводит общую идею в реализацию. Признаки должны извлекаться автоматически, порог выбирается на validation split, а итоговая оценка проверяется на test split без ручной настройки результата.</w:t>
       </w:r>
     </w:p>
     <w:p>
@@ -6661,7 +7477,7 @@
           <w:b w:val="0"/>
           <w:sz w:val="24"/>
         </w:rPr>
-        <w:t>Практическая часть честно отделяет результат обучения от будущей raw sensor модели. Такой выбор ограничивает масштаб эксперимента, но делает результат проверяемым. Любой проверяющий может повторить подготовку данных, обучение, подбор порога и расчет метрик. Для исследовательского прототипа это важнее, чем заявлять качество тяжелой модели, которую нельзя воспроизвести на доступных ресурсах.</w:t>
+        <w:t>Содержательная проверка темы «Ограничения прототипа» строится вокруг воспроизводимости. Вывод о derived target вместо экспертной метки должен иметь опору: таблицу сценариев, файл метрик, график, список ошибок или команду запуска, которую можно повторить.</w:t>
       </w:r>
     </w:p>
     <w:p>
@@ -6675,7 +7491,35 @@
           <w:b w:val="0"/>
           <w:sz w:val="24"/>
         </w:rPr>
-        <w:t>Вывод для данного раздела состоит в том, что исследовательский прототип не заменяет сертификацию. Этот вывод используется дальше при построении признаков reliability, uncertainty и risk score, а также при выборе метрик. В работе приоритет отдан recall и FNR, потому что пропуск критической сцены опаснее ложной тревоги, хотя большое число false positive также снижает доверие к системе.</w:t>
+        <w:t>Сильная сторона раздела «Ограничения прототипа» состоит в том, что он связывает предметную область с конкретными файлами проекта. Фактор, связанный с отсутствием radar в KITTI, должен быть виден в признаках; аспект, связанный с derived target вместо экспертной метки, — в интерпретации риска; условие, связанное с scenario-level признаками, — в воспроизводимости эксперимента.</w:t>
+      </w:r>
+    </w:p>
+    <w:p>
+      <w:pPr>
+        <w:spacing w:line="360" w:lineRule="auto" w:after="0"/>
+        <w:ind w:firstLine="709"/>
+      </w:pPr>
+      <w:r>
+        <w:rPr>
+          <w:rFonts w:ascii="Times New Roman" w:hAnsi="Times New Roman" w:eastAsia="Times New Roman"/>
+          <w:b w:val="0"/>
+          <w:sz w:val="24"/>
+        </w:rPr>
+        <w:t>В итоговой методике тема «Ограничения прототипа» закреплена так: выбранное решение честно отделяет результат обучения от будущей raw sensor модели. Поэтому выводы раздела можно проверить по сохраненным файлам, а не только по текстовому описанию.</w:t>
+      </w:r>
+    </w:p>
+    <w:p>
+      <w:pPr>
+        <w:spacing w:line="360" w:lineRule="auto" w:after="0"/>
+        <w:ind w:firstLine="709"/>
+      </w:pPr>
+      <w:r>
+        <w:rPr>
+          <w:rFonts w:ascii="Times New Roman" w:hAnsi="Times New Roman" w:eastAsia="Times New Roman"/>
+          <w:b w:val="0"/>
+          <w:sz w:val="24"/>
+        </w:rPr>
+        <w:t>Для дальнейшей методики зафиксировано, что исследовательский прототип не заменяет сертификацию. Это позволяет оценивать прототип не только по общей точности, но и по поведению на редких критических сценах.</w:t>
       </w:r>
     </w:p>
     <w:p>
@@ -6701,7 +7545,7 @@
           <w:b w:val="0"/>
           <w:sz w:val="24"/>
         </w:rPr>
-        <w:t>Воспроизводимость важно рассматривать как инженерную задачу, а не как отдельный прием обработки изображения. В контуре ADAS ошибка возникает не только из-за неверного класса объекта. На результат влияет расстояние, положение относительно траектории, частичная видимость, качество геометрии и согласованность признаков разных сенсоров. Поэтому в работе выбран scenario-level уровень анализа, где дорожная сцена описывается набором признаков, а итогом является оценка критичности.</w:t>
+        <w:t>Для раздела «Воспроизводимость» ключевой вопрос состоит в том, какие признаки действительно можно проверить на данных. Поэтому рассуждение о «Воспроизводимость» не сводится к описанию ADAS в целом: каждый тезис должен быть связан с измеряемой сценой и последующей оценкой модели.</w:t>
       </w:r>
     </w:p>
     <w:p>
@@ -6715,7 +7559,7 @@
           <w:b w:val="0"/>
           <w:sz w:val="24"/>
         </w:rPr>
-        <w:t>Первый технический фактор связан с командами полного цикла. Для обычной средней метрики такая деталь может быть почти незаметна, если основная часть тестового набора состоит из простых сцен. Для безопасности важны как раз редкие случаи, где ошибка восприятия ведет к поздней реакции. В этой работе такие случаи не маскируются общей точностью, а выделяются через отдельные признаки и через анализ false negative.</w:t>
+        <w:t>Положение, связанное с командами полного цикла, помогает отделить обычные сцены от случаев с более высокой ценой пропуска. Близкий или плохо видимый объект важнее для безопасности, чем далекий и хорошо наблюдаемый объект, поэтому recall и FNR рассматриваются рядом с общей точностью.</w:t>
       </w:r>
     </w:p>
     <w:p>
@@ -6729,7 +7573,7 @@
           <w:b w:val="0"/>
           <w:sz w:val="24"/>
         </w:rPr>
-        <w:t>Второй фактор связан с фиксированным seed. В реальной дорожной сцене сенсоры не дают одинаково надежную картину. Камера лучше передает цвет и контур, LiDAR дает геометрию, radar устойчив к части погодных факторов, но имеет меньшую детализацию. Если один источник выглядит уверенно, а другой показывает деградацию, итоговая система должна учитывать это расхождение и не сводить все к одному confidence.</w:t>
+        <w:t>Положение, связанное с фиксированным seed, добавляет к оценке контекст наблюдения. Сцена не является статичной картинкой: часть информации может теряться из-за условий съемки, окклюзии или усечения, и это должно отражаться в признаках надежности.</w:t>
       </w:r>
     </w:p>
     <w:p>
@@ -6743,7 +7587,7 @@
           <w:b w:val="0"/>
           <w:sz w:val="24"/>
         </w:rPr>
-        <w:t>Третий фактор связан с сохранением артефактов. Для ВКР это означает, что метод должен быть проверяемым и воспроизводимым. Поэтому эксперимент построен на аннотациях KITTI, где есть реальные классы, 2D и 3D координаты, occlusion и truncation. Эти признаки не заменяют полный мультимодальный поток, но позволяют честно обучить модель риска на реальных дорожных сценах.</w:t>
+        <w:t>Положение, связанное с сохранением артефактов, переводит общую идею в реализацию. Признаки должны извлекаться автоматически, порог выбирается на validation split, а итоговая оценка проверяется на test split без ручной настройки результата.</w:t>
       </w:r>
     </w:p>
     <w:p>
@@ -6757,7 +7601,7 @@
           <w:b w:val="0"/>
           <w:sz w:val="24"/>
         </w:rPr>
-        <w:t>Практическая часть описана в docs/reproducibility.md и подтверждена запуском тестов. Такой выбор ограничивает масштаб эксперимента, но делает результат проверяемым. Любой проверяющий может повторить подготовку данных, обучение, подбор порога и расчет метрик. Для исследовательского прототипа это важнее, чем заявлять качество тяжелой модели, которую нельзя воспроизвести на доступных ресурсах.</w:t>
+        <w:t>Содержательная проверка темы «Воспроизводимость» строится вокруг воспроизводимости. Вывод о фиксированным seed должен иметь опору: таблицу сценариев, файл метрик, график, список ошибок или команду запуска, которую можно повторить.</w:t>
       </w:r>
     </w:p>
     <w:p>
@@ -6771,7 +7615,35 @@
           <w:b w:val="0"/>
           <w:sz w:val="24"/>
         </w:rPr>
-        <w:t>Вывод для данного раздела состоит в том, что проверяющий должен получить те же метрики. Этот вывод используется дальше при построении признаков reliability, uncertainty и risk score, а также при выборе метрик. В работе приоритет отдан recall и FNR, потому что пропуск критической сцены опаснее ложной тревоги, хотя большое число false positive также снижает доверие к системе.</w:t>
+        <w:t>Сильная сторона раздела «Воспроизводимость» состоит в том, что он связывает предметную область с конкретными файлами проекта. Фактор, связанный с командами полного цикла, должен быть виден в признаках; аспект, связанный с фиксированным seed, — в интерпретации риска; условие, связанное с сохранением артефактов, — в воспроизводимости эксперимента.</w:t>
+      </w:r>
+    </w:p>
+    <w:p>
+      <w:pPr>
+        <w:spacing w:line="360" w:lineRule="auto" w:after="0"/>
+        <w:ind w:firstLine="709"/>
+      </w:pPr>
+      <w:r>
+        <w:rPr>
+          <w:rFonts w:ascii="Times New Roman" w:hAnsi="Times New Roman" w:eastAsia="Times New Roman"/>
+          <w:b w:val="0"/>
+          <w:sz w:val="24"/>
+        </w:rPr>
+        <w:t>В итоговой методике тема «Воспроизводимость» закреплена так: выбранное решение описана в docs/reproducibility.md и подтверждена запуском тестов. Поэтому выводы раздела можно проверить по сохраненным файлам, а не только по текстовому описанию.</w:t>
+      </w:r>
+    </w:p>
+    <w:p>
+      <w:pPr>
+        <w:spacing w:line="360" w:lineRule="auto" w:after="0"/>
+        <w:ind w:firstLine="709"/>
+      </w:pPr>
+      <w:r>
+        <w:rPr>
+          <w:rFonts w:ascii="Times New Roman" w:hAnsi="Times New Roman" w:eastAsia="Times New Roman"/>
+          <w:b w:val="0"/>
+          <w:sz w:val="24"/>
+        </w:rPr>
+        <w:t>Для дальнейшей методики зафиксировано, что проверяющий должен получить те же метрики. Это позволяет оценивать прототип не только по общей точности, но и по поведению на редких критических сценах.</w:t>
       </w:r>
     </w:p>
     <w:p>
@@ -6797,7 +7669,7 @@
           <w:b w:val="0"/>
           <w:sz w:val="24"/>
         </w:rPr>
-        <w:t>Сравнение с литературой важно рассматривать как инженерную задачу, а не как отдельный прием обработки изображения. В контуре ADAS ошибка возникает не только из-за неверного класса объекта. На результат влияет расстояние, положение относительно траектории, частичная видимость, качество геометрии и согласованность признаков разных сенсоров. Поэтому в работе выбран scenario-level уровень анализа, где дорожная сцена описывается набором признаков, а итогом является оценка критичности.</w:t>
+        <w:t>В разделе «Сравнение с литературой» акцент сделан на инженерной проверяемости. Для «Сравнение с литературой» это особенно важно: если признак нельзя получить из разметки или воспроизвести в коде, он остается только общим требованием и не помогает доказать результат ВКР.</w:t>
       </w:r>
     </w:p>
     <w:p>
@@ -6811,7 +7683,7 @@
           <w:b w:val="0"/>
           <w:sz w:val="24"/>
         </w:rPr>
-        <w:t>Первый технический фактор связан с разной задачей BEVFusion и scenario-level модели. Для обычной средней метрики такая деталь может быть почти незаметна, если основная часть тестового набора состоит из простых сцен. Для безопасности важны как раз редкие случаи, где ошибка восприятия ведет к поздней реакции. В этой работе такие случаи не маскируются общей точностью, а выделяются через отдельные признаки и через анализ false negative.</w:t>
+        <w:t>С точки зрения данных особенно важна связь с разной задачей BEVFusion и scenario-level модели. Этот пункт определяет, какие строки scenario table будут считаться информативными для обучения и где может возникнуть риск пропуска критической сцены.</w:t>
       </w:r>
     </w:p>
     <w:p>
@@ -6825,7 +7697,7 @@
           <w:b w:val="0"/>
           <w:sz w:val="24"/>
         </w:rPr>
-        <w:t>Второй фактор связан с влиянием деградации сенсоров. В реальной дорожной сцене сенсоры не дают одинаково надежную картину. Камера лучше передает цвет и контур, LiDAR дает геометрию, radar устойчив к части погодных факторов, но имеет меньшую детализацию. Если один источник выглядит уверенно, а другой показывает деградацию, итоговая система должна учитывать это расхождение и не сводить все к одному confidence.</w:t>
+        <w:t>С точки зрения модели существенна связь с влиянием деградации сенсоров. Если такой признак ухудшается, итоговая оценка должна становиться осторожнее, иначе высокая средняя точность будет скрывать слабые места метода.</w:t>
       </w:r>
     </w:p>
     <w:p>
@@ -6839,7 +7711,7 @@
           <w:b w:val="0"/>
           <w:sz w:val="24"/>
         </w:rPr>
-        <w:t>Третий фактор связан с нельзя смешивать чужие mAP и собственные метрики. Для ВКР это означает, что метод должен быть проверяемым и воспроизводимым. Поэтому эксперимент построен на аннотациях KITTI, где есть реальные классы, 2D и 3D координаты, occlusion и truncation. Эти признаки не заменяют полный мультимодальный поток, но позволяют честно обучить модель риска на реальных дорожных сценах.</w:t>
+        <w:t>С точки зрения проверки значимым остается нельзя смешивать чужие mAP и собственные метрики. Он позволяет связать текст раздела с конкретными файлами, метриками и шагами запуска, а не оставлять выводы на уровне общих рассуждений.</w:t>
       </w:r>
     </w:p>
     <w:p>
@@ -6853,7 +7725,7 @@
           <w:b w:val="0"/>
           <w:sz w:val="24"/>
         </w:rPr>
-        <w:t>Практическая часть использует данные Kumar et al., 2025 только как опубликованный пример. Такой выбор ограничивает масштаб эксперимента, но делает результат проверяемым. Любой проверяющий может повторить подготовку данных, обучение, подбор порога и расчет метрик. Для исследовательского прототипа это важнее, чем заявлять качество тяжелой модели, которую нельзя воспроизвести на доступных ресурсах.</w:t>
+        <w:t>Раздел «Сравнение с литературой» также задает осторожность в формулировках. Методика работает на доступных реальных аннотациях, а утверждение о разной задачей BEVFusion и scenario-level модели не выдается за промышленную сертификацию системы.</w:t>
       </w:r>
     </w:p>
     <w:p>
@@ -6867,7 +7739,35 @@
           <w:b w:val="0"/>
           <w:sz w:val="24"/>
         </w:rPr>
-        <w:t>Вывод для данного раздела состоит в том, что литературный график нужен как контекст. Этот вывод используется дальше при построении признаков reliability, uncertainty и risk score, а также при выборе метрик. В работе приоритет отдан recall и FNR, потому что пропуск критической сцены опаснее ложной тревоги, хотя большое число false positive также снижает доверие к системе.</w:t>
+        <w:t>Проверяющему по разделу «Сравнение с литературой» важно увидеть, что модель действительно обучалась на реальных данных. Поэтому фактор, связанный с разной задачей BEVFusion и scenario-level модели, рассматривается как измеримый источник риска, аспект, связанный с влиянием деградации сенсоров, — как причина возможной ненадежности, а условие, связанное с нельзя смешивать чужие mAP и собственные метрики, — как основа повторяемой оценки.</w:t>
+      </w:r>
+    </w:p>
+    <w:p>
+      <w:pPr>
+        <w:spacing w:line="360" w:lineRule="auto" w:after="0"/>
+        <w:ind w:firstLine="709"/>
+      </w:pPr>
+      <w:r>
+        <w:rPr>
+          <w:rFonts w:ascii="Times New Roman" w:hAnsi="Times New Roman" w:eastAsia="Times New Roman"/>
+          <w:b w:val="0"/>
+          <w:sz w:val="24"/>
+        </w:rPr>
+        <w:t>В экспериментальном контуре тема «Сравнение с литературой» реализована через решение, которое использует данные Kumar et al., 2025 только как опубликованный пример. Такой контур удобен для защиты: по нему можно пройти от исходных данных до метрик и ошибок.</w:t>
+      </w:r>
+    </w:p>
+    <w:p>
+      <w:pPr>
+        <w:spacing w:line="360" w:lineRule="auto" w:after="0"/>
+        <w:ind w:firstLine="709"/>
+      </w:pPr>
+      <w:r>
+        <w:rPr>
+          <w:rFonts w:ascii="Times New Roman" w:hAnsi="Times New Roman" w:eastAsia="Times New Roman"/>
+          <w:b w:val="0"/>
+          <w:sz w:val="24"/>
+        </w:rPr>
+        <w:t>Таким образом, литературный график нужен как контекст. Этот вывод задает логику следующего шага: перейти от описания проблемы к признакам, модели и проверке на test split. В работе сохраняется баланс между полнотой объяснения и честным указанием ограничений данных.</w:t>
       </w:r>
     </w:p>
     <w:p>
@@ -6893,7 +7793,7 @@
           <w:b w:val="0"/>
           <w:sz w:val="24"/>
         </w:rPr>
-        <w:t>Проверка целостности результатов важно рассматривать как инженерную задачу, а не как отдельный прием обработки изображения. В контуре ADAS ошибка возникает не только из-за неверного класса объекта. На результат влияет расстояние, положение относительно траектории, частичная видимость, качество геометрии и согласованность признаков разных сенсоров. Поэтому в работе выбран scenario-level уровень анализа, где дорожная сцена описывается набором признаков, а итогом является оценка критичности.</w:t>
+        <w:t>Тема «Проверка целостности результатов» рассматривается через scenario-level подход. Для «Проверка целостности результатов» единицей анализа становится не отдельный пиксель или кадр сам по себе, а дорожная сцена с набором признаков риска, надежности и неопределенности.</w:t>
       </w:r>
     </w:p>
     <w:p>
@@ -6907,7 +7807,7 @@
           <w:b w:val="0"/>
           <w:sz w:val="24"/>
         </w:rPr>
-        <w:t>Первый технический фактор связан с совпадением metrics.json и таблиц ВКР. Для обычной средней метрики такая деталь может быть почти незаметна, если основная часть тестового набора состоит из простых сцен. Для безопасности важны как раз редкие случаи, где ошибка восприятия ведет к поздней реакции. В этой работе такие случаи не маскируются общей точностью, а выделяются через отдельные признаки и через анализ false negative.</w:t>
+        <w:t>В инженерном смысле фактор, связанный с совпадением metrics.json и таблиц ВКР, задает один из источников неопределенности. Для выбранного проекта важно не просто перечислить этот источник, а показать, как он превращается в численный признак.</w:t>
       </w:r>
     </w:p>
     <w:p>
@@ -6921,7 +7821,7 @@
           <w:b w:val="0"/>
           <w:sz w:val="24"/>
         </w:rPr>
-        <w:t>Второй фактор связан с наличием raw predictions. В реальной дорожной сцене сенсоры не дают одинаково надежную картину. Камера лучше передает цвет и контур, LiDAR дает геометрию, radar устойчив к части погодных факторов, но имеет меньшую детализацию. Если один источник выглядит уверенно, а другой показывает деградацию, итоговая система должна учитывать это расхождение и не сводить все к одному confidence.</w:t>
+        <w:t>Дополнительный слой связан с наличием raw predictions. Он помогает объяснить, почему одинаковая классификация объекта может иметь разный уровень доверия в разных дорожных условиях.</w:t>
       </w:r>
     </w:p>
     <w:p>
@@ -6935,7 +7835,7 @@
           <w:b w:val="0"/>
           <w:sz w:val="24"/>
         </w:rPr>
-        <w:t>Третий фактор связан с отдельным сохранением error cases. Для ВКР это означает, что метод должен быть проверяемым и воспроизводимым. Поэтому эксперимент построен на аннотациях KITTI, где есть реальные классы, 2D и 3D координаты, occlusion и truncation. Эти признаки не заменяют полный мультимодальный поток, но позволяют честно обучить модель риска на реальных дорожных сценах.</w:t>
+        <w:t>Практическая проверка опирается на условие, связанное с отдельным сохранением error cases. Благодаря этому методика остается ограниченной по масштабу, но прозрачной: входные данные, признаки и метрики можно восстановить из репозитория.</w:t>
       </w:r>
     </w:p>
     <w:p>
@@ -6949,7 +7849,7 @@
           <w:b w:val="0"/>
           <w:sz w:val="24"/>
         </w:rPr>
-        <w:t>Практическая часть использует results как единый источник чисел для отчета и презентации. Такой выбор ограничивает масштаб эксперимента, но делает результат проверяемым. Любой проверяющий может повторить подготовку данных, обучение, подбор порога и расчет метрик. Для исследовательского прототипа это важнее, чем заявлять качество тяжелой модели, которую нельзя воспроизвести на доступных ресурсах.</w:t>
+        <w:t>Для защиты темы «Проверка целостности результатов» важно, что аргументация не опирается на скрытые действия. Подготовка данных, обучение, оценка и анализ наличием raw predictions описаны так, чтобы проверяющий мог восстановить цепочку решений.</w:t>
       </w:r>
     </w:p>
     <w:p>
@@ -6963,7 +7863,35 @@
           <w:b w:val="0"/>
           <w:sz w:val="24"/>
         </w:rPr>
-        <w:t>Вывод для данного раздела состоит в том, что результаты должны прослеживаться до команд запуска. Этот вывод используется дальше при построении признаков reliability, uncertainty и risk score, а также при выборе метрик. В работе приоритет отдан recall и FNR, потому что пропуск критической сцены опаснее ложной тревоги, хотя большое число false positive также снижает доверие к системе.</w:t>
+        <w:t>Раздел «Проверка целостности результатов» также помогает подготовиться к вопросам защиты. Если спросят о практической значимости, ответ строится вокруг фактора, связанного с совпадением metrics.json и таблиц ВКР; если спросят об ограничениях, нужно ссылаться на аспект, связанный с наличием raw predictions; если спросят о воспроизводимости, ключевым становится условие, связанное с отдельным сохранением error cases.</w:t>
+      </w:r>
+    </w:p>
+    <w:p>
+      <w:pPr>
+        <w:spacing w:line="360" w:lineRule="auto" w:after="0"/>
+        <w:ind w:firstLine="709"/>
+      </w:pPr>
+      <w:r>
+        <w:rPr>
+          <w:rFonts w:ascii="Times New Roman" w:hAnsi="Times New Roman" w:eastAsia="Times New Roman"/>
+          <w:b w:val="0"/>
+          <w:sz w:val="24"/>
+        </w:rPr>
+        <w:t>В практической части по теме «Проверка целостности результатов» выбранное решение использует results как единый источник чисел для отчета и презентации. Такой выбор для «Проверка целостности результатов» ограничивает масштаб эксперимента, но делает результат проверяемым: можно повторить подготовку данных, обучение, подбор порога и расчет метрик.</w:t>
+      </w:r>
+    </w:p>
+    <w:p>
+      <w:pPr>
+        <w:spacing w:line="360" w:lineRule="auto" w:after="0"/>
+        <w:ind w:firstLine="709"/>
+      </w:pPr>
+      <w:r>
+        <w:rPr>
+          <w:rFonts w:ascii="Times New Roman" w:hAnsi="Times New Roman" w:eastAsia="Times New Roman"/>
+          <w:b w:val="0"/>
+          <w:sz w:val="24"/>
+        </w:rPr>
+        <w:t>Следовательно, результаты должны прослеживаться до команд запуска. В дальнейшем это положение проверяется не декларативно, а через подготовку таблицы сценариев, обучение baseline и proposed моделей, сравнение метрик и анализ ошибок.</w:t>
       </w:r>
     </w:p>
     <w:p>
@@ -6989,7 +7917,7 @@
           <w:b w:val="0"/>
           <w:sz w:val="24"/>
         </w:rPr>
-        <w:t>Перенос на raw sensor pipeline важно рассматривать как инженерную задачу, а не как отдельный прием обработки изображения. В контуре ADAS ошибка возникает не только из-за неверного класса объекта. На результат влияет расстояние, положение относительно траектории, частичная видимость, качество геометрии и согласованность признаков разных сенсоров. Поэтому в работе выбран scenario-level уровень анализа, где дорожная сцена описывается набором признаков, а итогом является оценка критичности.</w:t>
+        <w:t>Для раздела «Перенос на raw sensor pipeline» ключевой вопрос состоит в том, какие признаки действительно можно проверить на данных. Поэтому рассуждение о «Перенос на raw sensor pipeline» не сводится к описанию ADAS в целом: каждый тезис должен быть связан с измеряемой сценой и последующей оценкой модели.</w:t>
       </w:r>
     </w:p>
     <w:p>
@@ -7003,7 +7931,7 @@
           <w:b w:val="0"/>
           <w:sz w:val="24"/>
         </w:rPr>
-        <w:t>Первый технический фактор связан с необходимостью изображений и облаков точек. Для обычной средней метрики такая деталь может быть почти незаметна, если основная часть тестового набора состоит из простых сцен. Для безопасности важны как раз редкие случаи, где ошибка восприятия ведет к поздней реакции. В этой работе такие случаи не маскируются общей точностью, а выделяются через отдельные признаки и через анализ false negative.</w:t>
+        <w:t>Положение, связанное с необходимостью изображений и облаков точек, помогает отделить обычные сцены от случаев с более высокой ценой пропуска. Близкий или плохо видимый объект важнее для безопасности, чем далекий и хорошо наблюдаемый объект, поэтому recall и FNR рассматриваются рядом с общей точностью.</w:t>
       </w:r>
     </w:p>
     <w:p>
@@ -7017,7 +7945,7 @@
           <w:b w:val="0"/>
           <w:sz w:val="24"/>
         </w:rPr>
-        <w:t>Второй фактор связан с использованием GPU для тяжелых моделей. В реальной дорожной сцене сенсоры не дают одинаково надежную картину. Камера лучше передает цвет и контур, LiDAR дает геометрию, radar устойчив к части погодных факторов, но имеет меньшую детализацию. Если один источник выглядит уверенно, а другой показывает деградацию, итоговая система должна учитывать это расхождение и не сводить все к одному confidence.</w:t>
+        <w:t>Положение, связанное с использованием GPU для тяжелых моделей, добавляет к оценке контекст наблюдения. Сцена не является статичной картинкой: часть информации может теряться из-за условий съемки, окклюзии или усечения, и это должно отражаться в признаках надежности.</w:t>
       </w:r>
     </w:p>
     <w:p>
@@ -7031,7 +7959,7 @@
           <w:b w:val="0"/>
           <w:sz w:val="24"/>
         </w:rPr>
-        <w:t>Третий фактор связан с добавлением radar и погодных условий. Для ВКР это означает, что метод должен быть проверяемым и воспроизводимым. Поэтому эксперимент построен на аннотациях KITTI, где есть реальные классы, 2D и 3D координаты, occlusion и truncation. Эти признаки не заменяют полный мультимодальный поток, но позволяют честно обучить модель риска на реальных дорожных сценах.</w:t>
+        <w:t>Положение, связанное с добавлением radar и погодных условий, переводит общую идею в реализацию. Признаки должны извлекаться автоматически, порог выбирается на validation split, а итоговая оценка проверяется на test split без ручной настройки результата.</w:t>
       </w:r>
     </w:p>
     <w:p>
@@ -7045,7 +7973,7 @@
           <w:b w:val="0"/>
           <w:sz w:val="24"/>
         </w:rPr>
-        <w:t>Практическая часть описывает роль доступной AMD Radeon RX 7700 XT как ресурса для будущих экспериментов, не смешивая это с текущими метриками. Такой выбор ограничивает масштаб эксперимента, но делает результат проверяемым. Любой проверяющий может повторить подготовку данных, обучение, подбор порога и расчет метрик. Для исследовательского прототипа это важнее, чем заявлять качество тяжелой модели, которую нельзя воспроизвести на доступных ресурсах.</w:t>
+        <w:t>Содержательная проверка темы «Перенос на raw sensor pipeline» строится вокруг воспроизводимости. Вывод о использованием GPU для тяжелых моделей должен иметь опору: таблицу сценариев, файл метрик, график, список ошибок или команду запуска, которую можно повторить.</w:t>
       </w:r>
     </w:p>
     <w:p>
@@ -7059,7 +7987,35 @@
           <w:b w:val="0"/>
           <w:sz w:val="24"/>
         </w:rPr>
-        <w:t>Вывод для данного раздела состоит в том, что текущий результат является базой для следующего инженерного шага. Этот вывод используется дальше при построении признаков reliability, uncertainty и risk score, а также при выборе метрик. В работе приоритет отдан recall и FNR, потому что пропуск критической сцены опаснее ложной тревоги, хотя большое число false positive также снижает доверие к системе.</w:t>
+        <w:t>Сильная сторона раздела «Перенос на raw sensor pipeline» состоит в том, что он связывает предметную область с конкретными файлами проекта. Фактор, связанный с необходимостью изображений и облаков точек, должен быть виден в признаках; аспект, связанный с использованием GPU для тяжелых моделей, — в интерпретации риска; условие, связанное с добавлением radar и погодных условий, — в воспроизводимости эксперимента.</w:t>
+      </w:r>
+    </w:p>
+    <w:p>
+      <w:pPr>
+        <w:spacing w:line="360" w:lineRule="auto" w:after="0"/>
+        <w:ind w:firstLine="709"/>
+      </w:pPr>
+      <w:r>
+        <w:rPr>
+          <w:rFonts w:ascii="Times New Roman" w:hAnsi="Times New Roman" w:eastAsia="Times New Roman"/>
+          <w:b w:val="0"/>
+          <w:sz w:val="24"/>
+        </w:rPr>
+        <w:t>В итоговой методике тема «Перенос на raw sensor pipeline» закреплена так: выбранное решение описывает роль доступной AMD Radeon RX 7700 XT как ресурса для будущих экспериментов, не смешивая это с текущими метриками. Поэтому выводы раздела можно проверить по сохраненным файлам, а не только по текстовому описанию.</w:t>
+      </w:r>
+    </w:p>
+    <w:p>
+      <w:pPr>
+        <w:spacing w:line="360" w:lineRule="auto" w:after="0"/>
+        <w:ind w:firstLine="709"/>
+      </w:pPr>
+      <w:r>
+        <w:rPr>
+          <w:rFonts w:ascii="Times New Roman" w:hAnsi="Times New Roman" w:eastAsia="Times New Roman"/>
+          <w:b w:val="0"/>
+          <w:sz w:val="24"/>
+        </w:rPr>
+        <w:t>Для дальнейшей методики зафиксировано, что текущий результат является базой для следующего инженерного шага. Это позволяет оценивать прототип не только по общей точности, но и по поведению на редких критических сценах.</w:t>
       </w:r>
     </w:p>
     <w:p>
@@ -7082,6 +8038,7 @@
         <w:tblStyle w:val="TableGrid"/>
         <w:tblW w:type="auto" w:w="0"/>
         <w:jc w:val="center"/>
+        <w:tblLayout w:type="fixed"/>
         <w:tblLook w:firstColumn="1" w:firstRow="1" w:lastColumn="0" w:lastRow="0" w:noHBand="0" w:noVBand="1" w:val="04A0"/>
       </w:tblPr>
       <w:tblGrid>
@@ -7403,21 +8360,19 @@
         <w:tblStyle w:val="TableGrid"/>
         <w:tblW w:type="auto" w:w="0"/>
         <w:jc w:val="center"/>
+        <w:tblLayout w:type="fixed"/>
         <w:tblLook w:firstColumn="1" w:firstRow="1" w:lastColumn="0" w:lastRow="0" w:noHBand="0" w:noVBand="1" w:val="04A0"/>
       </w:tblPr>
       <w:tblGrid>
-        <w:gridCol w:w="1377"/>
-        <w:gridCol w:w="1377"/>
-        <w:gridCol w:w="1377"/>
-        <w:gridCol w:w="1377"/>
-        <w:gridCol w:w="1377"/>
-        <w:gridCol w:w="1377"/>
-        <w:gridCol w:w="1377"/>
+        <w:gridCol w:w="2409"/>
+        <w:gridCol w:w="2409"/>
+        <w:gridCol w:w="2409"/>
+        <w:gridCol w:w="2409"/>
       </w:tblGrid>
       <w:tr>
         <w:tc>
           <w:tcPr>
-            <w:tcW w:type="dxa" w:w="2948"/>
+            <w:tcW w:type="dxa" w:w="2268"/>
             <w:vAlign w:val="center"/>
           </w:tcPr>
           <w:p>
@@ -7431,13 +8386,13 @@
                 <w:b/>
                 <w:sz w:val="20"/>
               </w:rPr>
-              <w:t>Модель</w:t>
+              <w:t>Метрика</w:t>
             </w:r>
           </w:p>
         </w:tc>
         <w:tc>
           <w:tcPr>
-            <w:tcW w:type="dxa" w:w="1020"/>
+            <w:tcW w:type="dxa" w:w="2268"/>
             <w:vAlign w:val="center"/>
           </w:tcPr>
           <w:p>
@@ -7451,13 +8406,13 @@
                 <w:b/>
                 <w:sz w:val="20"/>
               </w:rPr>
-              <w:t>Precision</w:t>
+              <w:t>baseline</w:t>
             </w:r>
           </w:p>
         </w:tc>
         <w:tc>
           <w:tcPr>
-            <w:tcW w:type="dxa" w:w="1020"/>
+            <w:tcW w:type="dxa" w:w="2268"/>
             <w:vAlign w:val="center"/>
           </w:tcPr>
           <w:p>
@@ -7471,13 +8426,13 @@
                 <w:b/>
                 <w:sz w:val="20"/>
               </w:rPr>
-              <w:t>Recall</w:t>
+              <w:t>proposed</w:t>
             </w:r>
           </w:p>
         </w:tc>
         <w:tc>
           <w:tcPr>
-            <w:tcW w:type="dxa" w:w="907"/>
+            <w:tcW w:type="dxa" w:w="2268"/>
             <w:vAlign w:val="center"/>
           </w:tcPr>
           <w:p>
@@ -7491,13 +8446,15 @@
                 <w:b/>
                 <w:sz w:val="20"/>
               </w:rPr>
-              <w:t>F1</w:t>
+              <w:t>ablation</w:t>
             </w:r>
           </w:p>
         </w:tc>
+      </w:tr>
+      <w:tr>
         <w:tc>
           <w:tcPr>
-            <w:tcW w:type="dxa" w:w="907"/>
+            <w:tcW w:type="dxa" w:w="2268"/>
             <w:vAlign w:val="center"/>
           </w:tcPr>
           <w:p>
@@ -7508,78 +8465,16 @@
             <w:r>
               <w:rPr>
                 <w:rFonts w:ascii="Times New Roman" w:hAnsi="Times New Roman" w:eastAsia="Times New Roman"/>
-                <w:b/>
+                <w:b w:val="0"/>
                 <w:sz w:val="20"/>
               </w:rPr>
-              <w:t>FNR</w:t>
+              <w:t>Precision</w:t>
             </w:r>
           </w:p>
         </w:tc>
         <w:tc>
           <w:tcPr>
-            <w:tcW w:type="dxa" w:w="1134"/>
-            <w:vAlign w:val="center"/>
-          </w:tcPr>
-          <w:p>
-            <w:pPr>
-              <w:jc w:val="center"/>
-            </w:pPr>
-            <w:r/>
-            <w:r>
-              <w:rPr>
-                <w:rFonts w:ascii="Times New Roman" w:hAnsi="Times New Roman" w:eastAsia="Times New Roman"/>
-                <w:b/>
-                <w:sz w:val="20"/>
-              </w:rPr>
-              <w:t>ROC AUC</w:t>
-            </w:r>
-          </w:p>
-        </w:tc>
-        <w:tc>
-          <w:tcPr>
-            <w:tcW w:type="dxa" w:w="1134"/>
-            <w:vAlign w:val="center"/>
-          </w:tcPr>
-          <w:p>
-            <w:pPr>
-              <w:jc w:val="center"/>
-            </w:pPr>
-            <w:r/>
-            <w:r>
-              <w:rPr>
-                <w:rFonts w:ascii="Times New Roman" w:hAnsi="Times New Roman" w:eastAsia="Times New Roman"/>
-                <w:b/>
-                <w:sz w:val="20"/>
-              </w:rPr>
-              <w:t>PR AUC</w:t>
-            </w:r>
-          </w:p>
-        </w:tc>
-      </w:tr>
-      <w:tr>
-        <w:tc>
-          <w:tcPr>
-            <w:tcW w:type="dxa" w:w="2948"/>
-            <w:vAlign w:val="center"/>
-          </w:tcPr>
-          <w:p>
-            <w:pPr>
-              <w:jc w:val="left"/>
-            </w:pPr>
-            <w:r/>
-            <w:r>
-              <w:rPr>
-                <w:rFonts w:ascii="Times New Roman" w:hAnsi="Times New Roman" w:eastAsia="Times New Roman"/>
-                <w:b w:val="0"/>
-                <w:sz w:val="20"/>
-              </w:rPr>
-              <w:t>baseline_kitti_logreg</w:t>
-            </w:r>
-          </w:p>
-        </w:tc>
-        <w:tc>
-          <w:tcPr>
-            <w:tcW w:type="dxa" w:w="1020"/>
+            <w:tcW w:type="dxa" w:w="2268"/>
             <w:vAlign w:val="center"/>
           </w:tcPr>
           <w:p>
@@ -7599,7 +8494,69 @@
         </w:tc>
         <w:tc>
           <w:tcPr>
-            <w:tcW w:type="dxa" w:w="1020"/>
+            <w:tcW w:type="dxa" w:w="2268"/>
+            <w:vAlign w:val="center"/>
+          </w:tcPr>
+          <w:p>
+            <w:pPr>
+              <w:jc w:val="center"/>
+            </w:pPr>
+            <w:r/>
+            <w:r>
+              <w:rPr>
+                <w:rFonts w:ascii="Times New Roman" w:hAnsi="Times New Roman" w:eastAsia="Times New Roman"/>
+                <w:b w:val="0"/>
+                <w:sz w:val="20"/>
+              </w:rPr>
+              <w:t>0.885</w:t>
+            </w:r>
+          </w:p>
+        </w:tc>
+        <w:tc>
+          <w:tcPr>
+            <w:tcW w:type="dxa" w:w="2268"/>
+            <w:vAlign w:val="center"/>
+          </w:tcPr>
+          <w:p>
+            <w:pPr>
+              <w:jc w:val="center"/>
+            </w:pPr>
+            <w:r/>
+            <w:r>
+              <w:rPr>
+                <w:rFonts w:ascii="Times New Roman" w:hAnsi="Times New Roman" w:eastAsia="Times New Roman"/>
+                <w:b w:val="0"/>
+                <w:sz w:val="20"/>
+              </w:rPr>
+              <w:t>0.881</w:t>
+            </w:r>
+          </w:p>
+        </w:tc>
+      </w:tr>
+      <w:tr>
+        <w:tc>
+          <w:tcPr>
+            <w:tcW w:type="dxa" w:w="2268"/>
+            <w:vAlign w:val="center"/>
+          </w:tcPr>
+          <w:p>
+            <w:pPr>
+              <w:jc w:val="center"/>
+            </w:pPr>
+            <w:r/>
+            <w:r>
+              <w:rPr>
+                <w:rFonts w:ascii="Times New Roman" w:hAnsi="Times New Roman" w:eastAsia="Times New Roman"/>
+                <w:b w:val="0"/>
+                <w:sz w:val="20"/>
+              </w:rPr>
+              <w:t>Recall</w:t>
+            </w:r>
+          </w:p>
+        </w:tc>
+        <w:tc>
+          <w:tcPr>
+            <w:tcW w:type="dxa" w:w="2268"/>
             <w:vAlign w:val="center"/>
           </w:tcPr>
           <w:p>
@@ -7619,7 +8576,69 @@
         </w:tc>
         <w:tc>
           <w:tcPr>
-            <w:tcW w:type="dxa" w:w="907"/>
+            <w:tcW w:type="dxa" w:w="2268"/>
+            <w:vAlign w:val="center"/>
+          </w:tcPr>
+          <w:p>
+            <w:pPr>
+              <w:jc w:val="center"/>
+            </w:pPr>
+            <w:r/>
+            <w:r>
+              <w:rPr>
+                <w:rFonts w:ascii="Times New Roman" w:hAnsi="Times New Roman" w:eastAsia="Times New Roman"/>
+                <w:b w:val="0"/>
+                <w:sz w:val="20"/>
+              </w:rPr>
+              <w:t>0.937</w:t>
+            </w:r>
+          </w:p>
+        </w:tc>
+        <w:tc>
+          <w:tcPr>
+            <w:tcW w:type="dxa" w:w="2268"/>
+            <w:vAlign w:val="center"/>
+          </w:tcPr>
+          <w:p>
+            <w:pPr>
+              <w:jc w:val="center"/>
+            </w:pPr>
+            <w:r/>
+            <w:r>
+              <w:rPr>
+                <w:rFonts w:ascii="Times New Roman" w:hAnsi="Times New Roman" w:eastAsia="Times New Roman"/>
+                <w:b w:val="0"/>
+                <w:sz w:val="20"/>
+              </w:rPr>
+              <w:t>0.869</w:t>
+            </w:r>
+          </w:p>
+        </w:tc>
+      </w:tr>
+      <w:tr>
+        <w:tc>
+          <w:tcPr>
+            <w:tcW w:type="dxa" w:w="2268"/>
+            <w:vAlign w:val="center"/>
+          </w:tcPr>
+          <w:p>
+            <w:pPr>
+              <w:jc w:val="center"/>
+            </w:pPr>
+            <w:r/>
+            <w:r>
+              <w:rPr>
+                <w:rFonts w:ascii="Times New Roman" w:hAnsi="Times New Roman" w:eastAsia="Times New Roman"/>
+                <w:b w:val="0"/>
+                <w:sz w:val="20"/>
+              </w:rPr>
+              <w:t>F1</w:t>
+            </w:r>
+          </w:p>
+        </w:tc>
+        <w:tc>
+          <w:tcPr>
+            <w:tcW w:type="dxa" w:w="2268"/>
             <w:vAlign w:val="center"/>
           </w:tcPr>
           <w:p>
@@ -7639,7 +8658,69 @@
         </w:tc>
         <w:tc>
           <w:tcPr>
-            <w:tcW w:type="dxa" w:w="907"/>
+            <w:tcW w:type="dxa" w:w="2268"/>
+            <w:vAlign w:val="center"/>
+          </w:tcPr>
+          <w:p>
+            <w:pPr>
+              <w:jc w:val="center"/>
+            </w:pPr>
+            <w:r/>
+            <w:r>
+              <w:rPr>
+                <w:rFonts w:ascii="Times New Roman" w:hAnsi="Times New Roman" w:eastAsia="Times New Roman"/>
+                <w:b w:val="0"/>
+                <w:sz w:val="20"/>
+              </w:rPr>
+              <w:t>0.911</w:t>
+            </w:r>
+          </w:p>
+        </w:tc>
+        <w:tc>
+          <w:tcPr>
+            <w:tcW w:type="dxa" w:w="2268"/>
+            <w:vAlign w:val="center"/>
+          </w:tcPr>
+          <w:p>
+            <w:pPr>
+              <w:jc w:val="center"/>
+            </w:pPr>
+            <w:r/>
+            <w:r>
+              <w:rPr>
+                <w:rFonts w:ascii="Times New Roman" w:hAnsi="Times New Roman" w:eastAsia="Times New Roman"/>
+                <w:b w:val="0"/>
+                <w:sz w:val="20"/>
+              </w:rPr>
+              <w:t>0.875</w:t>
+            </w:r>
+          </w:p>
+        </w:tc>
+      </w:tr>
+      <w:tr>
+        <w:tc>
+          <w:tcPr>
+            <w:tcW w:type="dxa" w:w="2268"/>
+            <w:vAlign w:val="center"/>
+          </w:tcPr>
+          <w:p>
+            <w:pPr>
+              <w:jc w:val="center"/>
+            </w:pPr>
+            <w:r/>
+            <w:r>
+              <w:rPr>
+                <w:rFonts w:ascii="Times New Roman" w:hAnsi="Times New Roman" w:eastAsia="Times New Roman"/>
+                <w:b w:val="0"/>
+                <w:sz w:val="20"/>
+              </w:rPr>
+              <w:t>FNR</w:t>
+            </w:r>
+          </w:p>
+        </w:tc>
+        <w:tc>
+          <w:tcPr>
+            <w:tcW w:type="dxa" w:w="2268"/>
             <w:vAlign w:val="center"/>
           </w:tcPr>
           <w:p>
@@ -7659,7 +8740,69 @@
         </w:tc>
         <w:tc>
           <w:tcPr>
-            <w:tcW w:type="dxa" w:w="1134"/>
+            <w:tcW w:type="dxa" w:w="2268"/>
+            <w:vAlign w:val="center"/>
+          </w:tcPr>
+          <w:p>
+            <w:pPr>
+              <w:jc w:val="center"/>
+            </w:pPr>
+            <w:r/>
+            <w:r>
+              <w:rPr>
+                <w:rFonts w:ascii="Times New Roman" w:hAnsi="Times New Roman" w:eastAsia="Times New Roman"/>
+                <w:b w:val="0"/>
+                <w:sz w:val="20"/>
+              </w:rPr>
+              <w:t>0.063</w:t>
+            </w:r>
+          </w:p>
+        </w:tc>
+        <w:tc>
+          <w:tcPr>
+            <w:tcW w:type="dxa" w:w="2268"/>
+            <w:vAlign w:val="center"/>
+          </w:tcPr>
+          <w:p>
+            <w:pPr>
+              <w:jc w:val="center"/>
+            </w:pPr>
+            <w:r/>
+            <w:r>
+              <w:rPr>
+                <w:rFonts w:ascii="Times New Roman" w:hAnsi="Times New Roman" w:eastAsia="Times New Roman"/>
+                <w:b w:val="0"/>
+                <w:sz w:val="20"/>
+              </w:rPr>
+              <w:t>0.131</w:t>
+            </w:r>
+          </w:p>
+        </w:tc>
+      </w:tr>
+      <w:tr>
+        <w:tc>
+          <w:tcPr>
+            <w:tcW w:type="dxa" w:w="2268"/>
+            <w:vAlign w:val="center"/>
+          </w:tcPr>
+          <w:p>
+            <w:pPr>
+              <w:jc w:val="center"/>
+            </w:pPr>
+            <w:r/>
+            <w:r>
+              <w:rPr>
+                <w:rFonts w:ascii="Times New Roman" w:hAnsi="Times New Roman" w:eastAsia="Times New Roman"/>
+                <w:b w:val="0"/>
+                <w:sz w:val="20"/>
+              </w:rPr>
+              <w:t>ROC AUC</w:t>
+            </w:r>
+          </w:p>
+        </w:tc>
+        <w:tc>
+          <w:tcPr>
+            <w:tcW w:type="dxa" w:w="2268"/>
             <w:vAlign w:val="center"/>
           </w:tcPr>
           <w:p>
@@ -7679,129 +8822,7 @@
         </w:tc>
         <w:tc>
           <w:tcPr>
-            <w:tcW w:type="dxa" w:w="1134"/>
-            <w:vAlign w:val="center"/>
-          </w:tcPr>
-          <w:p>
-            <w:pPr>
-              <w:jc w:val="center"/>
-            </w:pPr>
-            <w:r/>
-            <w:r>
-              <w:rPr>
-                <w:rFonts w:ascii="Times New Roman" w:hAnsi="Times New Roman" w:eastAsia="Times New Roman"/>
-                <w:b w:val="0"/>
-                <w:sz w:val="20"/>
-              </w:rPr>
-              <w:t>0.961</w:t>
-            </w:r>
-          </w:p>
-        </w:tc>
-      </w:tr>
-      <w:tr>
-        <w:tc>
-          <w:tcPr>
-            <w:tcW w:type="dxa" w:w="2948"/>
-            <w:vAlign w:val="center"/>
-          </w:tcPr>
-          <w:p>
-            <w:pPr>
-              <w:jc w:val="left"/>
-            </w:pPr>
-            <w:r/>
-            <w:r>
-              <w:rPr>
-                <w:rFonts w:ascii="Times New Roman" w:hAnsi="Times New Roman" w:eastAsia="Times New Roman"/>
-                <w:b w:val="0"/>
-                <w:sz w:val="20"/>
-              </w:rPr>
-              <w:t>proposed_reliability_logreg</w:t>
-            </w:r>
-          </w:p>
-        </w:tc>
-        <w:tc>
-          <w:tcPr>
-            <w:tcW w:type="dxa" w:w="1020"/>
-            <w:vAlign w:val="center"/>
-          </w:tcPr>
-          <w:p>
-            <w:pPr>
-              <w:jc w:val="center"/>
-            </w:pPr>
-            <w:r/>
-            <w:r>
-              <w:rPr>
-                <w:rFonts w:ascii="Times New Roman" w:hAnsi="Times New Roman" w:eastAsia="Times New Roman"/>
-                <w:b w:val="0"/>
-                <w:sz w:val="20"/>
-              </w:rPr>
-              <w:t>0.885</w:t>
-            </w:r>
-          </w:p>
-        </w:tc>
-        <w:tc>
-          <w:tcPr>
-            <w:tcW w:type="dxa" w:w="1020"/>
-            <w:vAlign w:val="center"/>
-          </w:tcPr>
-          <w:p>
-            <w:pPr>
-              <w:jc w:val="center"/>
-            </w:pPr>
-            <w:r/>
-            <w:r>
-              <w:rPr>
-                <w:rFonts w:ascii="Times New Roman" w:hAnsi="Times New Roman" w:eastAsia="Times New Roman"/>
-                <w:b w:val="0"/>
-                <w:sz w:val="20"/>
-              </w:rPr>
-              <w:t>0.937</w:t>
-            </w:r>
-          </w:p>
-        </w:tc>
-        <w:tc>
-          <w:tcPr>
-            <w:tcW w:type="dxa" w:w="907"/>
-            <w:vAlign w:val="center"/>
-          </w:tcPr>
-          <w:p>
-            <w:pPr>
-              <w:jc w:val="center"/>
-            </w:pPr>
-            <w:r/>
-            <w:r>
-              <w:rPr>
-                <w:rFonts w:ascii="Times New Roman" w:hAnsi="Times New Roman" w:eastAsia="Times New Roman"/>
-                <w:b w:val="0"/>
-                <w:sz w:val="20"/>
-              </w:rPr>
-              <w:t>0.911</w:t>
-            </w:r>
-          </w:p>
-        </w:tc>
-        <w:tc>
-          <w:tcPr>
-            <w:tcW w:type="dxa" w:w="907"/>
-            <w:vAlign w:val="center"/>
-          </w:tcPr>
-          <w:p>
-            <w:pPr>
-              <w:jc w:val="center"/>
-            </w:pPr>
-            <w:r/>
-            <w:r>
-              <w:rPr>
-                <w:rFonts w:ascii="Times New Roman" w:hAnsi="Times New Roman" w:eastAsia="Times New Roman"/>
-                <w:b w:val="0"/>
-                <w:sz w:val="20"/>
-              </w:rPr>
-              <w:t>0.063</w:t>
-            </w:r>
-          </w:p>
-        </w:tc>
-        <w:tc>
-          <w:tcPr>
-            <w:tcW w:type="dxa" w:w="1134"/>
+            <w:tcW w:type="dxa" w:w="2268"/>
             <w:vAlign w:val="center"/>
           </w:tcPr>
           <w:p>
@@ -7821,7 +8842,69 @@
         </w:tc>
         <w:tc>
           <w:tcPr>
-            <w:tcW w:type="dxa" w:w="1134"/>
+            <w:tcW w:type="dxa" w:w="2268"/>
+            <w:vAlign w:val="center"/>
+          </w:tcPr>
+          <w:p>
+            <w:pPr>
+              <w:jc w:val="center"/>
+            </w:pPr>
+            <w:r/>
+            <w:r>
+              <w:rPr>
+                <w:rFonts w:ascii="Times New Roman" w:hAnsi="Times New Roman" w:eastAsia="Times New Roman"/>
+                <w:b w:val="0"/>
+                <w:sz w:val="20"/>
+              </w:rPr>
+              <w:t>0.966</w:t>
+            </w:r>
+          </w:p>
+        </w:tc>
+      </w:tr>
+      <w:tr>
+        <w:tc>
+          <w:tcPr>
+            <w:tcW w:type="dxa" w:w="2268"/>
+            <w:vAlign w:val="center"/>
+          </w:tcPr>
+          <w:p>
+            <w:pPr>
+              <w:jc w:val="center"/>
+            </w:pPr>
+            <w:r/>
+            <w:r>
+              <w:rPr>
+                <w:rFonts w:ascii="Times New Roman" w:hAnsi="Times New Roman" w:eastAsia="Times New Roman"/>
+                <w:b w:val="0"/>
+                <w:sz w:val="20"/>
+              </w:rPr>
+              <w:t>PR AUC</w:t>
+            </w:r>
+          </w:p>
+        </w:tc>
+        <w:tc>
+          <w:tcPr>
+            <w:tcW w:type="dxa" w:w="2268"/>
+            <w:vAlign w:val="center"/>
+          </w:tcPr>
+          <w:p>
+            <w:pPr>
+              <w:jc w:val="center"/>
+            </w:pPr>
+            <w:r/>
+            <w:r>
+              <w:rPr>
+                <w:rFonts w:ascii="Times New Roman" w:hAnsi="Times New Roman" w:eastAsia="Times New Roman"/>
+                <w:b w:val="0"/>
+                <w:sz w:val="20"/>
+              </w:rPr>
+              <w:t>0.961</w:t>
+            </w:r>
+          </w:p>
+        </w:tc>
+        <w:tc>
+          <w:tcPr>
+            <w:tcW w:type="dxa" w:w="2268"/>
             <w:vAlign w:val="center"/>
           </w:tcPr>
           <w:p>
@@ -7839,131 +8922,9 @@
             </w:r>
           </w:p>
         </w:tc>
-      </w:tr>
-      <w:tr>
         <w:tc>
           <w:tcPr>
-            <w:tcW w:type="dxa" w:w="2948"/>
-            <w:vAlign w:val="center"/>
-          </w:tcPr>
-          <w:p>
-            <w:pPr>
-              <w:jc w:val="left"/>
-            </w:pPr>
-            <w:r/>
-            <w:r>
-              <w:rPr>
-                <w:rFonts w:ascii="Times New Roman" w:hAnsi="Times New Roman" w:eastAsia="Times New Roman"/>
-                <w:b w:val="0"/>
-                <w:sz w:val="20"/>
-              </w:rPr>
-              <w:t>ablation_without_3d_geometry</w:t>
-            </w:r>
-          </w:p>
-        </w:tc>
-        <w:tc>
-          <w:tcPr>
-            <w:tcW w:type="dxa" w:w="1020"/>
-            <w:vAlign w:val="center"/>
-          </w:tcPr>
-          <w:p>
-            <w:pPr>
-              <w:jc w:val="center"/>
-            </w:pPr>
-            <w:r/>
-            <w:r>
-              <w:rPr>
-                <w:rFonts w:ascii="Times New Roman" w:hAnsi="Times New Roman" w:eastAsia="Times New Roman"/>
-                <w:b w:val="0"/>
-                <w:sz w:val="20"/>
-              </w:rPr>
-              <w:t>0.881</w:t>
-            </w:r>
-          </w:p>
-        </w:tc>
-        <w:tc>
-          <w:tcPr>
-            <w:tcW w:type="dxa" w:w="1020"/>
-            <w:vAlign w:val="center"/>
-          </w:tcPr>
-          <w:p>
-            <w:pPr>
-              <w:jc w:val="center"/>
-            </w:pPr>
-            <w:r/>
-            <w:r>
-              <w:rPr>
-                <w:rFonts w:ascii="Times New Roman" w:hAnsi="Times New Roman" w:eastAsia="Times New Roman"/>
-                <w:b w:val="0"/>
-                <w:sz w:val="20"/>
-              </w:rPr>
-              <w:t>0.869</w:t>
-            </w:r>
-          </w:p>
-        </w:tc>
-        <w:tc>
-          <w:tcPr>
-            <w:tcW w:type="dxa" w:w="907"/>
-            <w:vAlign w:val="center"/>
-          </w:tcPr>
-          <w:p>
-            <w:pPr>
-              <w:jc w:val="center"/>
-            </w:pPr>
-            <w:r/>
-            <w:r>
-              <w:rPr>
-                <w:rFonts w:ascii="Times New Roman" w:hAnsi="Times New Roman" w:eastAsia="Times New Roman"/>
-                <w:b w:val="0"/>
-                <w:sz w:val="20"/>
-              </w:rPr>
-              <w:t>0.875</w:t>
-            </w:r>
-          </w:p>
-        </w:tc>
-        <w:tc>
-          <w:tcPr>
-            <w:tcW w:type="dxa" w:w="907"/>
-            <w:vAlign w:val="center"/>
-          </w:tcPr>
-          <w:p>
-            <w:pPr>
-              <w:jc w:val="center"/>
-            </w:pPr>
-            <w:r/>
-            <w:r>
-              <w:rPr>
-                <w:rFonts w:ascii="Times New Roman" w:hAnsi="Times New Roman" w:eastAsia="Times New Roman"/>
-                <w:b w:val="0"/>
-                <w:sz w:val="20"/>
-              </w:rPr>
-              <w:t>0.131</w:t>
-            </w:r>
-          </w:p>
-        </w:tc>
-        <w:tc>
-          <w:tcPr>
-            <w:tcW w:type="dxa" w:w="1134"/>
-            <w:vAlign w:val="center"/>
-          </w:tcPr>
-          <w:p>
-            <w:pPr>
-              <w:jc w:val="center"/>
-            </w:pPr>
-            <w:r/>
-            <w:r>
-              <w:rPr>
-                <w:rFonts w:ascii="Times New Roman" w:hAnsi="Times New Roman" w:eastAsia="Times New Roman"/>
-                <w:b w:val="0"/>
-                <w:sz w:val="20"/>
-              </w:rPr>
-              <w:t>0.966</w:t>
-            </w:r>
-          </w:p>
-        </w:tc>
-        <w:tc>
-          <w:tcPr>
-            <w:tcW w:type="dxa" w:w="1134"/>
+            <w:tcW w:type="dxa" w:w="2268"/>
             <w:vAlign w:val="center"/>
           </w:tcPr>
           <w:p>
@@ -7984,6 +8945,11 @@
       </w:tr>
     </w:tbl>
     <w:p>
+      <w:r>
+        <w:br w:type="page"/>
+      </w:r>
+    </w:p>
+    <w:p>
       <w:pPr>
         <w:spacing w:line="360" w:lineRule="auto" w:after="0"/>
         <w:ind w:firstLine="0"/>
@@ -8003,6 +8969,7 @@
         <w:tblStyle w:val="TableGrid"/>
         <w:tblW w:type="auto" w:w="0"/>
         <w:jc w:val="center"/>
+        <w:tblLayout w:type="fixed"/>
         <w:tblLook w:firstColumn="1" w:firstRow="1" w:lastColumn="0" w:lastRow="0" w:noHBand="0" w:noVBand="1" w:val="04A0"/>
       </w:tblPr>
       <w:tblGrid>
@@ -8203,7 +9170,7 @@
       <w:r>
         <w:drawing>
           <wp:inline xmlns:a="http://schemas.openxmlformats.org/drawingml/2006/main" xmlns:pic="http://schemas.openxmlformats.org/drawingml/2006/picture">
-            <wp:extent cx="5486400" cy="2824834"/>
+            <wp:extent cx="5486400" cy="2635707"/>
             <wp:docPr id="4" name="Picture 4"/>
             <wp:cNvGraphicFramePr>
               <a:graphicFrameLocks noChangeAspect="1"/>
@@ -8224,7 +9191,7 @@
                   <pic:spPr>
                     <a:xfrm>
                       <a:off x="0" y="0"/>
-                      <a:ext cx="5486400" cy="2824834"/>
+                      <a:ext cx="5486400" cy="2635707"/>
                     </a:xfrm>
                     <a:prstGeom prst="rect"/>
                   </pic:spPr>
@@ -8247,7 +9214,7 @@
           <w:b w:val="0"/>
           <w:sz w:val="24"/>
         </w:rPr>
-        <w:t>Рисунок 4 – Component Diagram прототипа</w:t>
+        <w:t>Рисунок 4 – Компонентная схема прототипа</w:t>
       </w:r>
     </w:p>
     <w:p>
@@ -8257,7 +9224,7 @@
       <w:r>
         <w:drawing>
           <wp:inline xmlns:a="http://schemas.openxmlformats.org/drawingml/2006/main" xmlns:pic="http://schemas.openxmlformats.org/drawingml/2006/picture">
-            <wp:extent cx="5486400" cy="2824834"/>
+            <wp:extent cx="5486400" cy="2635707"/>
             <wp:docPr id="5" name="Picture 5"/>
             <wp:cNvGraphicFramePr>
               <a:graphicFrameLocks noChangeAspect="1"/>
@@ -8278,7 +9245,7 @@
                   <pic:spPr>
                     <a:xfrm>
                       <a:off x="0" y="0"/>
-                      <a:ext cx="5486400" cy="2824834"/>
+                      <a:ext cx="5486400" cy="2635707"/>
                     </a:xfrm>
                     <a:prstGeom prst="rect"/>
                   </pic:spPr>
@@ -8301,7 +9268,7 @@
           <w:b w:val="0"/>
           <w:sz w:val="24"/>
         </w:rPr>
-        <w:t>Рисунок 5 – Deployment Diagram прототипа и опционального GPU-направления</w:t>
+        <w:t>Рисунок 5 – Схема развертывания прототипа и опционального GPU-направления</w:t>
       </w:r>
     </w:p>
     <w:p>
@@ -9411,6 +10378,7 @@
         <w:tblStyle w:val="TableGrid"/>
         <w:tblW w:type="auto" w:w="0"/>
         <w:jc w:val="center"/>
+        <w:tblLayout w:type="fixed"/>
         <w:tblLook w:firstColumn="1" w:firstRow="1" w:lastColumn="0" w:lastRow="0" w:noHBand="0" w:noVBand="1" w:val="04A0"/>
       </w:tblPr>
       <w:tblGrid>

</xml_diff>